<commit_message>
Add author and rendered figure to polished draft
</commit_message>
<xml_diff>
--- a/WRITEUP_polished.docx
+++ b/WRITEUP_polished.docx
@@ -4,7 +4,7 @@
   <w:body>
     <w:p>
       <w:pPr>
-        <w:spacing w:before="1600" w:after="360"/>
+        <w:spacing w:before="1440" w:after="280"/>
         <w:jc w:val="center"/>
       </w:pPr>
       <w:r>
@@ -32,7 +32,32 @@
     </w:p>
     <w:p>
       <w:pPr>
-        <w:spacing w:before="240"/>
+        <w:spacing w:before="560"/>
+        <w:jc w:val="center"/>
+      </w:pPr>
+      <w:r>
+        <w:rPr>
+          <w:rFonts w:ascii="Times New Roman" w:hAnsi="Times New Roman"/>
+          <w:b/>
+          <w:sz w:val="23"/>
+        </w:rPr>
+        <w:t>Daymian</w:t>
+      </w:r>
+    </w:p>
+    <w:p>
+      <w:pPr>
+        <w:jc w:val="center"/>
+      </w:pPr>
+      <w:r>
+        <w:rPr>
+          <w:rFonts w:ascii="Times New Roman" w:hAnsi="Times New Roman"/>
+          <w:sz w:val="22"/>
+        </w:rPr>
+        <w:t>Kestrel Labs</w:t>
+      </w:r>
+    </w:p>
+    <w:p>
+      <w:pPr>
         <w:jc w:val="center"/>
       </w:pPr>
       <w:r>
@@ -41,8 +66,6 @@
           <w:color w:val="606060"/>
           <w:sz w:val="21"/>
         </w:rPr>
-        <w:t>Kestrel Labs</w:t>
-        <w:br/>
         <w:t>March 2026</w:t>
       </w:r>
     </w:p>
@@ -64,12 +87,9 @@
         <w:tc>
           <w:tcPr>
             <w:tcW w:type="dxa" w:w="9360"/>
-            <w:shd w:fill="F3F6FB"/>
+            <w:shd w:fill="F5F7FB"/>
           </w:tcPr>
           <w:p>
-            <w:pPr>
-              <w:jc w:val="left"/>
-            </w:pPr>
             <w:r>
               <w:rPr>
                 <w:rFonts w:ascii="Times New Roman" w:hAnsi="Times New Roman"/>
@@ -94,6 +114,7 @@
           <w:p>
             <w:pPr>
               <w:pStyle w:val="ListBullet"/>
+              <w:jc w:val="both"/>
             </w:pPr>
             <w:r>
               <w:rPr>
@@ -106,6 +127,7 @@
           <w:p>
             <w:pPr>
               <w:pStyle w:val="ListBullet"/>
+              <w:jc w:val="both"/>
             </w:pPr>
             <w:r>
               <w:rPr>
@@ -118,6 +140,7 @@
           <w:p>
             <w:pPr>
               <w:pStyle w:val="ListBullet"/>
+              <w:jc w:val="both"/>
             </w:pPr>
             <w:r>
               <w:rPr>
@@ -130,6 +153,7 @@
           <w:p>
             <w:pPr>
               <w:pStyle w:val="ListBullet"/>
+              <w:jc w:val="both"/>
             </w:pPr>
             <w:r>
               <w:rPr>
@@ -1809,419 +1833,57 @@
     </w:p>
     <w:p>
       <w:pPr>
-        <w:spacing w:after="60"/>
+        <w:jc w:val="center"/>
+      </w:pPr>
+      <w:r>
+        <w:drawing>
+          <wp:inline xmlns:a="http://schemas.openxmlformats.org/drawingml/2006/main" xmlns:pic="http://schemas.openxmlformats.org/drawingml/2006/picture">
+            <wp:extent cx="5852160" cy="2418893"/>
+            <wp:docPr id="1" name="Picture 1"/>
+            <wp:cNvGraphicFramePr>
+              <a:graphicFrameLocks noChangeAspect="1"/>
+            </wp:cNvGraphicFramePr>
+            <a:graphic>
+              <a:graphicData uri="http://schemas.openxmlformats.org/drawingml/2006/picture">
+                <pic:pic>
+                  <pic:nvPicPr>
+                    <pic:cNvPr id="0" name="architecture_diagram.png"/>
+                    <pic:cNvPicPr/>
+                  </pic:nvPicPr>
+                  <pic:blipFill>
+                    <a:blip r:embed="rId11"/>
+                    <a:stretch>
+                      <a:fillRect/>
+                    </a:stretch>
+                  </pic:blipFill>
+                  <pic:spPr>
+                    <a:xfrm>
+                      <a:off x="0" y="0"/>
+                      <a:ext cx="5852160" cy="2418893"/>
+                    </a:xfrm>
+                    <a:prstGeom prst="rect"/>
+                  </pic:spPr>
+                </pic:pic>
+              </a:graphicData>
+            </a:graphic>
+          </wp:inline>
+        </w:drawing>
+      </w:r>
+    </w:p>
+    <w:p>
+      <w:pPr>
+        <w:spacing w:after="200"/>
+        <w:jc w:val="center"/>
       </w:pPr>
       <w:r>
         <w:rPr>
-          <w:rFonts w:ascii="Aptos" w:hAnsi="Aptos"/>
-          <w:b/>
-          <w:color w:val="606060"/>
+          <w:rFonts w:ascii="Times New Roman" w:hAnsi="Times New Roman"/>
+          <w:i/>
           <w:sz w:val="20"/>
         </w:rPr>
-        <w:t>Architecture diagram (Mermaid source retained in Word draft)</w:t>
-      </w:r>
-    </w:p>
-    <w:p>
-      <w:pPr>
-        <w:spacing w:after="0"/>
-        <w:ind w:left="288" w:right="288"/>
-        <w:pBdr>
-          <w:top w:val="single" w:sz="6" w:space="4" w:color="CFCFCF"/>
-          <w:left w:val="single" w:sz="6" w:space="4" w:color="CFCFCF"/>
-          <w:bottom w:val="single" w:sz="6" w:space="4" w:color="CFCFCF"/>
-          <w:right w:val="single" w:sz="6" w:space="4" w:color="CFCFCF"/>
-        </w:pBdr>
-      </w:pPr>
-      <w:r>
-        <w:rPr>
-          <w:rFonts w:ascii="Consolas" w:hAnsi="Consolas"/>
-          <w:color w:val="2C2C2C"/>
-          <w:sz w:val="18"/>
-        </w:rPr>
-        <w:t>flowchart TD</w:t>
-      </w:r>
-    </w:p>
-    <w:p>
-      <w:pPr>
-        <w:spacing w:after="0"/>
-        <w:ind w:left="288" w:right="288"/>
-        <w:pBdr>
-          <w:top w:val="single" w:sz="6" w:space="4" w:color="CFCFCF"/>
-          <w:left w:val="single" w:sz="6" w:space="4" w:color="CFCFCF"/>
-          <w:bottom w:val="single" w:sz="6" w:space="4" w:color="CFCFCF"/>
-          <w:right w:val="single" w:sz="6" w:space="4" w:color="CFCFCF"/>
-        </w:pBdr>
-      </w:pPr>
-      <w:r>
-        <w:rPr>
-          <w:rFonts w:ascii="Consolas" w:hAnsi="Consolas"/>
-          <w:color w:val="2C2C2C"/>
-          <w:sz w:val="18"/>
-        </w:rPr>
-        <w:t xml:space="preserve">    A[Suite YAML\nexamples/structured_extraction.yaml] --&gt; B[suite_loader.py]</w:t>
-      </w:r>
-    </w:p>
-    <w:p>
-      <w:pPr>
-        <w:spacing w:after="0"/>
-        <w:ind w:left="288" w:right="288"/>
-        <w:pBdr>
-          <w:top w:val="single" w:sz="6" w:space="4" w:color="CFCFCF"/>
-          <w:left w:val="single" w:sz="6" w:space="4" w:color="CFCFCF"/>
-          <w:bottom w:val="single" w:sz="6" w:space="4" w:color="CFCFCF"/>
-          <w:right w:val="single" w:sz="6" w:space="4" w:color="CFCFCF"/>
-        </w:pBdr>
-      </w:pPr>
-      <w:r>
-        <w:rPr>
-          <w:rFonts w:ascii="Consolas" w:hAnsi="Consolas"/>
-          <w:color w:val="2C2C2C"/>
-          <w:sz w:val="18"/>
-        </w:rPr>
-        <w:t xml:space="preserve">    B --&gt; C[Validated EvalSuite models]</w:t>
-      </w:r>
-    </w:p>
-    <w:p>
-      <w:pPr>
-        <w:spacing w:after="0"/>
-        <w:ind w:left="288" w:right="288"/>
-        <w:pBdr>
-          <w:top w:val="single" w:sz="6" w:space="4" w:color="CFCFCF"/>
-          <w:left w:val="single" w:sz="6" w:space="4" w:color="CFCFCF"/>
-          <w:bottom w:val="single" w:sz="6" w:space="4" w:color="CFCFCF"/>
-          <w:right w:val="single" w:sz="6" w:space="4" w:color="CFCFCF"/>
-        </w:pBdr>
-      </w:pPr>
-      <w:r>
-        <w:rPr>
-          <w:rFonts w:ascii="Consolas" w:hAnsi="Consolas"/>
-          <w:color w:val="2C2C2C"/>
-          <w:sz w:val="18"/>
-        </w:rPr>
-        <w:t xml:space="preserve">    C --&gt; D[runner.py]</w:t>
-      </w:r>
-    </w:p>
-    <w:p>
-      <w:pPr>
-        <w:spacing w:after="0"/>
-        <w:ind w:left="288" w:right="288"/>
-        <w:pBdr>
-          <w:top w:val="single" w:sz="6" w:space="4" w:color="CFCFCF"/>
-          <w:left w:val="single" w:sz="6" w:space="4" w:color="CFCFCF"/>
-          <w:bottom w:val="single" w:sz="6" w:space="4" w:color="CFCFCF"/>
-          <w:right w:val="single" w:sz="6" w:space="4" w:color="CFCFCF"/>
-        </w:pBdr>
-      </w:pPr>
-      <w:r>
-        <w:rPr>
-          <w:rFonts w:ascii="Consolas" w:hAnsi="Consolas"/>
-          <w:color w:val="2C2C2C"/>
-          <w:sz w:val="18"/>
-        </w:rPr>
-        <w:t xml:space="preserve">    D --&gt; E[Provider abstraction\nLLMProvider]</w:t>
-      </w:r>
-    </w:p>
-    <w:p>
-      <w:pPr>
-        <w:spacing w:after="0"/>
-        <w:ind w:left="288" w:right="288"/>
-        <w:pBdr>
-          <w:top w:val="single" w:sz="6" w:space="4" w:color="CFCFCF"/>
-          <w:left w:val="single" w:sz="6" w:space="4" w:color="CFCFCF"/>
-          <w:bottom w:val="single" w:sz="6" w:space="4" w:color="CFCFCF"/>
-          <w:right w:val="single" w:sz="6" w:space="4" w:color="CFCFCF"/>
-        </w:pBdr>
-      </w:pPr>
-      <w:r>
-        <w:rPr>
-          <w:rFonts w:ascii="Consolas" w:hAnsi="Consolas"/>
-          <w:color w:val="2C2C2C"/>
-          <w:sz w:val="18"/>
-        </w:rPr>
-        <w:t xml:space="preserve">    E --&gt; F[OpenAIProvider]</w:t>
-      </w:r>
-    </w:p>
-    <w:p>
-      <w:pPr>
-        <w:spacing w:after="0"/>
-        <w:ind w:left="288" w:right="288"/>
-        <w:pBdr>
-          <w:top w:val="single" w:sz="6" w:space="4" w:color="CFCFCF"/>
-          <w:left w:val="single" w:sz="6" w:space="4" w:color="CFCFCF"/>
-          <w:bottom w:val="single" w:sz="6" w:space="4" w:color="CFCFCF"/>
-          <w:right w:val="single" w:sz="6" w:space="4" w:color="CFCFCF"/>
-        </w:pBdr>
-      </w:pPr>
-      <w:r>
-        <w:rPr>
-          <w:rFonts w:ascii="Consolas" w:hAnsi="Consolas"/>
-          <w:color w:val="2C2C2C"/>
-          <w:sz w:val="18"/>
-        </w:rPr>
-        <w:t xml:space="preserve">    F --&gt; G[LLM output_text]</w:t>
-      </w:r>
-    </w:p>
-    <w:p>
-      <w:pPr>
-        <w:spacing w:after="0"/>
-        <w:ind w:left="288" w:right="288"/>
-        <w:pBdr>
-          <w:top w:val="single" w:sz="6" w:space="4" w:color="CFCFCF"/>
-          <w:left w:val="single" w:sz="6" w:space="4" w:color="CFCFCF"/>
-          <w:bottom w:val="single" w:sz="6" w:space="4" w:color="CFCFCF"/>
-          <w:right w:val="single" w:sz="6" w:space="4" w:color="CFCFCF"/>
-        </w:pBdr>
-      </w:pPr>
-      <w:r>
-        <w:rPr>
-          <w:rFonts w:ascii="Consolas" w:hAnsi="Consolas"/>
-          <w:color w:val="2C2C2C"/>
-          <w:sz w:val="18"/>
-        </w:rPr>
-        <w:t xml:space="preserve">    G --&gt; H[checks.py]</w:t>
-      </w:r>
-    </w:p>
-    <w:p>
-      <w:pPr>
-        <w:spacing w:after="0"/>
-        <w:ind w:left="288" w:right="288"/>
-        <w:pBdr>
-          <w:top w:val="single" w:sz="6" w:space="4" w:color="CFCFCF"/>
-          <w:left w:val="single" w:sz="6" w:space="4" w:color="CFCFCF"/>
-          <w:bottom w:val="single" w:sz="6" w:space="4" w:color="CFCFCF"/>
-          <w:right w:val="single" w:sz="6" w:space="4" w:color="CFCFCF"/>
-        </w:pBdr>
-      </w:pPr>
-      <w:r>
-        <w:rPr>
-          <w:rFonts w:ascii="Consolas" w:hAnsi="Consolas"/>
-          <w:color w:val="2C2C2C"/>
-          <w:sz w:val="18"/>
-        </w:rPr>
-        <w:t xml:space="preserve">    H --&gt; H1[json_schema]</w:t>
-      </w:r>
-    </w:p>
-    <w:p>
-      <w:pPr>
-        <w:spacing w:after="0"/>
-        <w:ind w:left="288" w:right="288"/>
-        <w:pBdr>
-          <w:top w:val="single" w:sz="6" w:space="4" w:color="CFCFCF"/>
-          <w:left w:val="single" w:sz="6" w:space="4" w:color="CFCFCF"/>
-          <w:bottom w:val="single" w:sz="6" w:space="4" w:color="CFCFCF"/>
-          <w:right w:val="single" w:sz="6" w:space="4" w:color="CFCFCF"/>
-        </w:pBdr>
-      </w:pPr>
-      <w:r>
-        <w:rPr>
-          <w:rFonts w:ascii="Consolas" w:hAnsi="Consolas"/>
-          <w:color w:val="2C2C2C"/>
-          <w:sz w:val="18"/>
-        </w:rPr>
-        <w:t xml:space="preserve">    H --&gt; H2[allowed_values]</w:t>
-      </w:r>
-    </w:p>
-    <w:p>
-      <w:pPr>
-        <w:spacing w:after="0"/>
-        <w:ind w:left="288" w:right="288"/>
-        <w:pBdr>
-          <w:top w:val="single" w:sz="6" w:space="4" w:color="CFCFCF"/>
-          <w:left w:val="single" w:sz="6" w:space="4" w:color="CFCFCF"/>
-          <w:bottom w:val="single" w:sz="6" w:space="4" w:color="CFCFCF"/>
-          <w:right w:val="single" w:sz="6" w:space="4" w:color="CFCFCF"/>
-        </w:pBdr>
-      </w:pPr>
-      <w:r>
-        <w:rPr>
-          <w:rFonts w:ascii="Consolas" w:hAnsi="Consolas"/>
-          <w:color w:val="2C2C2C"/>
-          <w:sz w:val="18"/>
-        </w:rPr>
-        <w:t xml:space="preserve">    H --&gt; H3[regex]</w:t>
-      </w:r>
-    </w:p>
-    <w:p>
-      <w:pPr>
-        <w:spacing w:after="0"/>
-        <w:ind w:left="288" w:right="288"/>
-        <w:pBdr>
-          <w:top w:val="single" w:sz="6" w:space="4" w:color="CFCFCF"/>
-          <w:left w:val="single" w:sz="6" w:space="4" w:color="CFCFCF"/>
-          <w:bottom w:val="single" w:sz="6" w:space="4" w:color="CFCFCF"/>
-          <w:right w:val="single" w:sz="6" w:space="4" w:color="CFCFCF"/>
-        </w:pBdr>
-      </w:pPr>
-      <w:r>
-        <w:rPr>
-          <w:rFonts w:ascii="Consolas" w:hAnsi="Consolas"/>
-          <w:color w:val="2C2C2C"/>
-          <w:sz w:val="18"/>
-        </w:rPr>
-        <w:t xml:space="preserve">    H1 --&gt; I[Case results]</w:t>
-      </w:r>
-    </w:p>
-    <w:p>
-      <w:pPr>
-        <w:spacing w:after="0"/>
-        <w:ind w:left="288" w:right="288"/>
-        <w:pBdr>
-          <w:top w:val="single" w:sz="6" w:space="4" w:color="CFCFCF"/>
-          <w:left w:val="single" w:sz="6" w:space="4" w:color="CFCFCF"/>
-          <w:bottom w:val="single" w:sz="6" w:space="4" w:color="CFCFCF"/>
-          <w:right w:val="single" w:sz="6" w:space="4" w:color="CFCFCF"/>
-        </w:pBdr>
-      </w:pPr>
-      <w:r>
-        <w:rPr>
-          <w:rFonts w:ascii="Consolas" w:hAnsi="Consolas"/>
-          <w:color w:val="2C2C2C"/>
-          <w:sz w:val="18"/>
-        </w:rPr>
-        <w:t xml:space="preserve">    H2 --&gt; I</w:t>
-      </w:r>
-    </w:p>
-    <w:p>
-      <w:pPr>
-        <w:spacing w:after="0"/>
-        <w:ind w:left="288" w:right="288"/>
-        <w:pBdr>
-          <w:top w:val="single" w:sz="6" w:space="4" w:color="CFCFCF"/>
-          <w:left w:val="single" w:sz="6" w:space="4" w:color="CFCFCF"/>
-          <w:bottom w:val="single" w:sz="6" w:space="4" w:color="CFCFCF"/>
-          <w:right w:val="single" w:sz="6" w:space="4" w:color="CFCFCF"/>
-        </w:pBdr>
-      </w:pPr>
-      <w:r>
-        <w:rPr>
-          <w:rFonts w:ascii="Consolas" w:hAnsi="Consolas"/>
-          <w:color w:val="2C2C2C"/>
-          <w:sz w:val="18"/>
-        </w:rPr>
-        <w:t xml:space="preserve">    H3 --&gt; I</w:t>
-      </w:r>
-    </w:p>
-    <w:p>
-      <w:pPr>
-        <w:spacing w:after="0"/>
-        <w:ind w:left="288" w:right="288"/>
-        <w:pBdr>
-          <w:top w:val="single" w:sz="6" w:space="4" w:color="CFCFCF"/>
-          <w:left w:val="single" w:sz="6" w:space="4" w:color="CFCFCF"/>
-          <w:bottom w:val="single" w:sz="6" w:space="4" w:color="CFCFCF"/>
-          <w:right w:val="single" w:sz="6" w:space="4" w:color="CFCFCF"/>
-        </w:pBdr>
-      </w:pPr>
-      <w:r>
-        <w:rPr>
-          <w:rFonts w:ascii="Consolas" w:hAnsi="Consolas"/>
-          <w:color w:val="2C2C2C"/>
-          <w:sz w:val="18"/>
-        </w:rPr>
-        <w:t xml:space="preserve">    I --&gt; J[JSON report]</w:t>
-      </w:r>
-    </w:p>
-    <w:p>
-      <w:pPr>
-        <w:spacing w:after="0"/>
-        <w:ind w:left="288" w:right="288"/>
-        <w:pBdr>
-          <w:top w:val="single" w:sz="6" w:space="4" w:color="CFCFCF"/>
-          <w:left w:val="single" w:sz="6" w:space="4" w:color="CFCFCF"/>
-          <w:bottom w:val="single" w:sz="6" w:space="4" w:color="CFCFCF"/>
-          <w:right w:val="single" w:sz="6" w:space="4" w:color="CFCFCF"/>
-        </w:pBdr>
-      </w:pPr>
-      <w:r>
-        <w:rPr>
-          <w:rFonts w:ascii="Consolas" w:hAnsi="Consolas"/>
-          <w:color w:val="2C2C2C"/>
-          <w:sz w:val="18"/>
-        </w:rPr>
-        <w:t xml:space="preserve">    J --&gt; K[reports/report.json]</w:t>
-      </w:r>
-    </w:p>
-    <w:p>
-      <w:pPr>
-        <w:spacing w:after="0"/>
-        <w:ind w:left="288" w:right="288"/>
-        <w:pBdr>
-          <w:top w:val="single" w:sz="6" w:space="4" w:color="CFCFCF"/>
-          <w:left w:val="single" w:sz="6" w:space="4" w:color="CFCFCF"/>
-          <w:bottom w:val="single" w:sz="6" w:space="4" w:color="CFCFCF"/>
-          <w:right w:val="single" w:sz="6" w:space="4" w:color="CFCFCF"/>
-        </w:pBdr>
-      </w:pPr>
-      <w:r>
-        <w:rPr>
-          <w:rFonts w:ascii="Consolas" w:hAnsi="Consolas"/>
-          <w:color w:val="2C2C2C"/>
-          <w:sz w:val="18"/>
-        </w:rPr>
-        <w:t xml:space="preserve">    J --&gt; L[CI artifact upload]</w:t>
-      </w:r>
-    </w:p>
-    <w:p>
-      <w:pPr>
-        <w:spacing w:after="0"/>
-        <w:ind w:left="288" w:right="288"/>
-        <w:pBdr>
-          <w:top w:val="single" w:sz="6" w:space="4" w:color="CFCFCF"/>
-          <w:left w:val="single" w:sz="6" w:space="4" w:color="CFCFCF"/>
-          <w:bottom w:val="single" w:sz="6" w:space="4" w:color="CFCFCF"/>
-          <w:right w:val="single" w:sz="6" w:space="4" w:color="CFCFCF"/>
-        </w:pBdr>
-      </w:pPr>
-      <w:r>
-        <w:rPr>
-          <w:rFonts w:ascii="Consolas" w:hAnsi="Consolas"/>
-          <w:color w:val="2C2C2C"/>
-          <w:sz w:val="18"/>
-        </w:rPr>
-        <w:t xml:space="preserve">    I --&gt; M{Any failed?}</w:t>
-      </w:r>
-    </w:p>
-    <w:p>
-      <w:pPr>
-        <w:spacing w:after="0"/>
-        <w:ind w:left="288" w:right="288"/>
-        <w:pBdr>
-          <w:top w:val="single" w:sz="6" w:space="4" w:color="CFCFCF"/>
-          <w:left w:val="single" w:sz="6" w:space="4" w:color="CFCFCF"/>
-          <w:bottom w:val="single" w:sz="6" w:space="4" w:color="CFCFCF"/>
-          <w:right w:val="single" w:sz="6" w:space="4" w:color="CFCFCF"/>
-        </w:pBdr>
-      </w:pPr>
-      <w:r>
-        <w:rPr>
-          <w:rFonts w:ascii="Consolas" w:hAnsi="Consolas"/>
-          <w:color w:val="2C2C2C"/>
-          <w:sz w:val="18"/>
-        </w:rPr>
-        <w:t xml:space="preserve">    M -- Yes --&gt; N[CLI exits code 1]</w:t>
-      </w:r>
-    </w:p>
-    <w:p>
-      <w:pPr>
-        <w:spacing w:after="0"/>
-        <w:ind w:left="288" w:right="288"/>
-        <w:pBdr>
-          <w:top w:val="single" w:sz="6" w:space="4" w:color="CFCFCF"/>
-          <w:left w:val="single" w:sz="6" w:space="4" w:color="CFCFCF"/>
-          <w:bottom w:val="single" w:sz="6" w:space="4" w:color="CFCFCF"/>
-          <w:right w:val="single" w:sz="6" w:space="4" w:color="CFCFCF"/>
-        </w:pBdr>
-      </w:pPr>
-      <w:r>
-        <w:rPr>
-          <w:rFonts w:ascii="Consolas" w:hAnsi="Consolas"/>
-          <w:color w:val="2C2C2C"/>
-          <w:sz w:val="18"/>
-        </w:rPr>
-        <w:t xml:space="preserve">    M -- No --&gt; O[CLI exits code 0]</w:t>
-      </w:r>
-    </w:p>
-    <w:p/>
+        <w:t>Figure 1. Architecture overview</w:t>
+      </w:r>
+    </w:p>
     <w:p/>
     <w:p>
       <w:pPr>
@@ -3833,7 +3495,7 @@
         <w:tc>
           <w:tcPr>
             <w:tcW w:type="dxa" w:w="4680"/>
-            <w:shd w:fill="EDEDED"/>
+            <w:shd w:fill="EFEFEF"/>
           </w:tcPr>
           <w:p>
             <w:pPr>
@@ -3852,7 +3514,7 @@
         <w:tc>
           <w:tcPr>
             <w:tcW w:type="dxa" w:w="4680"/>
-            <w:shd w:fill="EDEDED"/>
+            <w:shd w:fill="EFEFEF"/>
           </w:tcPr>
           <w:p>
             <w:pPr>
@@ -4148,7 +3810,7 @@
         <w:tc>
           <w:tcPr>
             <w:tcW w:type="dxa" w:w="3120"/>
-            <w:shd w:fill="EDEDED"/>
+            <w:shd w:fill="EFEFEF"/>
           </w:tcPr>
           <w:p>
             <w:pPr>
@@ -4167,7 +3829,7 @@
         <w:tc>
           <w:tcPr>
             <w:tcW w:type="dxa" w:w="3120"/>
-            <w:shd w:fill="EDEDED"/>
+            <w:shd w:fill="EFEFEF"/>
           </w:tcPr>
           <w:p>
             <w:pPr>
@@ -4186,7 +3848,7 @@
         <w:tc>
           <w:tcPr>
             <w:tcW w:type="dxa" w:w="3120"/>
-            <w:shd w:fill="EDEDED"/>
+            <w:shd w:fill="EFEFEF"/>
           </w:tcPr>
           <w:p>
             <w:pPr>
@@ -4927,7 +4589,7 @@
         <w:tc>
           <w:tcPr>
             <w:tcW w:type="dxa" w:w="4680"/>
-            <w:shd w:fill="EDEDED"/>
+            <w:shd w:fill="EFEFEF"/>
           </w:tcPr>
           <w:p>
             <w:pPr>
@@ -4946,7 +4608,7 @@
         <w:tc>
           <w:tcPr>
             <w:tcW w:type="dxa" w:w="4680"/>
-            <w:shd w:fill="EDEDED"/>
+            <w:shd w:fill="EFEFEF"/>
           </w:tcPr>
           <w:p>
             <w:pPr>

</xml_diff>

<commit_message>
Rewrite writeup into longer-form paper structure
</commit_message>
<xml_diff>
--- a/WRITEUP_polished.docx
+++ b/WRITEUP_polished.docx
@@ -108,71 +108,7 @@
                 <w:rFonts w:ascii="Times New Roman" w:hAnsi="Times New Roman"/>
                 <w:sz w:val="22"/>
               </w:rPr>
-              <w:t>If an LLM feature depends on a structured output contract, you should be able to test that contract the same way you test ordinary software: with deterministic checks, repeatable suites, and CI failure when the output breaks. That is the value proposition of kestrel-evals. It provides a compact way to:</w:t>
-            </w:r>
-          </w:p>
-          <w:p>
-            <w:pPr>
-              <w:pStyle w:val="ListBullet"/>
-              <w:jc w:val="both"/>
-            </w:pPr>
-            <w:r>
-              <w:rPr>
-                <w:rFonts w:ascii="Times New Roman" w:hAnsi="Times New Roman"/>
-                <w:sz w:val="21"/>
-              </w:rPr>
-              <w:t>define LLM eval cases in YAML</w:t>
-            </w:r>
-          </w:p>
-          <w:p>
-            <w:pPr>
-              <w:pStyle w:val="ListBullet"/>
-              <w:jc w:val="both"/>
-            </w:pPr>
-            <w:r>
-              <w:rPr>
-                <w:rFonts w:ascii="Times New Roman" w:hAnsi="Times New Roman"/>
-                <w:sz w:val="21"/>
-              </w:rPr>
-              <w:t>enforce mechanical correctness (JSON validity, required keys, allowed values, formatting constraints)</w:t>
-            </w:r>
-          </w:p>
-          <w:p>
-            <w:pPr>
-              <w:pStyle w:val="ListBullet"/>
-              <w:jc w:val="both"/>
-            </w:pPr>
-            <w:r>
-              <w:rPr>
-                <w:rFonts w:ascii="Times New Roman" w:hAnsi="Times New Roman"/>
-                <w:sz w:val="21"/>
-              </w:rPr>
-              <w:t>generate machine-readable reports</w:t>
-            </w:r>
-          </w:p>
-          <w:p>
-            <w:pPr>
-              <w:pStyle w:val="ListBullet"/>
-              <w:jc w:val="both"/>
-            </w:pPr>
-            <w:r>
-              <w:rPr>
-                <w:rFonts w:ascii="Times New Roman" w:hAnsi="Times New Roman"/>
-                <w:sz w:val="21"/>
-              </w:rPr>
-              <w:t>fail CI on regressions</w:t>
-            </w:r>
-          </w:p>
-          <w:p>
-            <w:pPr>
-              <w:jc w:val="both"/>
-            </w:pPr>
-            <w:r>
-              <w:rPr>
-                <w:rFonts w:ascii="Times New Roman" w:hAnsi="Times New Roman"/>
-                <w:sz w:val="22"/>
-              </w:rPr>
-              <w:t>This is not an attempt to be a general-purpose “AI quality platform.” It is something narrower and, in many workflows, more immediately useful: a test harness for contract-bound LLM behaviors.</w:t>
+              <w:t>If an LLM feature depends on a structured output contract, that contract should be testable in the same operational way as ordinary software: with deterministic checks, repeatable suites, and CI failure when the output breaks. That is the purpose of kestrel-evals. The project is intentionally narrow. It is not trying to solve the entire LLM evaluation problem. It is trying to solve one common and operationally important part of it well: making contract-bound LLM behaviors observable, repeatable, and gateable.</w:t>
             </w:r>
           </w:p>
         </w:tc>
@@ -200,7 +136,7 @@
           <w:rFonts w:ascii="Times New Roman" w:hAnsi="Times New Roman"/>
           <w:sz w:val="22"/>
         </w:rPr>
-        <w:t>kestrel-evals is a small evaluation harness for LLM-powered systems where correctness is partly or largely mechanical.</w:t>
+        <w:t>kestrel-evals is a small evaluation harness for LLM-powered systems where correctness is partly or largely mechanical. Rather than beginning with rubric scoring, model-vs-model judging, or broad subjective grading, it starts from a simpler premise: if an LLM feature is expected to produce machine-consumable output, then the first layer of evaluation should verify that the output actually obeys its contract.</w:t>
       </w:r>
     </w:p>
     <w:p>
@@ -214,7 +150,7 @@
           <w:rFonts w:ascii="Times New Roman" w:hAnsi="Times New Roman"/>
           <w:sz w:val="22"/>
         </w:rPr>
-        <w:t>Rather than beginning with rubric scoring, model-vs-model judging, or broad subjective grading, the project starts from a simpler premise:</w:t>
+        <w:t>In practice, that means checking whether the output is valid JSON, whether required keys exist, whether values remain inside a controlled vocabulary, and whether formatting guarantees are preserved. The harness takes YAML-defined suites, executes prompts against a provider, applies deterministic checks, emits a JSON report, and exits non-zero on failure so the result can gate CI.</w:t>
       </w:r>
     </w:p>
     <w:p>
@@ -228,105 +164,7 @@
           <w:rFonts w:ascii="Times New Roman" w:hAnsi="Times New Roman"/>
           <w:sz w:val="22"/>
         </w:rPr>
-        <w:t>if an LLM feature depends on a structured output contract, the first evaluation layer should be deterministic.</w:t>
-      </w:r>
-    </w:p>
-    <w:p>
-      <w:pPr>
-        <w:spacing w:after="120" w:line="276" w:lineRule="auto"/>
-        <w:ind w:firstLine="360"/>
-        <w:jc w:val="both"/>
-      </w:pPr>
-      <w:r>
-        <w:rPr>
-          <w:rFonts w:ascii="Times New Roman" w:hAnsi="Times New Roman"/>
-          <w:sz w:val="22"/>
-        </w:rPr>
-        <w:t>In practice, that means checking things like:</w:t>
-      </w:r>
-    </w:p>
-    <w:p>
-      <w:pPr>
-        <w:pStyle w:val="ListBullet"/>
-        <w:spacing w:after="40" w:line="264" w:lineRule="auto"/>
-        <w:jc w:val="both"/>
-      </w:pPr>
-      <w:r>
-        <w:rPr>
-          <w:rFonts w:ascii="Times New Roman" w:hAnsi="Times New Roman"/>
-          <w:sz w:val="21"/>
-        </w:rPr>
-        <w:t>whether the output is valid JSON</w:t>
-      </w:r>
-    </w:p>
-    <w:p>
-      <w:pPr>
-        <w:pStyle w:val="ListBullet"/>
-        <w:spacing w:after="40" w:line="264" w:lineRule="auto"/>
-        <w:jc w:val="both"/>
-      </w:pPr>
-      <w:r>
-        <w:rPr>
-          <w:rFonts w:ascii="Times New Roman" w:hAnsi="Times New Roman"/>
-          <w:sz w:val="21"/>
-        </w:rPr>
-        <w:t>whether required keys exist</w:t>
-      </w:r>
-    </w:p>
-    <w:p>
-      <w:pPr>
-        <w:pStyle w:val="ListBullet"/>
-        <w:spacing w:after="40" w:line="264" w:lineRule="auto"/>
-        <w:jc w:val="both"/>
-      </w:pPr>
-      <w:r>
-        <w:rPr>
-          <w:rFonts w:ascii="Times New Roman" w:hAnsi="Times New Roman"/>
-          <w:sz w:val="21"/>
-        </w:rPr>
-        <w:t>whether values belong to a controlled vocabulary</w:t>
-      </w:r>
-    </w:p>
-    <w:p>
-      <w:pPr>
-        <w:pStyle w:val="ListBullet"/>
-        <w:spacing w:after="40" w:line="264" w:lineRule="auto"/>
-        <w:jc w:val="both"/>
-      </w:pPr>
-      <w:r>
-        <w:rPr>
-          <w:rFonts w:ascii="Times New Roman" w:hAnsi="Times New Roman"/>
-          <w:sz w:val="21"/>
-        </w:rPr>
-        <w:t>whether formatting guarantees are preserved</w:t>
-      </w:r>
-    </w:p>
-    <w:p>
-      <w:pPr>
-        <w:spacing w:after="120" w:line="276" w:lineRule="auto"/>
-        <w:ind w:firstLine="360"/>
-        <w:jc w:val="both"/>
-      </w:pPr>
-      <w:r>
-        <w:rPr>
-          <w:rFonts w:ascii="Times New Roman" w:hAnsi="Times New Roman"/>
-          <w:sz w:val="22"/>
-        </w:rPr>
-        <w:t>The harness takes YAML-defined suites, executes prompts against a provider, applies deterministic checks, emits a JSON report, and exits non-zero on failure so the result can gate CI.</w:t>
-      </w:r>
-    </w:p>
-    <w:p>
-      <w:pPr>
-        <w:spacing w:after="120" w:line="276" w:lineRule="auto"/>
-        <w:ind w:firstLine="360"/>
-        <w:jc w:val="both"/>
-      </w:pPr>
-      <w:r>
-        <w:rPr>
-          <w:rFonts w:ascii="Times New Roman" w:hAnsi="Times New Roman"/>
-          <w:sz w:val="22"/>
-        </w:rPr>
-        <w:t>The current implementation is intentionally small. It is not trying to be a universal benchmark platform. Its purpose is to make one common class of LLM failure visible, repeatable, and actionable.</w:t>
+        <w:t>The current implementation is intentionally small. It is not presented as a universal benchmark platform or a general theory of LLM quality. It is a working implementation of a narrower claim: for contract-bound LLM outputs, deterministic gating is often the most useful place to start.</w:t>
       </w:r>
     </w:p>
     <w:p/>
@@ -350,7 +188,7 @@
           <w:rFonts w:ascii="Times New Roman" w:hAnsi="Times New Roman"/>
           <w:sz w:val="22"/>
         </w:rPr>
-        <w:t>A large share of practical LLM failures are not philosophical or subtle. They are mechanical.</w:t>
+        <w:t>A large share of practical LLM failures do not first appear as subtle questions of quality. They appear as broken software behavior. A downstream system may expect valid JSON, a fixed set of top-level keys, empty strings rather than null, or a list field that contains only approved labels. When those assumptions are violated, the integration fails long before anyone has a chance to debate whether the response was insightful or well written.</w:t>
       </w:r>
     </w:p>
     <w:p>
@@ -364,77 +202,7 @@
           <w:rFonts w:ascii="Times New Roman" w:hAnsi="Times New Roman"/>
           <w:sz w:val="22"/>
         </w:rPr>
-        <w:t>A downstream system may expect:</w:t>
-      </w:r>
-    </w:p>
-    <w:p>
-      <w:pPr>
-        <w:pStyle w:val="ListBullet"/>
-        <w:spacing w:after="40" w:line="264" w:lineRule="auto"/>
-        <w:jc w:val="both"/>
-      </w:pPr>
-      <w:r>
-        <w:rPr>
-          <w:rFonts w:ascii="Times New Roman" w:hAnsi="Times New Roman"/>
-          <w:sz w:val="21"/>
-        </w:rPr>
-        <w:t>valid JSON</w:t>
-      </w:r>
-    </w:p>
-    <w:p>
-      <w:pPr>
-        <w:pStyle w:val="ListBullet"/>
-        <w:spacing w:after="40" w:line="264" w:lineRule="auto"/>
-        <w:jc w:val="both"/>
-      </w:pPr>
-      <w:r>
-        <w:rPr>
-          <w:rFonts w:ascii="Times New Roman" w:hAnsi="Times New Roman"/>
-          <w:sz w:val="21"/>
-        </w:rPr>
-        <w:t>a fixed set of top-level keys</w:t>
-      </w:r>
-    </w:p>
-    <w:p>
-      <w:pPr>
-        <w:pStyle w:val="ListBullet"/>
-        <w:spacing w:after="40" w:line="264" w:lineRule="auto"/>
-        <w:jc w:val="both"/>
-      </w:pPr>
-      <w:r>
-        <w:rPr>
-          <w:rFonts w:ascii="Times New Roman" w:hAnsi="Times New Roman"/>
-          <w:sz w:val="21"/>
-        </w:rPr>
-        <w:t>empty strings instead of null</w:t>
-      </w:r>
-    </w:p>
-    <w:p>
-      <w:pPr>
-        <w:pStyle w:val="ListBullet"/>
-        <w:spacing w:after="40" w:line="264" w:lineRule="auto"/>
-        <w:jc w:val="both"/>
-      </w:pPr>
-      <w:r>
-        <w:rPr>
-          <w:rFonts w:ascii="Times New Roman" w:hAnsi="Times New Roman"/>
-          <w:sz w:val="21"/>
-        </w:rPr>
-        <w:t>a list field using only approved labels</w:t>
-      </w:r>
-    </w:p>
-    <w:p>
-      <w:pPr>
-        <w:pStyle w:val="ListBullet"/>
-        <w:spacing w:after="40" w:line="264" w:lineRule="auto"/>
-        <w:jc w:val="both"/>
-      </w:pPr>
-      <w:r>
-        <w:rPr>
-          <w:rFonts w:ascii="Times New Roman" w:hAnsi="Times New Roman"/>
-          <w:sz w:val="21"/>
-        </w:rPr>
-        <w:t>no prose wrappers, code fences, or extra commentary</w:t>
+        <w:t>That observation is the starting point for kestrel-evals. The project is built around a simple operational claim: if an LLM output is part of a production workflow, then the output contract should be testable. And if it is testable, it should be possible to run those tests locally, in CI, and in a form that fails fast when the contract breaks.</w:t>
       </w:r>
     </w:p>
     <w:p>
@@ -448,7 +216,7 @@
           <w:rFonts w:ascii="Times New Roman" w:hAnsi="Times New Roman"/>
           <w:sz w:val="22"/>
         </w:rPr>
-        <w:t>When those assumptions are violated, the integration fails before anyone has a chance to debate whether the answer was clever, elegant, or broadly helpful.</w:t>
+        <w:t>This framing matters because the industry conversation around LLM evaluation often broadens too quickly. It is common to jump to questions such as whether an answer is helpful, whether one model outperforms another, or whether a judge model would rate the output highly. Those are legitimate evaluation problems, but they are not always the first problems that matter. In many real systems, the first question is much less glamorous: did the model produce something the pipeline can safely consume?</w:t>
       </w:r>
     </w:p>
     <w:p>
@@ -462,7 +230,17 @@
           <w:rFonts w:ascii="Times New Roman" w:hAnsi="Times New Roman"/>
           <w:sz w:val="22"/>
         </w:rPr>
-        <w:t>That is the gap kestrel-evals is designed to address.</w:t>
+        <w:t>That is where this project is strongest. Its value proposition is not “better AI vibes.” Its value proposition is more practical: fewer silent regressions in contract-bound LLM features, faster iteration on prompts and schemas, CI-visible failures instead of downstream breakage, and a lightweight path from prompt experimentation to something that can be treated more like ordinary software.</w:t>
+      </w:r>
+    </w:p>
+    <w:p/>
+    <w:p>
+      <w:pPr>
+        <w:pStyle w:val="Heading1"/>
+        <w:spacing w:before="160" w:after="80"/>
+      </w:pPr>
+      <w:r>
+        <w:t>2. Why deterministic gating comes first</w:t>
       </w:r>
     </w:p>
     <w:p>
@@ -476,16 +254,7 @@
           <w:rFonts w:ascii="Times New Roman" w:hAnsi="Times New Roman"/>
           <w:sz w:val="22"/>
         </w:rPr>
-        <w:t>The central idea is straightforward: if an LLM output is part of a production workflow, then the output contract should be testable. And if it is testable, it should be possible to run those tests locally, in CI, and in a way that fails fast when the contract breaks.</w:t>
-      </w:r>
-    </w:p>
-    <w:p>
-      <w:pPr>
-        <w:pStyle w:val="Heading2"/>
-        <w:spacing w:before="160" w:after="80"/>
-      </w:pPr>
-      <w:r>
-        <w:t>Clear value proposition</w:t>
+        <w:t>For a broad class of workflows, deterministic checks deserve to be the first evaluation layer because the earliest and most expensive failures are mechanical. A model that returns markdown-wrapped JSON when the system expects raw JSON has failed, even if the payload inside is otherwise sensible. A classifier that emits a near-synonym instead of a valid controlled label has failed, even if a human would understand what it meant. A field that should be an array but arrives as a string has failed, regardless of whether the prose around it sounds competent.</w:t>
       </w:r>
     </w:p>
     <w:p>
@@ -499,7 +268,7 @@
           <w:rFonts w:ascii="Times New Roman" w:hAnsi="Times New Roman"/>
           <w:sz w:val="22"/>
         </w:rPr>
-        <w:t>The value proposition is not “better AI vibes.”</w:t>
+        <w:t>These are not cosmetic issues. They are contract violations. If the LLM sits inside a pipeline for parsing, routing, storage, or automation, they are often the difference between a working system and a broken one.</w:t>
       </w:r>
     </w:p>
     <w:p>
@@ -513,63 +282,7 @@
           <w:rFonts w:ascii="Times New Roman" w:hAnsi="Times New Roman"/>
           <w:sz w:val="22"/>
         </w:rPr>
-        <w:t>The value proposition is:</w:t>
-      </w:r>
-    </w:p>
-    <w:p>
-      <w:pPr>
-        <w:pStyle w:val="ListBullet"/>
-        <w:spacing w:after="40" w:line="264" w:lineRule="auto"/>
-        <w:jc w:val="both"/>
-      </w:pPr>
-      <w:r>
-        <w:rPr>
-          <w:rFonts w:ascii="Times New Roman" w:hAnsi="Times New Roman"/>
-          <w:sz w:val="21"/>
-        </w:rPr>
-        <w:t>fewer silent regressions in contract-bound LLM features</w:t>
-      </w:r>
-    </w:p>
-    <w:p>
-      <w:pPr>
-        <w:pStyle w:val="ListBullet"/>
-        <w:spacing w:after="40" w:line="264" w:lineRule="auto"/>
-        <w:jc w:val="both"/>
-      </w:pPr>
-      <w:r>
-        <w:rPr>
-          <w:rFonts w:ascii="Times New Roman" w:hAnsi="Times New Roman"/>
-          <w:sz w:val="21"/>
-        </w:rPr>
-        <w:t>faster iteration on prompts and schemas</w:t>
-      </w:r>
-    </w:p>
-    <w:p>
-      <w:pPr>
-        <w:pStyle w:val="ListBullet"/>
-        <w:spacing w:after="40" w:line="264" w:lineRule="auto"/>
-        <w:jc w:val="both"/>
-      </w:pPr>
-      <w:r>
-        <w:rPr>
-          <w:rFonts w:ascii="Times New Roman" w:hAnsi="Times New Roman"/>
-          <w:sz w:val="21"/>
-        </w:rPr>
-        <w:t>CI-visible failures instead of downstream breakage</w:t>
-      </w:r>
-    </w:p>
-    <w:p>
-      <w:pPr>
-        <w:pStyle w:val="ListBullet"/>
-        <w:spacing w:after="40" w:line="264" w:lineRule="auto"/>
-        <w:jc w:val="both"/>
-      </w:pPr>
-      <w:r>
-        <w:rPr>
-          <w:rFonts w:ascii="Times New Roman" w:hAnsi="Times New Roman"/>
-          <w:sz w:val="21"/>
-        </w:rPr>
-        <w:t>a lightweight path from “prompt experiment” to “testable subsystem”</w:t>
+        <w:t>Deterministic checks are well suited to these problems because they are both cheap and legible. A failed regex, missing key, or disallowed value is easy to understand. That clarity matters. Teams are far more likely to trust an evaluation harness when the failure mode is concrete and inspectable rather than buried inside an opaque scoring system. It also makes CI integration natural: if the question is whether the contract held, then the harness can behave like any other test runner and return a failing exit code when the answer is no.</w:t>
       </w:r>
     </w:p>
     <w:p>
@@ -583,7 +296,7 @@
           <w:rFonts w:ascii="Times New Roman" w:hAnsi="Times New Roman"/>
           <w:sz w:val="22"/>
         </w:rPr>
-        <w:t>Put differently: kestrel-evals makes a common class of LLM integration risks behave more like ordinary software quality problems.</w:t>
+        <w:t>This does not make subjective evaluation unimportant. Rubric scoring, pairwise comparison, and model-as-judge approaches all have their place. The point is one of sequencing. It is usually a mistake to ask whether an answer is “good” before confirming that it is structurally valid. Deterministic gating is therefore not a replacement for all other evaluation methods. It is the right first layer for systems whose outputs must obey explicit mechanical constraints.</w:t>
       </w:r>
     </w:p>
     <w:p/>
@@ -593,7 +306,7 @@
         <w:spacing w:before="160" w:after="80"/>
       </w:pPr>
       <w:r>
-        <w:t>2. Problem statement</w:t>
+        <w:t>3. Design goals and scope</w:t>
       </w:r>
     </w:p>
     <w:p>
@@ -607,63 +320,7 @@
           <w:rFonts w:ascii="Times New Roman" w:hAnsi="Times New Roman"/>
           <w:sz w:val="22"/>
         </w:rPr>
-        <w:t>Many discussions of LLM evaluation jump immediately to nuanced questions:</w:t>
-      </w:r>
-    </w:p>
-    <w:p>
-      <w:pPr>
-        <w:pStyle w:val="ListBullet"/>
-        <w:spacing w:after="40" w:line="264" w:lineRule="auto"/>
-        <w:jc w:val="both"/>
-      </w:pPr>
-      <w:r>
-        <w:rPr>
-          <w:rFonts w:ascii="Times New Roman" w:hAnsi="Times New Roman"/>
-          <w:sz w:val="21"/>
-        </w:rPr>
-        <w:t>Is the answer helpful?</w:t>
-      </w:r>
-    </w:p>
-    <w:p>
-      <w:pPr>
-        <w:pStyle w:val="ListBullet"/>
-        <w:spacing w:after="40" w:line="264" w:lineRule="auto"/>
-        <w:jc w:val="both"/>
-      </w:pPr>
-      <w:r>
-        <w:rPr>
-          <w:rFonts w:ascii="Times New Roman" w:hAnsi="Times New Roman"/>
-          <w:sz w:val="21"/>
-        </w:rPr>
-        <w:t>Is the reasoning strong?</w:t>
-      </w:r>
-    </w:p>
-    <w:p>
-      <w:pPr>
-        <w:pStyle w:val="ListBullet"/>
-        <w:spacing w:after="40" w:line="264" w:lineRule="auto"/>
-        <w:jc w:val="both"/>
-      </w:pPr>
-      <w:r>
-        <w:rPr>
-          <w:rFonts w:ascii="Times New Roman" w:hAnsi="Times New Roman"/>
-          <w:sz w:val="21"/>
-        </w:rPr>
-        <w:t>Is one model’s response better than another’s?</w:t>
-      </w:r>
-    </w:p>
-    <w:p>
-      <w:pPr>
-        <w:pStyle w:val="ListBullet"/>
-        <w:spacing w:after="40" w:line="264" w:lineRule="auto"/>
-        <w:jc w:val="both"/>
-      </w:pPr>
-      <w:r>
-        <w:rPr>
-          <w:rFonts w:ascii="Times New Roman" w:hAnsi="Times New Roman"/>
-          <w:sz w:val="21"/>
-        </w:rPr>
-        <w:t>Would a judge model rate this highly?</w:t>
+        <w:t>The design goal of kestrel-evals is deliberately constrained: define suites in a small, reviewable format; run them locally and in CI; check output contracts with deterministic logic; and fail quickly when those contracts are violated. The project is not trying to solve all evaluation problems at once. It is trying to make one common and useful pattern reliable enough to support development and deployment workflows.</w:t>
       </w:r>
     </w:p>
     <w:p>
@@ -677,7 +334,17 @@
           <w:rFonts w:ascii="Times New Roman" w:hAnsi="Times New Roman"/>
           <w:sz w:val="22"/>
         </w:rPr>
-        <w:t>Those are legitimate questions. They are simply not always the first ones that matter.</w:t>
+        <w:t>That focus is reflected in the current scope. The implementation supports YAML-defined suites, local execution, CI execution, deterministic checks, provider-backed generation through an OpenAI implementation, JSON report output, and non-zero exit behavior on failure. It does not yet attempt to provide a full benchmarking platform, a dataset registry, a judge-model workflow, comprehensive JSON Schema support, or broad provider parity. Those limitations are intentional. The project is small on purpose.</w:t>
+      </w:r>
+    </w:p>
+    <w:p/>
+    <w:p>
+      <w:pPr>
+        <w:pStyle w:val="Heading1"/>
+        <w:spacing w:before="160" w:after="80"/>
+      </w:pPr>
+      <w:r>
+        <w:t>4. System design and implementation</w:t>
       </w:r>
     </w:p>
     <w:p>
@@ -691,91 +358,7 @@
           <w:rFonts w:ascii="Times New Roman" w:hAnsi="Times New Roman"/>
           <w:sz w:val="22"/>
         </w:rPr>
-        <w:t>For a large class of practical systems, the first failures are much simpler:</w:t>
-      </w:r>
-    </w:p>
-    <w:p>
-      <w:pPr>
-        <w:pStyle w:val="ListBullet"/>
-        <w:spacing w:after="40" w:line="264" w:lineRule="auto"/>
-        <w:jc w:val="both"/>
-      </w:pPr>
-      <w:r>
-        <w:rPr>
-          <w:rFonts w:ascii="Times New Roman" w:hAnsi="Times New Roman"/>
-          <w:sz w:val="21"/>
-        </w:rPr>
-        <w:t>the model returned markdown-wrapped JSON when the system needed raw JSON</w:t>
-      </w:r>
-    </w:p>
-    <w:p>
-      <w:pPr>
-        <w:pStyle w:val="ListBullet"/>
-        <w:spacing w:after="40" w:line="264" w:lineRule="auto"/>
-        <w:jc w:val="both"/>
-      </w:pPr>
-      <w:r>
-        <w:rPr>
-          <w:rFonts w:ascii="Times New Roman" w:hAnsi="Times New Roman"/>
-          <w:sz w:val="21"/>
-        </w:rPr>
-        <w:t>a required field is missing</w:t>
-      </w:r>
-    </w:p>
-    <w:p>
-      <w:pPr>
-        <w:pStyle w:val="ListBullet"/>
-        <w:spacing w:after="40" w:line="264" w:lineRule="auto"/>
-        <w:jc w:val="both"/>
-      </w:pPr>
-      <w:r>
-        <w:rPr>
-          <w:rFonts w:ascii="Times New Roman" w:hAnsi="Times New Roman"/>
-          <w:sz w:val="21"/>
-        </w:rPr>
-        <w:t>key names drifted</w:t>
-      </w:r>
-    </w:p>
-    <w:p>
-      <w:pPr>
-        <w:pStyle w:val="ListBullet"/>
-        <w:spacing w:after="40" w:line="264" w:lineRule="auto"/>
-        <w:jc w:val="both"/>
-      </w:pPr>
-      <w:r>
-        <w:rPr>
-          <w:rFonts w:ascii="Times New Roman" w:hAnsi="Times New Roman"/>
-          <w:sz w:val="21"/>
-        </w:rPr>
-        <w:t>a classifier emitted a synonym instead of an allowed label</w:t>
-      </w:r>
-    </w:p>
-    <w:p>
-      <w:pPr>
-        <w:pStyle w:val="ListBullet"/>
-        <w:spacing w:after="40" w:line="264" w:lineRule="auto"/>
-        <w:jc w:val="both"/>
-      </w:pPr>
-      <w:r>
-        <w:rPr>
-          <w:rFonts w:ascii="Times New Roman" w:hAnsi="Times New Roman"/>
-          <w:sz w:val="21"/>
-        </w:rPr>
-        <w:t>a field that should be an array became a string</w:t>
-      </w:r>
-    </w:p>
-    <w:p>
-      <w:pPr>
-        <w:pStyle w:val="ListBullet"/>
-        <w:spacing w:after="40" w:line="264" w:lineRule="auto"/>
-        <w:jc w:val="both"/>
-      </w:pPr>
-      <w:r>
-        <w:rPr>
-          <w:rFonts w:ascii="Times New Roman" w:hAnsi="Times New Roman"/>
-          <w:sz w:val="21"/>
-        </w:rPr>
-        <w:t>a value that should be "" came back as null</w:t>
+        <w:t>At a high level, kestrel-evals has four moving parts: a suite definition, a provider call, deterministic checks, and a report plus exit status. That may sound almost trivial, but that simplicity is part of the point. The harness is meant to be easy to inspect, easy to reason about, and easy to run.</w:t>
       </w:r>
     </w:p>
     <w:p>
@@ -789,7 +372,7 @@
           <w:rFonts w:ascii="Times New Roman" w:hAnsi="Times New Roman"/>
           <w:sz w:val="22"/>
         </w:rPr>
-        <w:t>These are not subtle quality issues. They are contract violations that can break parsing, routing, storage, or automation outright.</w:t>
+        <w:t>The suite itself is authored in YAML. Each suite defines a name, description, and list of cases. Each case defines a system prompt, user prompt, and one or more deterministic checks. This keeps the test specification close to the behavior being evaluated. The suite file acts as both the test definition and the documentation of the expected contract.</w:t>
       </w:r>
     </w:p>
     <w:p>
@@ -803,17 +386,7 @@
           <w:rFonts w:ascii="Times New Roman" w:hAnsi="Times New Roman"/>
           <w:sz w:val="22"/>
         </w:rPr>
-        <w:t>If an LLM-powered feature sits inside a production workflow, these failures are often more consequential than broad subjective quality. This project exists to handle that layer first.</w:t>
-      </w:r>
-    </w:p>
-    <w:p/>
-    <w:p>
-      <w:pPr>
-        <w:pStyle w:val="Heading1"/>
-        <w:spacing w:before="160" w:after="80"/>
-      </w:pPr>
-      <w:r>
-        <w:t>3. Design goal</w:t>
+        <w:t>On execution, the runner loads the suite, iterates through the cases, calls the configured provider, captures raw output, applies the requested checks, and accumulates a JSON report. The provider abstraction is intentionally minimal: it exposes a simple generate(model, system, user) -&gt; str interface. The current implementation is OpenAIProvider, but the abstraction already isolates vendor-specific API code from suite logic and check execution. That separation matters if the project later expands to additional providers.</w:t>
       </w:r>
     </w:p>
     <w:p>
@@ -827,7 +400,7 @@
           <w:rFonts w:ascii="Times New Roman" w:hAnsi="Times New Roman"/>
           <w:sz w:val="22"/>
         </w:rPr>
-        <w:t>The goal of kestrel-evals is simple:</w:t>
+        <w:t>The checks themselves are deliberately limited. The current implementation supports a small subset of JSON Schema validation, an allowed_values check for controlled vocabularies, and a regex check against raw output text. These are enough to validate a surprisingly wide range of contract-bound behaviors without pulling in heavier dependencies or turning the project into a large framework too early.</w:t>
       </w:r>
     </w:p>
     <w:p>
@@ -841,878 +414,7 @@
           <w:rFonts w:ascii="Times New Roman" w:hAnsi="Times New Roman"/>
           <w:sz w:val="22"/>
         </w:rPr>
-        <w:t>Deterministic gating first.</w:t>
-      </w:r>
-    </w:p>
-    <w:p>
-      <w:pPr>
-        <w:spacing w:after="120" w:line="276" w:lineRule="auto"/>
-        <w:ind w:firstLine="360"/>
-        <w:jc w:val="both"/>
-      </w:pPr>
-      <w:r>
-        <w:rPr>
-          <w:rFonts w:ascii="Times New Roman" w:hAnsi="Times New Roman"/>
-          <w:sz w:val="22"/>
-        </w:rPr>
-        <w:t>In practice, that means:</w:t>
-      </w:r>
-    </w:p>
-    <w:p>
-      <w:pPr>
-        <w:pStyle w:val="ListBullet"/>
-        <w:spacing w:after="40" w:line="264" w:lineRule="auto"/>
-        <w:jc w:val="both"/>
-      </w:pPr>
-      <w:r>
-        <w:rPr>
-          <w:rFonts w:ascii="Times New Roman" w:hAnsi="Times New Roman"/>
-          <w:sz w:val="21"/>
-        </w:rPr>
-        <w:t>define suites in a small, reviewable format</w:t>
-      </w:r>
-    </w:p>
-    <w:p>
-      <w:pPr>
-        <w:pStyle w:val="ListBullet"/>
-        <w:spacing w:after="40" w:line="264" w:lineRule="auto"/>
-        <w:jc w:val="both"/>
-      </w:pPr>
-      <w:r>
-        <w:rPr>
-          <w:rFonts w:ascii="Times New Roman" w:hAnsi="Times New Roman"/>
-          <w:sz w:val="21"/>
-        </w:rPr>
-        <w:t>run them locally and in CI</w:t>
-      </w:r>
-    </w:p>
-    <w:p>
-      <w:pPr>
-        <w:pStyle w:val="ListBullet"/>
-        <w:spacing w:after="40" w:line="264" w:lineRule="auto"/>
-        <w:jc w:val="both"/>
-      </w:pPr>
-      <w:r>
-        <w:rPr>
-          <w:rFonts w:ascii="Times New Roman" w:hAnsi="Times New Roman"/>
-          <w:sz w:val="21"/>
-        </w:rPr>
-        <w:t>check output contracts with deterministic logic</w:t>
-      </w:r>
-    </w:p>
-    <w:p>
-      <w:pPr>
-        <w:pStyle w:val="ListBullet"/>
-        <w:spacing w:after="40" w:line="264" w:lineRule="auto"/>
-        <w:jc w:val="both"/>
-      </w:pPr>
-      <w:r>
-        <w:rPr>
-          <w:rFonts w:ascii="Times New Roman" w:hAnsi="Times New Roman"/>
-          <w:sz w:val="21"/>
-        </w:rPr>
-        <w:t>fail quickly when those contracts are violated</w:t>
-      </w:r>
-    </w:p>
-    <w:p>
-      <w:pPr>
-        <w:spacing w:after="120" w:line="276" w:lineRule="auto"/>
-        <w:ind w:firstLine="360"/>
-        <w:jc w:val="both"/>
-      </w:pPr>
-      <w:r>
-        <w:rPr>
-          <w:rFonts w:ascii="Times New Roman" w:hAnsi="Times New Roman"/>
-          <w:sz w:val="22"/>
-        </w:rPr>
-        <w:t>The goal of this initial implementation is deliberately limited. The project is not trying to solve all evaluation problems at once.</w:t>
-      </w:r>
-    </w:p>
-    <w:p>
-      <w:pPr>
-        <w:spacing w:after="120" w:line="276" w:lineRule="auto"/>
-        <w:ind w:firstLine="360"/>
-        <w:jc w:val="both"/>
-      </w:pPr>
-      <w:r>
-        <w:rPr>
-          <w:rFonts w:ascii="Times New Roman" w:hAnsi="Times New Roman"/>
-          <w:sz w:val="22"/>
-        </w:rPr>
-        <w:t>It is trying to solve a narrower, common, and useful one well:</w:t>
-      </w:r>
-    </w:p>
-    <w:p>
-      <w:pPr>
-        <w:spacing w:after="120" w:line="276" w:lineRule="auto"/>
-        <w:ind w:firstLine="360"/>
-        <w:jc w:val="both"/>
-      </w:pPr>
-      <w:r>
-        <w:rPr>
-          <w:rFonts w:ascii="Times New Roman" w:hAnsi="Times New Roman"/>
-          <w:sz w:val="22"/>
-        </w:rPr>
-        <w:t>Given a prompt-based feature with a known expected shape, can regressions be caught automatically and cheaply?</w:t>
-      </w:r>
-    </w:p>
-    <w:p/>
-    <w:p>
-      <w:pPr>
-        <w:pStyle w:val="Heading1"/>
-        <w:spacing w:before="160" w:after="80"/>
-      </w:pPr>
-      <w:r>
-        <w:t>4. Scope and non-goals</w:t>
-      </w:r>
-    </w:p>
-    <w:p>
-      <w:pPr>
-        <w:pStyle w:val="Heading2"/>
-        <w:spacing w:before="160" w:after="80"/>
-      </w:pPr>
-      <w:r>
-        <w:t>In scope (current implementation)</w:t>
-      </w:r>
-    </w:p>
-    <w:p>
-      <w:pPr>
-        <w:pStyle w:val="ListBullet"/>
-        <w:spacing w:after="40" w:line="264" w:lineRule="auto"/>
-        <w:jc w:val="both"/>
-      </w:pPr>
-      <w:r>
-        <w:rPr>
-          <w:rFonts w:ascii="Times New Roman" w:hAnsi="Times New Roman"/>
-          <w:sz w:val="21"/>
-        </w:rPr>
-        <w:t>YAML-defined suites</w:t>
-      </w:r>
-    </w:p>
-    <w:p>
-      <w:pPr>
-        <w:pStyle w:val="ListBullet"/>
-        <w:spacing w:after="40" w:line="264" w:lineRule="auto"/>
-        <w:jc w:val="both"/>
-      </w:pPr>
-      <w:r>
-        <w:rPr>
-          <w:rFonts w:ascii="Times New Roman" w:hAnsi="Times New Roman"/>
-          <w:sz w:val="21"/>
-        </w:rPr>
-        <w:t>local execution</w:t>
-      </w:r>
-    </w:p>
-    <w:p>
-      <w:pPr>
-        <w:pStyle w:val="ListBullet"/>
-        <w:spacing w:after="40" w:line="264" w:lineRule="auto"/>
-        <w:jc w:val="both"/>
-      </w:pPr>
-      <w:r>
-        <w:rPr>
-          <w:rFonts w:ascii="Times New Roman" w:hAnsi="Times New Roman"/>
-          <w:sz w:val="21"/>
-        </w:rPr>
-        <w:t>CI execution</w:t>
-      </w:r>
-    </w:p>
-    <w:p>
-      <w:pPr>
-        <w:pStyle w:val="ListBullet"/>
-        <w:spacing w:after="40" w:line="264" w:lineRule="auto"/>
-        <w:jc w:val="both"/>
-      </w:pPr>
-      <w:r>
-        <w:rPr>
-          <w:rFonts w:ascii="Times New Roman" w:hAnsi="Times New Roman"/>
-          <w:sz w:val="21"/>
-        </w:rPr>
-        <w:t>deterministic checks</w:t>
-      </w:r>
-    </w:p>
-    <w:p>
-      <w:pPr>
-        <w:pStyle w:val="ListBullet"/>
-        <w:spacing w:after="40" w:line="264" w:lineRule="auto"/>
-        <w:jc w:val="both"/>
-      </w:pPr>
-      <w:r>
-        <w:rPr>
-          <w:rFonts w:ascii="Times New Roman" w:hAnsi="Times New Roman"/>
-          <w:sz w:val="21"/>
-        </w:rPr>
-        <w:t>provider-backed generation (current provider: OpenAI)</w:t>
-      </w:r>
-    </w:p>
-    <w:p>
-      <w:pPr>
-        <w:pStyle w:val="ListBullet"/>
-        <w:spacing w:after="40" w:line="264" w:lineRule="auto"/>
-        <w:jc w:val="both"/>
-      </w:pPr>
-      <w:r>
-        <w:rPr>
-          <w:rFonts w:ascii="Times New Roman" w:hAnsi="Times New Roman"/>
-          <w:sz w:val="21"/>
-        </w:rPr>
-        <w:t>JSON report output</w:t>
-      </w:r>
-    </w:p>
-    <w:p>
-      <w:pPr>
-        <w:pStyle w:val="ListBullet"/>
-        <w:spacing w:after="40" w:line="264" w:lineRule="auto"/>
-        <w:jc w:val="both"/>
-      </w:pPr>
-      <w:r>
-        <w:rPr>
-          <w:rFonts w:ascii="Times New Roman" w:hAnsi="Times New Roman"/>
-          <w:sz w:val="21"/>
-        </w:rPr>
-        <w:t>non-zero exit on failure</w:t>
-      </w:r>
-    </w:p>
-    <w:p>
-      <w:pPr>
-        <w:pStyle w:val="Heading2"/>
-        <w:spacing w:before="160" w:after="80"/>
-      </w:pPr>
-      <w:r>
-        <w:t>Not in scope yet</w:t>
-      </w:r>
-    </w:p>
-    <w:p>
-      <w:pPr>
-        <w:pStyle w:val="ListBullet"/>
-        <w:spacing w:after="40" w:line="264" w:lineRule="auto"/>
-        <w:jc w:val="both"/>
-      </w:pPr>
-      <w:r>
-        <w:rPr>
-          <w:rFonts w:ascii="Times New Roman" w:hAnsi="Times New Roman"/>
-          <w:sz w:val="21"/>
-        </w:rPr>
-        <w:t>a full benchmarking platform</w:t>
-      </w:r>
-    </w:p>
-    <w:p>
-      <w:pPr>
-        <w:pStyle w:val="ListBullet"/>
-        <w:spacing w:after="40" w:line="264" w:lineRule="auto"/>
-        <w:jc w:val="both"/>
-      </w:pPr>
-      <w:r>
-        <w:rPr>
-          <w:rFonts w:ascii="Times New Roman" w:hAnsi="Times New Roman"/>
-          <w:sz w:val="21"/>
-        </w:rPr>
-        <w:t>dataset/version registry tooling</w:t>
-      </w:r>
-    </w:p>
-    <w:p>
-      <w:pPr>
-        <w:pStyle w:val="ListBullet"/>
-        <w:spacing w:after="40" w:line="264" w:lineRule="auto"/>
-        <w:jc w:val="both"/>
-      </w:pPr>
-      <w:r>
-        <w:rPr>
-          <w:rFonts w:ascii="Times New Roman" w:hAnsi="Times New Roman"/>
-          <w:sz w:val="21"/>
-        </w:rPr>
-        <w:t>annotation UI</w:t>
-      </w:r>
-    </w:p>
-    <w:p>
-      <w:pPr>
-        <w:pStyle w:val="ListBullet"/>
-        <w:spacing w:after="40" w:line="264" w:lineRule="auto"/>
-        <w:jc w:val="both"/>
-      </w:pPr>
-      <w:r>
-        <w:rPr>
-          <w:rFonts w:ascii="Times New Roman" w:hAnsi="Times New Roman"/>
-          <w:sz w:val="21"/>
-        </w:rPr>
-        <w:t>judge-model scoring as the primary decision mechanism</w:t>
-      </w:r>
-    </w:p>
-    <w:p>
-      <w:pPr>
-        <w:pStyle w:val="ListBullet"/>
-        <w:spacing w:after="40" w:line="264" w:lineRule="auto"/>
-        <w:jc w:val="both"/>
-      </w:pPr>
-      <w:r>
-        <w:rPr>
-          <w:rFonts w:ascii="Times New Roman" w:hAnsi="Times New Roman"/>
-          <w:sz w:val="21"/>
-        </w:rPr>
-        <w:t>provider-independent parity claims</w:t>
-      </w:r>
-    </w:p>
-    <w:p>
-      <w:pPr>
-        <w:pStyle w:val="ListBullet"/>
-        <w:spacing w:after="40" w:line="264" w:lineRule="auto"/>
-        <w:jc w:val="both"/>
-      </w:pPr>
-      <w:r>
-        <w:rPr>
-          <w:rFonts w:ascii="Times New Roman" w:hAnsi="Times New Roman"/>
-          <w:sz w:val="21"/>
-        </w:rPr>
-        <w:t>comprehensive JSON Schema support</w:t>
-      </w:r>
-    </w:p>
-    <w:p>
-      <w:pPr>
-        <w:spacing w:after="120" w:line="276" w:lineRule="auto"/>
-        <w:ind w:firstLine="360"/>
-        <w:jc w:val="both"/>
-      </w:pPr>
-      <w:r>
-        <w:rPr>
-          <w:rFonts w:ascii="Times New Roman" w:hAnsi="Times New Roman"/>
-          <w:sz w:val="22"/>
-        </w:rPr>
-        <w:t>These limits are intentional. The project is small on purpose.</w:t>
-      </w:r>
-    </w:p>
-    <w:p/>
-    <w:p>
-      <w:pPr>
-        <w:pStyle w:val="Heading1"/>
-        <w:spacing w:before="160" w:after="80"/>
-      </w:pPr>
-      <w:r>
-        <w:t>5. Why deterministic checks come first</w:t>
-      </w:r>
-    </w:p>
-    <w:p>
-      <w:pPr>
-        <w:spacing w:after="120" w:line="276" w:lineRule="auto"/>
-        <w:ind w:firstLine="360"/>
-        <w:jc w:val="both"/>
-      </w:pPr>
-      <w:r>
-        <w:rPr>
-          <w:rFonts w:ascii="Times New Roman" w:hAnsi="Times New Roman"/>
-          <w:sz w:val="22"/>
-        </w:rPr>
-        <w:t>There are at least four reasons to start here.</w:t>
-      </w:r>
-    </w:p>
-    <w:p>
-      <w:pPr>
-        <w:pStyle w:val="Heading2"/>
-        <w:spacing w:before="160" w:after="80"/>
-      </w:pPr>
-      <w:r>
-        <w:t>5.1 They map directly to real production failure modes</w:t>
-      </w:r>
-    </w:p>
-    <w:p>
-      <w:pPr>
-        <w:spacing w:after="120" w:line="276" w:lineRule="auto"/>
-        <w:ind w:firstLine="360"/>
-        <w:jc w:val="both"/>
-      </w:pPr>
-      <w:r>
-        <w:rPr>
-          <w:rFonts w:ascii="Times New Roman" w:hAnsi="Times New Roman"/>
-          <w:sz w:val="22"/>
-        </w:rPr>
-        <w:t>If your downstream code expects:</w:t>
-      </w:r>
-    </w:p>
-    <w:p>
-      <w:pPr>
-        <w:spacing w:after="0"/>
-        <w:ind w:left="288" w:right="288"/>
-        <w:pBdr>
-          <w:top w:val="single" w:sz="6" w:space="4" w:color="CFCFCF"/>
-          <w:left w:val="single" w:sz="6" w:space="4" w:color="CFCFCF"/>
-          <w:bottom w:val="single" w:sz="6" w:space="4" w:color="CFCFCF"/>
-          <w:right w:val="single" w:sz="6" w:space="4" w:color="CFCFCF"/>
-        </w:pBdr>
-      </w:pPr>
-      <w:r>
-        <w:rPr>
-          <w:rFonts w:ascii="Consolas" w:hAnsi="Consolas"/>
-          <w:color w:val="2C2C2C"/>
-          <w:sz w:val="18"/>
-        </w:rPr>
-        <w:t>{</w:t>
-      </w:r>
-    </w:p>
-    <w:p>
-      <w:pPr>
-        <w:spacing w:after="0"/>
-        <w:ind w:left="288" w:right="288"/>
-        <w:pBdr>
-          <w:top w:val="single" w:sz="6" w:space="4" w:color="CFCFCF"/>
-          <w:left w:val="single" w:sz="6" w:space="4" w:color="CFCFCF"/>
-          <w:bottom w:val="single" w:sz="6" w:space="4" w:color="CFCFCF"/>
-          <w:right w:val="single" w:sz="6" w:space="4" w:color="CFCFCF"/>
-        </w:pBdr>
-      </w:pPr>
-      <w:r>
-        <w:rPr>
-          <w:rFonts w:ascii="Consolas" w:hAnsi="Consolas"/>
-          <w:color w:val="2C2C2C"/>
-          <w:sz w:val="18"/>
-        </w:rPr>
-        <w:t xml:space="preserve">  "lead_name": "...",</w:t>
-      </w:r>
-    </w:p>
-    <w:p>
-      <w:pPr>
-        <w:spacing w:after="0"/>
-        <w:ind w:left="288" w:right="288"/>
-        <w:pBdr>
-          <w:top w:val="single" w:sz="6" w:space="4" w:color="CFCFCF"/>
-          <w:left w:val="single" w:sz="6" w:space="4" w:color="CFCFCF"/>
-          <w:bottom w:val="single" w:sz="6" w:space="4" w:color="CFCFCF"/>
-          <w:right w:val="single" w:sz="6" w:space="4" w:color="CFCFCF"/>
-        </w:pBdr>
-      </w:pPr>
-      <w:r>
-        <w:rPr>
-          <w:rFonts w:ascii="Consolas" w:hAnsi="Consolas"/>
-          <w:color w:val="2C2C2C"/>
-          <w:sz w:val="18"/>
-        </w:rPr>
-        <w:t xml:space="preserve">  "lead_email": "...",</w:t>
-      </w:r>
-    </w:p>
-    <w:p>
-      <w:pPr>
-        <w:spacing w:after="0"/>
-        <w:ind w:left="288" w:right="288"/>
-        <w:pBdr>
-          <w:top w:val="single" w:sz="6" w:space="4" w:color="CFCFCF"/>
-          <w:left w:val="single" w:sz="6" w:space="4" w:color="CFCFCF"/>
-          <w:bottom w:val="single" w:sz="6" w:space="4" w:color="CFCFCF"/>
-          <w:right w:val="single" w:sz="6" w:space="4" w:color="CFCFCF"/>
-        </w:pBdr>
-      </w:pPr>
-      <w:r>
-        <w:rPr>
-          <w:rFonts w:ascii="Consolas" w:hAnsi="Consolas"/>
-          <w:color w:val="2C2C2C"/>
-          <w:sz w:val="18"/>
-        </w:rPr>
-        <w:t xml:space="preserve">  "services": ["website_upgrade"]</w:t>
-      </w:r>
-    </w:p>
-    <w:p>
-      <w:pPr>
-        <w:spacing w:after="0"/>
-        <w:ind w:left="288" w:right="288"/>
-        <w:pBdr>
-          <w:top w:val="single" w:sz="6" w:space="4" w:color="CFCFCF"/>
-          <w:left w:val="single" w:sz="6" w:space="4" w:color="CFCFCF"/>
-          <w:bottom w:val="single" w:sz="6" w:space="4" w:color="CFCFCF"/>
-          <w:right w:val="single" w:sz="6" w:space="4" w:color="CFCFCF"/>
-        </w:pBdr>
-      </w:pPr>
-      <w:r>
-        <w:rPr>
-          <w:rFonts w:ascii="Consolas" w:hAnsi="Consolas"/>
-          <w:color w:val="2C2C2C"/>
-          <w:sz w:val="18"/>
-        </w:rPr>
-        <w:t>}</w:t>
-      </w:r>
-    </w:p>
-    <w:p/>
-    <w:p>
-      <w:pPr>
-        <w:spacing w:after="120" w:line="276" w:lineRule="auto"/>
-        <w:ind w:firstLine="360"/>
-        <w:jc w:val="both"/>
-      </w:pPr>
-      <w:r>
-        <w:rPr>
-          <w:rFonts w:ascii="Times New Roman" w:hAnsi="Times New Roman"/>
-          <w:sz w:val="22"/>
-        </w:rPr>
-        <w:t>then the following are real failures, not cosmetic differences:</w:t>
-      </w:r>
-    </w:p>
-    <w:p>
-      <w:pPr>
-        <w:pStyle w:val="ListBullet"/>
-        <w:spacing w:after="40" w:line="264" w:lineRule="auto"/>
-        <w:jc w:val="both"/>
-      </w:pPr>
-      <w:r>
-        <w:rPr>
-          <w:rFonts w:ascii="Times New Roman" w:hAnsi="Times New Roman"/>
-          <w:sz w:val="21"/>
-        </w:rPr>
-        <w:t>missing lead_email</w:t>
-      </w:r>
-    </w:p>
-    <w:p>
-      <w:pPr>
-        <w:pStyle w:val="ListBullet"/>
-        <w:spacing w:after="40" w:line="264" w:lineRule="auto"/>
-        <w:jc w:val="both"/>
-      </w:pPr>
-      <w:r>
-        <w:rPr>
-          <w:rFonts w:ascii="Times New Roman" w:hAnsi="Times New Roman"/>
-          <w:sz w:val="21"/>
-        </w:rPr>
-        <w:t>services not being a list</w:t>
-      </w:r>
-    </w:p>
-    <w:p>
-      <w:pPr>
-        <w:pStyle w:val="ListBullet"/>
-        <w:spacing w:after="40" w:line="264" w:lineRule="auto"/>
-        <w:jc w:val="both"/>
-      </w:pPr>
-      <w:r>
-        <w:rPr>
-          <w:rFonts w:ascii="Times New Roman" w:hAnsi="Times New Roman"/>
-          <w:sz w:val="21"/>
-        </w:rPr>
-        <w:t>services containing an unsupported label</w:t>
-      </w:r>
-    </w:p>
-    <w:p>
-      <w:pPr>
-        <w:pStyle w:val="ListBullet"/>
-        <w:spacing w:after="40" w:line="264" w:lineRule="auto"/>
-        <w:jc w:val="both"/>
-      </w:pPr>
-      <w:r>
-        <w:rPr>
-          <w:rFonts w:ascii="Times New Roman" w:hAnsi="Times New Roman"/>
-          <w:sz w:val="21"/>
-        </w:rPr>
-        <w:t>prose appearing before the JSON object</w:t>
-      </w:r>
-    </w:p>
-    <w:p>
-      <w:pPr>
-        <w:spacing w:after="120" w:line="276" w:lineRule="auto"/>
-        <w:ind w:firstLine="360"/>
-        <w:jc w:val="both"/>
-      </w:pPr>
-      <w:r>
-        <w:rPr>
-          <w:rFonts w:ascii="Times New Roman" w:hAnsi="Times New Roman"/>
-          <w:sz w:val="22"/>
-        </w:rPr>
-        <w:t>These are precisely the kinds of issues deterministic checks catch well.</w:t>
-      </w:r>
-    </w:p>
-    <w:p>
-      <w:pPr>
-        <w:pStyle w:val="Heading2"/>
-        <w:spacing w:before="160" w:after="80"/>
-      </w:pPr>
-      <w:r>
-        <w:t>5.2 They are cheap to run and easy to explain</w:t>
-      </w:r>
-    </w:p>
-    <w:p>
-      <w:pPr>
-        <w:spacing w:after="120" w:line="276" w:lineRule="auto"/>
-        <w:ind w:firstLine="360"/>
-        <w:jc w:val="both"/>
-      </w:pPr>
-      <w:r>
-        <w:rPr>
-          <w:rFonts w:ascii="Times New Roman" w:hAnsi="Times New Roman"/>
-          <w:sz w:val="22"/>
-        </w:rPr>
-        <w:t>A failed regex, missing key, or disallowed value is easy to understand.</w:t>
-      </w:r>
-    </w:p>
-    <w:p>
-      <w:pPr>
-        <w:spacing w:after="120" w:line="276" w:lineRule="auto"/>
-        <w:ind w:firstLine="360"/>
-        <w:jc w:val="both"/>
-      </w:pPr>
-      <w:r>
-        <w:rPr>
-          <w:rFonts w:ascii="Times New Roman" w:hAnsi="Times New Roman"/>
-          <w:sz w:val="22"/>
-        </w:rPr>
-        <w:t>That matters for adoption. Engineers and product owners are more likely to trust an evaluation system when the failure explanation is concrete:</w:t>
-      </w:r>
-    </w:p>
-    <w:p>
-      <w:pPr>
-        <w:pStyle w:val="ListBullet"/>
-        <w:spacing w:after="40" w:line="264" w:lineRule="auto"/>
-        <w:jc w:val="both"/>
-      </w:pPr>
-      <w:r>
-        <w:rPr>
-          <w:rFonts w:ascii="Times New Roman" w:hAnsi="Times New Roman"/>
-          <w:sz w:val="21"/>
-        </w:rPr>
-        <w:t>Missing keys: ['summary']</w:t>
-      </w:r>
-    </w:p>
-    <w:p>
-      <w:pPr>
-        <w:pStyle w:val="ListBullet"/>
-        <w:spacing w:after="40" w:line="264" w:lineRule="auto"/>
-        <w:jc w:val="both"/>
-      </w:pPr>
-      <w:r>
-        <w:rPr>
-          <w:rFonts w:ascii="Times New Roman" w:hAnsi="Times New Roman"/>
-          <w:sz w:val="21"/>
-        </w:rPr>
-        <w:t>Expected list at 'services', got str</w:t>
-      </w:r>
-    </w:p>
-    <w:p>
-      <w:pPr>
-        <w:pStyle w:val="ListBullet"/>
-        <w:spacing w:after="40" w:line="264" w:lineRule="auto"/>
-        <w:jc w:val="both"/>
-      </w:pPr>
-      <w:r>
-        <w:rPr>
-          <w:rFonts w:ascii="Times New Roman" w:hAnsi="Times New Roman"/>
-          <w:sz w:val="21"/>
-        </w:rPr>
-        <w:t>Disallowed values at 'services': ['SEO']</w:t>
-      </w:r>
-    </w:p>
-    <w:p>
-      <w:pPr>
-        <w:pStyle w:val="Heading2"/>
-        <w:spacing w:before="160" w:after="80"/>
-      </w:pPr>
-      <w:r>
-        <w:t>5.3 They make CI integration natural</w:t>
-      </w:r>
-    </w:p>
-    <w:p>
-      <w:pPr>
-        <w:spacing w:after="120" w:line="276" w:lineRule="auto"/>
-        <w:ind w:firstLine="360"/>
-        <w:jc w:val="both"/>
-      </w:pPr>
-      <w:r>
-        <w:rPr>
-          <w:rFonts w:ascii="Times New Roman" w:hAnsi="Times New Roman"/>
-          <w:sz w:val="22"/>
-        </w:rPr>
-        <w:t>If the question is “did the contract hold?”, then CI can treat the eval like any other test.</w:t>
-      </w:r>
-    </w:p>
-    <w:p>
-      <w:pPr>
-        <w:spacing w:after="120" w:line="276" w:lineRule="auto"/>
-        <w:ind w:firstLine="360"/>
-        <w:jc w:val="both"/>
-      </w:pPr>
-      <w:r>
-        <w:rPr>
-          <w:rFonts w:ascii="Times New Roman" w:hAnsi="Times New Roman"/>
-          <w:sz w:val="22"/>
-        </w:rPr>
-        <w:t>That is exactly how kestrel-evals behaves today:</w:t>
-      </w:r>
-    </w:p>
-    <w:p>
-      <w:pPr>
-        <w:pStyle w:val="ListBullet"/>
-        <w:spacing w:after="40" w:line="264" w:lineRule="auto"/>
-        <w:jc w:val="both"/>
-      </w:pPr>
-      <w:r>
-        <w:rPr>
-          <w:rFonts w:ascii="Times New Roman" w:hAnsi="Times New Roman"/>
-          <w:sz w:val="21"/>
-        </w:rPr>
-        <w:t>run suite</w:t>
-      </w:r>
-    </w:p>
-    <w:p>
-      <w:pPr>
-        <w:pStyle w:val="ListBullet"/>
-        <w:spacing w:after="40" w:line="264" w:lineRule="auto"/>
-        <w:jc w:val="both"/>
-      </w:pPr>
-      <w:r>
-        <w:rPr>
-          <w:rFonts w:ascii="Times New Roman" w:hAnsi="Times New Roman"/>
-          <w:sz w:val="21"/>
-        </w:rPr>
-        <w:t>write report</w:t>
-      </w:r>
-    </w:p>
-    <w:p>
-      <w:pPr>
-        <w:pStyle w:val="ListBullet"/>
-        <w:spacing w:after="40" w:line="264" w:lineRule="auto"/>
-        <w:jc w:val="both"/>
-      </w:pPr>
-      <w:r>
-        <w:rPr>
-          <w:rFonts w:ascii="Times New Roman" w:hAnsi="Times New Roman"/>
-          <w:sz w:val="21"/>
-        </w:rPr>
-        <w:t>exit with code 1 if any case fails</w:t>
-      </w:r>
-    </w:p>
-    <w:p>
-      <w:pPr>
-        <w:spacing w:after="120" w:line="276" w:lineRule="auto"/>
-        <w:ind w:firstLine="360"/>
-        <w:jc w:val="both"/>
-      </w:pPr>
-      <w:r>
-        <w:rPr>
-          <w:rFonts w:ascii="Times New Roman" w:hAnsi="Times New Roman"/>
-          <w:sz w:val="22"/>
-        </w:rPr>
-        <w:t>No orchestration layer is required for the basic loop to be useful.</w:t>
-      </w:r>
-    </w:p>
-    <w:p>
-      <w:pPr>
-        <w:pStyle w:val="Heading2"/>
-        <w:spacing w:before="160" w:after="80"/>
-      </w:pPr>
-      <w:r>
-        <w:t>5.4 They provide a clean foundation for later subjective evaluation</w:t>
-      </w:r>
-    </w:p>
-    <w:p>
-      <w:pPr>
-        <w:spacing w:after="120" w:line="276" w:lineRule="auto"/>
-        <w:ind w:firstLine="360"/>
-        <w:jc w:val="both"/>
-      </w:pPr>
-      <w:r>
-        <w:rPr>
-          <w:rFonts w:ascii="Times New Roman" w:hAnsi="Times New Roman"/>
-          <w:sz w:val="22"/>
-        </w:rPr>
-        <w:t>Rubric scoring and LLM-as-judge can be valuable, but they are more useful once the system is already meeting its hard constraints.</w:t>
-      </w:r>
-    </w:p>
-    <w:p>
-      <w:pPr>
-        <w:spacing w:after="120" w:line="276" w:lineRule="auto"/>
-        <w:ind w:firstLine="360"/>
-        <w:jc w:val="both"/>
-      </w:pPr>
-      <w:r>
-        <w:rPr>
-          <w:rFonts w:ascii="Times New Roman" w:hAnsi="Times New Roman"/>
-          <w:sz w:val="22"/>
-        </w:rPr>
-        <w:t>It is usually a mistake to ask “how good is this answer?” before confirming “did it even produce something structurally valid?”</w:t>
-      </w:r>
-    </w:p>
-    <w:p/>
-    <w:p>
-      <w:pPr>
-        <w:pStyle w:val="Heading1"/>
-        <w:spacing w:before="160" w:after="80"/>
-      </w:pPr>
-      <w:r>
-        <w:t>6. System overview</w:t>
-      </w:r>
-    </w:p>
-    <w:p>
-      <w:pPr>
-        <w:spacing w:after="120" w:line="276" w:lineRule="auto"/>
-        <w:ind w:firstLine="360"/>
-        <w:jc w:val="both"/>
-      </w:pPr>
-      <w:r>
-        <w:rPr>
-          <w:rFonts w:ascii="Times New Roman" w:hAnsi="Times New Roman"/>
-          <w:sz w:val="22"/>
-        </w:rPr>
-        <w:t>At a high level, kestrel-evals has four moving parts:</w:t>
-      </w:r>
-    </w:p>
-    <w:p>
-      <w:pPr>
-        <w:pStyle w:val="ListNumber"/>
-        <w:spacing w:after="40" w:line="264" w:lineRule="auto"/>
-        <w:jc w:val="both"/>
-      </w:pPr>
-      <w:r>
-        <w:rPr>
-          <w:rFonts w:ascii="Times New Roman" w:hAnsi="Times New Roman"/>
-          <w:sz w:val="21"/>
-        </w:rPr>
-        <w:t>Suite definition — YAML file defining cases and checks</w:t>
-      </w:r>
-    </w:p>
-    <w:p>
-      <w:pPr>
-        <w:pStyle w:val="ListNumber"/>
-        <w:spacing w:after="40" w:line="264" w:lineRule="auto"/>
-        <w:jc w:val="both"/>
-      </w:pPr>
-      <w:r>
-        <w:rPr>
-          <w:rFonts w:ascii="Times New Roman" w:hAnsi="Times New Roman"/>
-          <w:sz w:val="21"/>
-        </w:rPr>
-        <w:t>Provider call — a provider class that turns (system, user) into text output</w:t>
-      </w:r>
-    </w:p>
-    <w:p>
-      <w:pPr>
-        <w:pStyle w:val="ListNumber"/>
-        <w:spacing w:after="40" w:line="264" w:lineRule="auto"/>
-        <w:jc w:val="both"/>
-      </w:pPr>
-      <w:r>
-        <w:rPr>
-          <w:rFonts w:ascii="Times New Roman" w:hAnsi="Times New Roman"/>
-          <w:sz w:val="21"/>
-        </w:rPr>
-        <w:t>Check execution — deterministic validation against the raw output and/or parsed JSON</w:t>
-      </w:r>
-    </w:p>
-    <w:p>
-      <w:pPr>
-        <w:pStyle w:val="ListNumber"/>
-        <w:spacing w:after="40" w:line="264" w:lineRule="auto"/>
-        <w:jc w:val="both"/>
-      </w:pPr>
-      <w:r>
-        <w:rPr>
-          <w:rFonts w:ascii="Times New Roman" w:hAnsi="Times New Roman"/>
-          <w:sz w:val="21"/>
-        </w:rPr>
-        <w:t>Reporting + exit behavior — a JSON report plus CI-friendly exit status</w:t>
-      </w:r>
-    </w:p>
-    <w:p>
-      <w:pPr>
-        <w:spacing w:after="120" w:line="276" w:lineRule="auto"/>
-        <w:ind w:firstLine="360"/>
-        <w:jc w:val="both"/>
-      </w:pPr>
-      <w:r>
-        <w:rPr>
-          <w:rFonts w:ascii="Times New Roman" w:hAnsi="Times New Roman"/>
-          <w:sz w:val="22"/>
-        </w:rPr>
-        <w:t>This keeps the architecture small and legible.</w:t>
+        <w:t>The result is a system that is simple enough to act like a normal test runner. The CLI loads a suite, runs it, writes a report, and exits with code 1 if any case fails. That final behavior is what makes the project useful as a gate rather than merely as a reporting utility.</w:t>
       </w:r>
     </w:p>
     <w:p>
@@ -1891,7 +593,7 @@
         <w:spacing w:before="160" w:after="80"/>
       </w:pPr>
       <w:r>
-        <w:t>7. Suite definition model</w:t>
+        <w:t>5. Example case study: structured extraction</w:t>
       </w:r>
     </w:p>
     <w:p>
@@ -1905,7 +607,7 @@
           <w:rFonts w:ascii="Times New Roman" w:hAnsi="Times New Roman"/>
           <w:sz w:val="22"/>
         </w:rPr>
-        <w:t>Suites are authored in YAML.</w:t>
+        <w:t>The included example suite, examples/structured_extraction.yaml, models a common operational problem: extracting a consistent structured payload from messy inbound lead emails. This is a good representative case because it combines several typical LLM failure modes in a compact form. The inputs are semi-structured, some information is missing, wording varies, service names can drift into synonyms, and the downstream system expects a strict JSON payload rather than prose.</w:t>
       </w:r>
     </w:p>
     <w:p>
@@ -1919,49 +621,7 @@
           <w:rFonts w:ascii="Times New Roman" w:hAnsi="Times New Roman"/>
           <w:sz w:val="22"/>
         </w:rPr>
-        <w:t>Each suite defines:</w:t>
-      </w:r>
-    </w:p>
-    <w:p>
-      <w:pPr>
-        <w:pStyle w:val="ListBullet"/>
-        <w:spacing w:after="40" w:line="264" w:lineRule="auto"/>
-        <w:jc w:val="both"/>
-      </w:pPr>
-      <w:r>
-        <w:rPr>
-          <w:rFonts w:ascii="Times New Roman" w:hAnsi="Times New Roman"/>
-          <w:sz w:val="21"/>
-        </w:rPr>
-        <w:t>name</w:t>
-      </w:r>
-    </w:p>
-    <w:p>
-      <w:pPr>
-        <w:pStyle w:val="ListBullet"/>
-        <w:spacing w:after="40" w:line="264" w:lineRule="auto"/>
-        <w:jc w:val="both"/>
-      </w:pPr>
-      <w:r>
-        <w:rPr>
-          <w:rFonts w:ascii="Times New Roman" w:hAnsi="Times New Roman"/>
-          <w:sz w:val="21"/>
-        </w:rPr>
-        <w:t>description</w:t>
-      </w:r>
-    </w:p>
-    <w:p>
-      <w:pPr>
-        <w:pStyle w:val="ListBullet"/>
-        <w:spacing w:after="40" w:line="264" w:lineRule="auto"/>
-        <w:jc w:val="both"/>
-      </w:pPr>
-      <w:r>
-        <w:rPr>
-          <w:rFonts w:ascii="Times New Roman" w:hAnsi="Times New Roman"/>
-          <w:sz w:val="21"/>
-        </w:rPr>
-        <w:t>cases</w:t>
+        <w:t>The contract enforced by the suite is intentionally strict. The output must be raw JSON only, must contain all required top-level fields, must use empty strings for unknown values, must emit services as an array, and must restrict that array to an approved vocabulary. In other words, the suite is not testing whether the model “roughly understood the email.” It is testing whether the model produced something the pipeline could safely trust.</w:t>
       </w:r>
     </w:p>
     <w:p>
@@ -1975,1500 +635,7 @@
           <w:rFonts w:ascii="Times New Roman" w:hAnsi="Times New Roman"/>
           <w:sz w:val="22"/>
         </w:rPr>
-        <w:t>Each case defines:</w:t>
-      </w:r>
-    </w:p>
-    <w:p>
-      <w:pPr>
-        <w:pStyle w:val="ListBullet"/>
-        <w:spacing w:after="40" w:line="264" w:lineRule="auto"/>
-        <w:jc w:val="both"/>
-      </w:pPr>
-      <w:r>
-        <w:rPr>
-          <w:rFonts w:ascii="Times New Roman" w:hAnsi="Times New Roman"/>
-          <w:sz w:val="21"/>
-        </w:rPr>
-        <w:t>id</w:t>
-      </w:r>
-    </w:p>
-    <w:p>
-      <w:pPr>
-        <w:pStyle w:val="ListBullet"/>
-        <w:spacing w:after="40" w:line="264" w:lineRule="auto"/>
-        <w:jc w:val="both"/>
-      </w:pPr>
-      <w:r>
-        <w:rPr>
-          <w:rFonts w:ascii="Times New Roman" w:hAnsi="Times New Roman"/>
-          <w:sz w:val="21"/>
-        </w:rPr>
-        <w:t>prompt.system</w:t>
-      </w:r>
-    </w:p>
-    <w:p>
-      <w:pPr>
-        <w:pStyle w:val="ListBullet"/>
-        <w:spacing w:after="40" w:line="264" w:lineRule="auto"/>
-        <w:jc w:val="both"/>
-      </w:pPr>
-      <w:r>
-        <w:rPr>
-          <w:rFonts w:ascii="Times New Roman" w:hAnsi="Times New Roman"/>
-          <w:sz w:val="21"/>
-        </w:rPr>
-        <w:t>prompt.user</w:t>
-      </w:r>
-    </w:p>
-    <w:p>
-      <w:pPr>
-        <w:pStyle w:val="ListBullet"/>
-        <w:spacing w:after="40" w:line="264" w:lineRule="auto"/>
-        <w:jc w:val="both"/>
-      </w:pPr>
-      <w:r>
-        <w:rPr>
-          <w:rFonts w:ascii="Times New Roman" w:hAnsi="Times New Roman"/>
-          <w:sz w:val="21"/>
-        </w:rPr>
-        <w:t>checks</w:t>
-      </w:r>
-    </w:p>
-    <w:p>
-      <w:pPr>
-        <w:spacing w:after="120" w:line="276" w:lineRule="auto"/>
-        <w:ind w:firstLine="360"/>
-        <w:jc w:val="both"/>
-      </w:pPr>
-      <w:r>
-        <w:rPr>
-          <w:rFonts w:ascii="Times New Roman" w:hAnsi="Times New Roman"/>
-          <w:sz w:val="22"/>
-        </w:rPr>
-        <w:t>That keeps the specification close to the thing being evaluated. The suite file functions as both:</w:t>
-      </w:r>
-    </w:p>
-    <w:p>
-      <w:pPr>
-        <w:pStyle w:val="ListBullet"/>
-        <w:spacing w:after="40" w:line="264" w:lineRule="auto"/>
-        <w:jc w:val="both"/>
-      </w:pPr>
-      <w:r>
-        <w:rPr>
-          <w:rFonts w:ascii="Times New Roman" w:hAnsi="Times New Roman"/>
-          <w:sz w:val="21"/>
-        </w:rPr>
-        <w:t>the test definition</w:t>
-      </w:r>
-    </w:p>
-    <w:p>
-      <w:pPr>
-        <w:pStyle w:val="ListBullet"/>
-        <w:spacing w:after="40" w:line="264" w:lineRule="auto"/>
-        <w:jc w:val="both"/>
-      </w:pPr>
-      <w:r>
-        <w:rPr>
-          <w:rFonts w:ascii="Times New Roman" w:hAnsi="Times New Roman"/>
-          <w:sz w:val="21"/>
-        </w:rPr>
-        <w:t>the documentation of the expected contract</w:t>
-      </w:r>
-    </w:p>
-    <w:p>
-      <w:pPr>
-        <w:spacing w:after="120" w:line="276" w:lineRule="auto"/>
-        <w:ind w:firstLine="360"/>
-        <w:jc w:val="both"/>
-      </w:pPr>
-      <w:r>
-        <w:rPr>
-          <w:rFonts w:ascii="Times New Roman" w:hAnsi="Times New Roman"/>
-          <w:sz w:val="22"/>
-        </w:rPr>
-        <w:t>This is a useful property. The behavior under test is not hidden in scattered assertions or provider-specific glue code.</w:t>
-      </w:r>
-    </w:p>
-    <w:p/>
-    <w:p>
-      <w:pPr>
-        <w:pStyle w:val="Heading1"/>
-        <w:spacing w:before="160" w:after="80"/>
-      </w:pPr>
-      <w:r>
-        <w:t>8. Provider abstraction</w:t>
-      </w:r>
-    </w:p>
-    <w:p>
-      <w:pPr>
-        <w:spacing w:after="120" w:line="276" w:lineRule="auto"/>
-        <w:ind w:firstLine="360"/>
-        <w:jc w:val="both"/>
-      </w:pPr>
-      <w:r>
-        <w:rPr>
-          <w:rFonts w:ascii="Times New Roman" w:hAnsi="Times New Roman"/>
-          <w:sz w:val="22"/>
-        </w:rPr>
-        <w:t>The provider abstraction is intentionally minimal.</w:t>
-      </w:r>
-    </w:p>
-    <w:p>
-      <w:pPr>
-        <w:spacing w:after="120" w:line="276" w:lineRule="auto"/>
-        <w:ind w:firstLine="360"/>
-        <w:jc w:val="both"/>
-      </w:pPr>
-      <w:r>
-        <w:rPr>
-          <w:rFonts w:ascii="Times New Roman" w:hAnsi="Times New Roman"/>
-          <w:sz w:val="22"/>
-        </w:rPr>
-        <w:t>src/kestrel_evals/providers/base.py defines a simple interface:</w:t>
-      </w:r>
-    </w:p>
-    <w:p>
-      <w:pPr>
-        <w:pStyle w:val="ListBullet"/>
-        <w:spacing w:after="40" w:line="264" w:lineRule="auto"/>
-        <w:jc w:val="both"/>
-      </w:pPr>
-      <w:r>
-        <w:rPr>
-          <w:rFonts w:ascii="Times New Roman" w:hAnsi="Times New Roman"/>
-          <w:sz w:val="21"/>
-        </w:rPr>
-        <w:t>generate(model, system, user) -&gt; str</w:t>
-      </w:r>
-    </w:p>
-    <w:p>
-      <w:pPr>
-        <w:spacing w:after="120" w:line="276" w:lineRule="auto"/>
-        <w:ind w:firstLine="360"/>
-        <w:jc w:val="both"/>
-      </w:pPr>
-      <w:r>
-        <w:rPr>
-          <w:rFonts w:ascii="Times New Roman" w:hAnsi="Times New Roman"/>
-          <w:sz w:val="22"/>
-        </w:rPr>
-        <w:t>The current implementation is OpenAIProvider in:</w:t>
-      </w:r>
-    </w:p>
-    <w:p>
-      <w:pPr>
-        <w:pStyle w:val="ListBullet"/>
-        <w:spacing w:after="40" w:line="264" w:lineRule="auto"/>
-        <w:jc w:val="both"/>
-      </w:pPr>
-      <w:r>
-        <w:rPr>
-          <w:rFonts w:ascii="Times New Roman" w:hAnsi="Times New Roman"/>
-          <w:sz w:val="21"/>
-        </w:rPr>
-        <w:t>src/kestrel_evals/providers/openai_provider.py</w:t>
-      </w:r>
-    </w:p>
-    <w:p>
-      <w:pPr>
-        <w:spacing w:after="120" w:line="276" w:lineRule="auto"/>
-        <w:ind w:firstLine="360"/>
-        <w:jc w:val="both"/>
-      </w:pPr>
-      <w:r>
-        <w:rPr>
-          <w:rFonts w:ascii="Times New Roman" w:hAnsi="Times New Roman"/>
-          <w:sz w:val="22"/>
-        </w:rPr>
-        <w:t>This separation does two useful things:</w:t>
-      </w:r>
-    </w:p>
-    <w:p>
-      <w:pPr>
-        <w:pStyle w:val="ListNumber"/>
-        <w:spacing w:after="40" w:line="264" w:lineRule="auto"/>
-        <w:jc w:val="both"/>
-      </w:pPr>
-      <w:r>
-        <w:rPr>
-          <w:rFonts w:ascii="Times New Roman" w:hAnsi="Times New Roman"/>
-          <w:sz w:val="21"/>
-        </w:rPr>
-        <w:t>it keeps eval logic distinct from vendor-specific API code</w:t>
-      </w:r>
-    </w:p>
-    <w:p>
-      <w:pPr>
-        <w:pStyle w:val="ListNumber"/>
-        <w:spacing w:after="40" w:line="264" w:lineRule="auto"/>
-        <w:jc w:val="both"/>
-      </w:pPr>
-      <w:r>
-        <w:rPr>
-          <w:rFonts w:ascii="Times New Roman" w:hAnsi="Times New Roman"/>
-          <w:sz w:val="21"/>
-        </w:rPr>
-        <w:t>it makes it straightforward to add providers later without rewriting suite or runner logic</w:t>
-      </w:r>
-    </w:p>
-    <w:p>
-      <w:pPr>
-        <w:spacing w:after="120" w:line="276" w:lineRule="auto"/>
-        <w:ind w:firstLine="360"/>
-        <w:jc w:val="both"/>
-      </w:pPr>
-      <w:r>
-        <w:rPr>
-          <w:rFonts w:ascii="Times New Roman" w:hAnsi="Times New Roman"/>
-          <w:sz w:val="22"/>
-        </w:rPr>
-        <w:t>The project is not provider-rich yet, but the architecture is already shaped to support that direction.</w:t>
-      </w:r>
-    </w:p>
-    <w:p/>
-    <w:p>
-      <w:pPr>
-        <w:pStyle w:val="Heading1"/>
-        <w:spacing w:before="160" w:after="80"/>
-      </w:pPr>
-      <w:r>
-        <w:t>9. Check model</w:t>
-      </w:r>
-    </w:p>
-    <w:p>
-      <w:pPr>
-        <w:spacing w:after="120" w:line="276" w:lineRule="auto"/>
-        <w:ind w:firstLine="360"/>
-        <w:jc w:val="both"/>
-      </w:pPr>
-      <w:r>
-        <w:rPr>
-          <w:rFonts w:ascii="Times New Roman" w:hAnsi="Times New Roman"/>
-          <w:sz w:val="22"/>
-        </w:rPr>
-        <w:t>The current harness supports a small check vocabulary. That is a strength, not a weakness, because it keeps the system auditable.</w:t>
-      </w:r>
-    </w:p>
-    <w:p>
-      <w:pPr>
-        <w:pStyle w:val="Heading2"/>
-        <w:spacing w:before="160" w:after="80"/>
-      </w:pPr>
-      <w:r>
-        <w:t>9.1 json_schema</w:t>
-      </w:r>
-    </w:p>
-    <w:p>
-      <w:pPr>
-        <w:spacing w:after="120" w:line="276" w:lineRule="auto"/>
-        <w:ind w:firstLine="360"/>
-        <w:jc w:val="both"/>
-      </w:pPr>
-      <w:r>
-        <w:rPr>
-          <w:rFonts w:ascii="Times New Roman" w:hAnsi="Times New Roman"/>
-          <w:sz w:val="22"/>
-        </w:rPr>
-        <w:t>The json_schema support is intentionally limited, but it covers a useful subset:</w:t>
-      </w:r>
-    </w:p>
-    <w:p>
-      <w:pPr>
-        <w:pStyle w:val="ListBullet"/>
-        <w:spacing w:after="40" w:line="264" w:lineRule="auto"/>
-        <w:jc w:val="both"/>
-      </w:pPr>
-      <w:r>
-        <w:rPr>
-          <w:rFonts w:ascii="Times New Roman" w:hAnsi="Times New Roman"/>
-          <w:sz w:val="21"/>
-        </w:rPr>
-        <w:t>object type checking</w:t>
-      </w:r>
-    </w:p>
-    <w:p>
-      <w:pPr>
-        <w:pStyle w:val="ListBullet"/>
-        <w:spacing w:after="40" w:line="264" w:lineRule="auto"/>
-        <w:jc w:val="both"/>
-      </w:pPr>
-      <w:r>
-        <w:rPr>
-          <w:rFonts w:ascii="Times New Roman" w:hAnsi="Times New Roman"/>
-          <w:sz w:val="21"/>
-        </w:rPr>
-        <w:t>required keys</w:t>
-      </w:r>
-    </w:p>
-    <w:p>
-      <w:pPr>
-        <w:pStyle w:val="ListBullet"/>
-        <w:spacing w:after="40" w:line="264" w:lineRule="auto"/>
-        <w:jc w:val="both"/>
-      </w:pPr>
-      <w:r>
-        <w:rPr>
-          <w:rFonts w:ascii="Times New Roman" w:hAnsi="Times New Roman"/>
-          <w:sz w:val="21"/>
-        </w:rPr>
-        <w:t>primitive property type checks</w:t>
-      </w:r>
-    </w:p>
-    <w:p>
-      <w:pPr>
-        <w:spacing w:after="120" w:line="276" w:lineRule="auto"/>
-        <w:ind w:firstLine="360"/>
-        <w:jc w:val="both"/>
-      </w:pPr>
-      <w:r>
-        <w:rPr>
-          <w:rFonts w:ascii="Times New Roman" w:hAnsi="Times New Roman"/>
-          <w:sz w:val="22"/>
-        </w:rPr>
-        <w:t>This is implemented in check_json_schema().</w:t>
-      </w:r>
-    </w:p>
-    <w:p>
-      <w:pPr>
-        <w:spacing w:after="120" w:line="276" w:lineRule="auto"/>
-        <w:ind w:firstLine="360"/>
-        <w:jc w:val="both"/>
-      </w:pPr>
-      <w:r>
-        <w:rPr>
-          <w:rFonts w:ascii="Times New Roman" w:hAnsi="Times New Roman"/>
-          <w:sz w:val="22"/>
-        </w:rPr>
-        <w:t>It is not meant to compete with the full jsonschema library. It is meant to be sufficient for common contract enforcement without increasing dependency surface too early.</w:t>
-      </w:r>
-    </w:p>
-    <w:p>
-      <w:pPr>
-        <w:pStyle w:val="Heading2"/>
-        <w:spacing w:before="160" w:after="80"/>
-      </w:pPr>
-      <w:r>
-        <w:t>9.2 allowed_values</w:t>
-      </w:r>
-    </w:p>
-    <w:p>
-      <w:pPr>
-        <w:spacing w:after="120" w:line="276" w:lineRule="auto"/>
-        <w:ind w:firstLine="360"/>
-        <w:jc w:val="both"/>
-      </w:pPr>
-      <w:r>
-        <w:rPr>
-          <w:rFonts w:ascii="Times New Roman" w:hAnsi="Times New Roman"/>
-          <w:sz w:val="22"/>
-        </w:rPr>
-        <w:t>This check verifies that a path like services resolves to a list, and that every item in that list belongs to an allowed vocabulary.</w:t>
-      </w:r>
-    </w:p>
-    <w:p>
-      <w:pPr>
-        <w:spacing w:after="120" w:line="276" w:lineRule="auto"/>
-        <w:ind w:firstLine="360"/>
-        <w:jc w:val="both"/>
-      </w:pPr>
-      <w:r>
-        <w:rPr>
-          <w:rFonts w:ascii="Times New Roman" w:hAnsi="Times New Roman"/>
-          <w:sz w:val="22"/>
-        </w:rPr>
-        <w:t>This is especially useful for:</w:t>
-      </w:r>
-    </w:p>
-    <w:p>
-      <w:pPr>
-        <w:pStyle w:val="ListBullet"/>
-        <w:spacing w:after="40" w:line="264" w:lineRule="auto"/>
-        <w:jc w:val="both"/>
-      </w:pPr>
-      <w:r>
-        <w:rPr>
-          <w:rFonts w:ascii="Times New Roman" w:hAnsi="Times New Roman"/>
-          <w:sz w:val="21"/>
-        </w:rPr>
-        <w:t>service routing</w:t>
-      </w:r>
-    </w:p>
-    <w:p>
-      <w:pPr>
-        <w:pStyle w:val="ListBullet"/>
-        <w:spacing w:after="40" w:line="264" w:lineRule="auto"/>
-        <w:jc w:val="both"/>
-      </w:pPr>
-      <w:r>
-        <w:rPr>
-          <w:rFonts w:ascii="Times New Roman" w:hAnsi="Times New Roman"/>
-          <w:sz w:val="21"/>
-        </w:rPr>
-        <w:t>intent labels</w:t>
-      </w:r>
-    </w:p>
-    <w:p>
-      <w:pPr>
-        <w:pStyle w:val="ListBullet"/>
-        <w:spacing w:after="40" w:line="264" w:lineRule="auto"/>
-        <w:jc w:val="both"/>
-      </w:pPr>
-      <w:r>
-        <w:rPr>
-          <w:rFonts w:ascii="Times New Roman" w:hAnsi="Times New Roman"/>
-          <w:sz w:val="21"/>
-        </w:rPr>
-        <w:t>taxonomy classification</w:t>
-      </w:r>
-    </w:p>
-    <w:p>
-      <w:pPr>
-        <w:pStyle w:val="ListBullet"/>
-        <w:spacing w:after="40" w:line="264" w:lineRule="auto"/>
-        <w:jc w:val="both"/>
-      </w:pPr>
-      <w:r>
-        <w:rPr>
-          <w:rFonts w:ascii="Times New Roman" w:hAnsi="Times New Roman"/>
-          <w:sz w:val="21"/>
-        </w:rPr>
-        <w:t>any output where downstream code expects a controlled set of values</w:t>
-      </w:r>
-    </w:p>
-    <w:p>
-      <w:pPr>
-        <w:pStyle w:val="Heading2"/>
-        <w:spacing w:before="160" w:after="80"/>
-      </w:pPr>
-      <w:r>
-        <w:t>9.3 regex</w:t>
-      </w:r>
-    </w:p>
-    <w:p>
-      <w:pPr>
-        <w:spacing w:after="120" w:line="276" w:lineRule="auto"/>
-        <w:ind w:firstLine="360"/>
-        <w:jc w:val="both"/>
-      </w:pPr>
-      <w:r>
-        <w:rPr>
-          <w:rFonts w:ascii="Times New Roman" w:hAnsi="Times New Roman"/>
-          <w:sz w:val="22"/>
-        </w:rPr>
-        <w:t>A regex check operates on raw output text.</w:t>
-      </w:r>
-    </w:p>
-    <w:p>
-      <w:pPr>
-        <w:spacing w:after="120" w:line="276" w:lineRule="auto"/>
-        <w:ind w:firstLine="360"/>
-        <w:jc w:val="both"/>
-      </w:pPr>
-      <w:r>
-        <w:rPr>
-          <w:rFonts w:ascii="Times New Roman" w:hAnsi="Times New Roman"/>
-          <w:sz w:val="22"/>
-        </w:rPr>
-        <w:t>This is useful for lightweight assertions such as:</w:t>
-      </w:r>
-    </w:p>
-    <w:p>
-      <w:pPr>
-        <w:pStyle w:val="ListBullet"/>
-        <w:spacing w:after="40" w:line="264" w:lineRule="auto"/>
-        <w:jc w:val="both"/>
-      </w:pPr>
-      <w:r>
-        <w:rPr>
-          <w:rFonts w:ascii="Times New Roman" w:hAnsi="Times New Roman"/>
-          <w:sz w:val="21"/>
-        </w:rPr>
-        <w:t>confirming an email-shaped string is present</w:t>
-      </w:r>
-    </w:p>
-    <w:p>
-      <w:pPr>
-        <w:pStyle w:val="ListBullet"/>
-        <w:spacing w:after="40" w:line="264" w:lineRule="auto"/>
-        <w:jc w:val="both"/>
-      </w:pPr>
-      <w:r>
-        <w:rPr>
-          <w:rFonts w:ascii="Times New Roman" w:hAnsi="Times New Roman"/>
-          <w:sz w:val="21"/>
-        </w:rPr>
-        <w:t>confirming a sentinel or formatting pattern appears</w:t>
-      </w:r>
-    </w:p>
-    <w:p>
-      <w:pPr>
-        <w:pStyle w:val="ListBullet"/>
-        <w:spacing w:after="40" w:line="264" w:lineRule="auto"/>
-        <w:jc w:val="both"/>
-      </w:pPr>
-      <w:r>
-        <w:rPr>
-          <w:rFonts w:ascii="Times New Roman" w:hAnsi="Times New Roman"/>
-          <w:sz w:val="21"/>
-        </w:rPr>
-        <w:t>validating a lightweight content constraint without writing another parser</w:t>
-      </w:r>
-    </w:p>
-    <w:p/>
-    <w:p>
-      <w:pPr>
-        <w:pStyle w:val="Heading1"/>
-        <w:spacing w:before="160" w:after="80"/>
-      </w:pPr>
-      <w:r>
-        <w:t>10. Runner behavior</w:t>
-      </w:r>
-    </w:p>
-    <w:p>
-      <w:pPr>
-        <w:spacing w:after="120" w:line="276" w:lineRule="auto"/>
-        <w:ind w:firstLine="360"/>
-        <w:jc w:val="both"/>
-      </w:pPr>
-      <w:r>
-        <w:rPr>
-          <w:rFonts w:ascii="Times New Roman" w:hAnsi="Times New Roman"/>
-          <w:sz w:val="22"/>
-        </w:rPr>
-        <w:t>The runner (src/kestrel_evals/runner.py) executes each case in sequence.</w:t>
-      </w:r>
-    </w:p>
-    <w:p>
-      <w:pPr>
-        <w:spacing w:after="120" w:line="276" w:lineRule="auto"/>
-        <w:ind w:firstLine="360"/>
-        <w:jc w:val="both"/>
-      </w:pPr>
-      <w:r>
-        <w:rPr>
-          <w:rFonts w:ascii="Times New Roman" w:hAnsi="Times New Roman"/>
-          <w:sz w:val="22"/>
-        </w:rPr>
-        <w:t>For each case it:</w:t>
-      </w:r>
-    </w:p>
-    <w:p>
-      <w:pPr>
-        <w:pStyle w:val="ListNumber"/>
-        <w:spacing w:after="40" w:line="264" w:lineRule="auto"/>
-        <w:jc w:val="both"/>
-      </w:pPr>
-      <w:r>
-        <w:rPr>
-          <w:rFonts w:ascii="Times New Roman" w:hAnsi="Times New Roman"/>
-          <w:sz w:val="21"/>
-        </w:rPr>
-        <w:t>calls the provider</w:t>
-      </w:r>
-    </w:p>
-    <w:p>
-      <w:pPr>
-        <w:pStyle w:val="ListNumber"/>
-        <w:spacing w:after="40" w:line="264" w:lineRule="auto"/>
-        <w:jc w:val="both"/>
-      </w:pPr>
-      <w:r>
-        <w:rPr>
-          <w:rFonts w:ascii="Times New Roman" w:hAnsi="Times New Roman"/>
-          <w:sz w:val="21"/>
-        </w:rPr>
-        <w:t>captures raw output_text</w:t>
-      </w:r>
-    </w:p>
-    <w:p>
-      <w:pPr>
-        <w:pStyle w:val="ListNumber"/>
-        <w:spacing w:after="40" w:line="264" w:lineRule="auto"/>
-        <w:jc w:val="both"/>
-      </w:pPr>
-      <w:r>
-        <w:rPr>
-          <w:rFonts w:ascii="Times New Roman" w:hAnsi="Times New Roman"/>
-          <w:sz w:val="21"/>
-        </w:rPr>
-        <w:t>runs the configured checks</w:t>
-      </w:r>
-    </w:p>
-    <w:p>
-      <w:pPr>
-        <w:pStyle w:val="ListNumber"/>
-        <w:spacing w:after="40" w:line="264" w:lineRule="auto"/>
-        <w:jc w:val="both"/>
-      </w:pPr>
-      <w:r>
-        <w:rPr>
-          <w:rFonts w:ascii="Times New Roman" w:hAnsi="Times New Roman"/>
-          <w:sz w:val="21"/>
-        </w:rPr>
-        <w:t>records per-check pass/fail detail</w:t>
-      </w:r>
-    </w:p>
-    <w:p>
-      <w:pPr>
-        <w:pStyle w:val="ListNumber"/>
-        <w:spacing w:after="40" w:line="264" w:lineRule="auto"/>
-        <w:jc w:val="both"/>
-      </w:pPr>
-      <w:r>
-        <w:rPr>
-          <w:rFonts w:ascii="Times New Roman" w:hAnsi="Times New Roman"/>
-          <w:sz w:val="21"/>
-        </w:rPr>
-        <w:t>accumulates a suite-level summary</w:t>
-      </w:r>
-    </w:p>
-    <w:p>
-      <w:pPr>
-        <w:spacing w:after="120" w:line="276" w:lineRule="auto"/>
-        <w:ind w:firstLine="360"/>
-        <w:jc w:val="both"/>
-      </w:pPr>
-      <w:r>
-        <w:rPr>
-          <w:rFonts w:ascii="Times New Roman" w:hAnsi="Times New Roman"/>
-          <w:sz w:val="22"/>
-        </w:rPr>
-        <w:t>The resulting report includes:</w:t>
-      </w:r>
-    </w:p>
-    <w:p>
-      <w:pPr>
-        <w:pStyle w:val="ListBullet"/>
-        <w:spacing w:after="40" w:line="264" w:lineRule="auto"/>
-        <w:jc w:val="both"/>
-      </w:pPr>
-      <w:r>
-        <w:rPr>
-          <w:rFonts w:ascii="Times New Roman" w:hAnsi="Times New Roman"/>
-          <w:sz w:val="21"/>
-        </w:rPr>
-        <w:t>suite metadata</w:t>
-      </w:r>
-    </w:p>
-    <w:p>
-      <w:pPr>
-        <w:pStyle w:val="ListBullet"/>
-        <w:spacing w:after="40" w:line="264" w:lineRule="auto"/>
-        <w:jc w:val="both"/>
-      </w:pPr>
-      <w:r>
-        <w:rPr>
-          <w:rFonts w:ascii="Times New Roman" w:hAnsi="Times New Roman"/>
-          <w:sz w:val="21"/>
-        </w:rPr>
-        <w:t>model used</w:t>
-      </w:r>
-    </w:p>
-    <w:p>
-      <w:pPr>
-        <w:pStyle w:val="ListBullet"/>
-        <w:spacing w:after="40" w:line="264" w:lineRule="auto"/>
-        <w:jc w:val="both"/>
-      </w:pPr>
-      <w:r>
-        <w:rPr>
-          <w:rFonts w:ascii="Times New Roman" w:hAnsi="Times New Roman"/>
-          <w:sz w:val="21"/>
-        </w:rPr>
-        <w:t>total / passed / failed counts</w:t>
-      </w:r>
-    </w:p>
-    <w:p>
-      <w:pPr>
-        <w:pStyle w:val="ListBullet"/>
-        <w:spacing w:after="40" w:line="264" w:lineRule="auto"/>
-        <w:jc w:val="both"/>
-      </w:pPr>
-      <w:r>
-        <w:rPr>
-          <w:rFonts w:ascii="Times New Roman" w:hAnsi="Times New Roman"/>
-          <w:sz w:val="21"/>
-        </w:rPr>
-        <w:t>per-case outputs</w:t>
-      </w:r>
-    </w:p>
-    <w:p>
-      <w:pPr>
-        <w:pStyle w:val="ListBullet"/>
-        <w:spacing w:after="40" w:line="264" w:lineRule="auto"/>
-        <w:jc w:val="both"/>
-      </w:pPr>
-      <w:r>
-        <w:rPr>
-          <w:rFonts w:ascii="Times New Roman" w:hAnsi="Times New Roman"/>
-          <w:sz w:val="21"/>
-        </w:rPr>
-        <w:t>per-check results</w:t>
-      </w:r>
-    </w:p>
-    <w:p>
-      <w:pPr>
-        <w:spacing w:after="120" w:line="276" w:lineRule="auto"/>
-        <w:ind w:firstLine="360"/>
-        <w:jc w:val="both"/>
-      </w:pPr>
-      <w:r>
-        <w:rPr>
-          <w:rFonts w:ascii="Times New Roman" w:hAnsi="Times New Roman"/>
-          <w:sz w:val="22"/>
-        </w:rPr>
-        <w:t>The format is intentionally plain JSON so it is easy to:</w:t>
-      </w:r>
-    </w:p>
-    <w:p>
-      <w:pPr>
-        <w:pStyle w:val="ListBullet"/>
-        <w:spacing w:after="40" w:line="264" w:lineRule="auto"/>
-        <w:jc w:val="both"/>
-      </w:pPr>
-      <w:r>
-        <w:rPr>
-          <w:rFonts w:ascii="Times New Roman" w:hAnsi="Times New Roman"/>
-          <w:sz w:val="21"/>
-        </w:rPr>
-        <w:t>inspect manually</w:t>
-      </w:r>
-    </w:p>
-    <w:p>
-      <w:pPr>
-        <w:pStyle w:val="ListBullet"/>
-        <w:spacing w:after="40" w:line="264" w:lineRule="auto"/>
-        <w:jc w:val="both"/>
-      </w:pPr>
-      <w:r>
-        <w:rPr>
-          <w:rFonts w:ascii="Times New Roman" w:hAnsi="Times New Roman"/>
-          <w:sz w:val="21"/>
-        </w:rPr>
-        <w:t>upload as a CI artifact</w:t>
-      </w:r>
-    </w:p>
-    <w:p>
-      <w:pPr>
-        <w:pStyle w:val="ListBullet"/>
-        <w:spacing w:after="40" w:line="264" w:lineRule="auto"/>
-        <w:jc w:val="both"/>
-      </w:pPr>
-      <w:r>
-        <w:rPr>
-          <w:rFonts w:ascii="Times New Roman" w:hAnsi="Times New Roman"/>
-          <w:sz w:val="21"/>
-        </w:rPr>
-        <w:t>transform later into HTML or Markdown if desired</w:t>
-      </w:r>
-    </w:p>
-    <w:p/>
-    <w:p>
-      <w:pPr>
-        <w:pStyle w:val="Heading1"/>
-        <w:spacing w:before="160" w:after="80"/>
-      </w:pPr>
-      <w:r>
-        <w:t>11. CLI and CI behavior</w:t>
-      </w:r>
-    </w:p>
-    <w:p>
-      <w:pPr>
-        <w:spacing w:after="120" w:line="276" w:lineRule="auto"/>
-        <w:ind w:firstLine="360"/>
-        <w:jc w:val="both"/>
-      </w:pPr>
-      <w:r>
-        <w:rPr>
-          <w:rFonts w:ascii="Times New Roman" w:hAnsi="Times New Roman"/>
-          <w:sz w:val="22"/>
-        </w:rPr>
-        <w:t>The CLI is defined in src/kestrel_evals/cli.py.</w:t>
-      </w:r>
-    </w:p>
-    <w:p>
-      <w:pPr>
-        <w:spacing w:after="120" w:line="276" w:lineRule="auto"/>
-        <w:ind w:firstLine="360"/>
-        <w:jc w:val="both"/>
-      </w:pPr>
-      <w:r>
-        <w:rPr>
-          <w:rFonts w:ascii="Times New Roman" w:hAnsi="Times New Roman"/>
-          <w:sz w:val="22"/>
-        </w:rPr>
-        <w:t>Current behavior:</w:t>
-      </w:r>
-    </w:p>
-    <w:p>
-      <w:pPr>
-        <w:pStyle w:val="ListBullet"/>
-        <w:spacing w:after="40" w:line="264" w:lineRule="auto"/>
-        <w:jc w:val="both"/>
-      </w:pPr>
-      <w:r>
-        <w:rPr>
-          <w:rFonts w:ascii="Times New Roman" w:hAnsi="Times New Roman"/>
-          <w:sz w:val="21"/>
-        </w:rPr>
-        <w:t>load suite</w:t>
-      </w:r>
-    </w:p>
-    <w:p>
-      <w:pPr>
-        <w:pStyle w:val="ListBullet"/>
-        <w:spacing w:after="40" w:line="264" w:lineRule="auto"/>
-        <w:jc w:val="both"/>
-      </w:pPr>
-      <w:r>
-        <w:rPr>
-          <w:rFonts w:ascii="Times New Roman" w:hAnsi="Times New Roman"/>
-          <w:sz w:val="21"/>
-        </w:rPr>
-        <w:t>run suite</w:t>
-      </w:r>
-    </w:p>
-    <w:p>
-      <w:pPr>
-        <w:pStyle w:val="ListBullet"/>
-        <w:spacing w:after="40" w:line="264" w:lineRule="auto"/>
-        <w:jc w:val="both"/>
-      </w:pPr>
-      <w:r>
-        <w:rPr>
-          <w:rFonts w:ascii="Times New Roman" w:hAnsi="Times New Roman"/>
-          <w:sz w:val="21"/>
-        </w:rPr>
-        <w:t>write JSON report to stdout or a file</w:t>
-      </w:r>
-    </w:p>
-    <w:p>
-      <w:pPr>
-        <w:pStyle w:val="ListBullet"/>
-        <w:spacing w:after="40" w:line="264" w:lineRule="auto"/>
-        <w:jc w:val="both"/>
-      </w:pPr>
-      <w:r>
-        <w:rPr>
-          <w:rFonts w:ascii="Times New Roman" w:hAnsi="Times New Roman"/>
-          <w:sz w:val="21"/>
-        </w:rPr>
-        <w:t>exit non-zero if any case fails</w:t>
-      </w:r>
-    </w:p>
-    <w:p>
-      <w:pPr>
-        <w:spacing w:after="120" w:line="276" w:lineRule="auto"/>
-        <w:ind w:firstLine="360"/>
-        <w:jc w:val="both"/>
-      </w:pPr>
-      <w:r>
-        <w:rPr>
-          <w:rFonts w:ascii="Times New Roman" w:hAnsi="Times New Roman"/>
-          <w:sz w:val="22"/>
-        </w:rPr>
-        <w:t>That final point is what makes the project useful as a gate rather than just a reporting tool.</w:t>
-      </w:r>
-    </w:p>
-    <w:p>
-      <w:pPr>
-        <w:pStyle w:val="Heading2"/>
-        <w:spacing w:before="160" w:after="80"/>
-      </w:pPr>
-      <w:r>
-        <w:t>Example local run</w:t>
-      </w:r>
-    </w:p>
-    <w:p>
-      <w:pPr>
-        <w:spacing w:after="0"/>
-        <w:ind w:left="288" w:right="288"/>
-        <w:pBdr>
-          <w:top w:val="single" w:sz="6" w:space="4" w:color="CFCFCF"/>
-          <w:left w:val="single" w:sz="6" w:space="4" w:color="CFCFCF"/>
-          <w:bottom w:val="single" w:sz="6" w:space="4" w:color="CFCFCF"/>
-          <w:right w:val="single" w:sz="6" w:space="4" w:color="CFCFCF"/>
-        </w:pBdr>
-      </w:pPr>
-      <w:r>
-        <w:rPr>
-          <w:rFonts w:ascii="Consolas" w:hAnsi="Consolas"/>
-          <w:color w:val="2C2C2C"/>
-          <w:sz w:val="18"/>
-        </w:rPr>
-        <w:t>cd KestrelLabs/kestrel-evals</w:t>
-      </w:r>
-    </w:p>
-    <w:p>
-      <w:pPr>
-        <w:spacing w:after="0"/>
-        <w:ind w:left="288" w:right="288"/>
-        <w:pBdr>
-          <w:top w:val="single" w:sz="6" w:space="4" w:color="CFCFCF"/>
-          <w:left w:val="single" w:sz="6" w:space="4" w:color="CFCFCF"/>
-          <w:bottom w:val="single" w:sz="6" w:space="4" w:color="CFCFCF"/>
-          <w:right w:val="single" w:sz="6" w:space="4" w:color="CFCFCF"/>
-        </w:pBdr>
-      </w:pPr>
-      <w:r>
-        <w:rPr>
-          <w:rFonts w:ascii="Consolas" w:hAnsi="Consolas"/>
-          <w:color w:val="2C2C2C"/>
-          <w:sz w:val="18"/>
-        </w:rPr>
-        <w:t>python -m venv .venv</w:t>
-      </w:r>
-    </w:p>
-    <w:p>
-      <w:pPr>
-        <w:spacing w:after="0"/>
-        <w:ind w:left="288" w:right="288"/>
-        <w:pBdr>
-          <w:top w:val="single" w:sz="6" w:space="4" w:color="CFCFCF"/>
-          <w:left w:val="single" w:sz="6" w:space="4" w:color="CFCFCF"/>
-          <w:bottom w:val="single" w:sz="6" w:space="4" w:color="CFCFCF"/>
-          <w:right w:val="single" w:sz="6" w:space="4" w:color="CFCFCF"/>
-        </w:pBdr>
-      </w:pPr>
-      <w:r>
-        <w:rPr>
-          <w:rFonts w:ascii="Consolas" w:hAnsi="Consolas"/>
-          <w:color w:val="2C2C2C"/>
-          <w:sz w:val="18"/>
-        </w:rPr>
-        <w:t>source .venv/bin/activate</w:t>
-      </w:r>
-    </w:p>
-    <w:p>
-      <w:pPr>
-        <w:spacing w:after="0"/>
-        <w:ind w:left="288" w:right="288"/>
-        <w:pBdr>
-          <w:top w:val="single" w:sz="6" w:space="4" w:color="CFCFCF"/>
-          <w:left w:val="single" w:sz="6" w:space="4" w:color="CFCFCF"/>
-          <w:bottom w:val="single" w:sz="6" w:space="4" w:color="CFCFCF"/>
-          <w:right w:val="single" w:sz="6" w:space="4" w:color="CFCFCF"/>
-        </w:pBdr>
-      </w:pPr>
-      <w:r>
-        <w:rPr>
-          <w:rFonts w:ascii="Consolas" w:hAnsi="Consolas"/>
-          <w:color w:val="2C2C2C"/>
-          <w:sz w:val="18"/>
-        </w:rPr>
-        <w:t>pip install -e .</w:t>
-      </w:r>
-    </w:p>
-    <w:p>
-      <w:pPr>
-        <w:spacing w:after="0"/>
-        <w:ind w:left="288" w:right="288"/>
-        <w:pBdr>
-          <w:top w:val="single" w:sz="6" w:space="4" w:color="CFCFCF"/>
-          <w:left w:val="single" w:sz="6" w:space="4" w:color="CFCFCF"/>
-          <w:bottom w:val="single" w:sz="6" w:space="4" w:color="CFCFCF"/>
-          <w:right w:val="single" w:sz="6" w:space="4" w:color="CFCFCF"/>
-        </w:pBdr>
-      </w:pPr>
-      <w:r>
-        <w:rPr>
-          <w:rFonts w:ascii="Consolas" w:hAnsi="Consolas"/>
-          <w:color w:val="2C2C2C"/>
-          <w:sz w:val="18"/>
-        </w:rPr>
-      </w:r>
-    </w:p>
-    <w:p>
-      <w:pPr>
-        <w:spacing w:after="0"/>
-        <w:ind w:left="288" w:right="288"/>
-        <w:pBdr>
-          <w:top w:val="single" w:sz="6" w:space="4" w:color="CFCFCF"/>
-          <w:left w:val="single" w:sz="6" w:space="4" w:color="CFCFCF"/>
-          <w:bottom w:val="single" w:sz="6" w:space="4" w:color="CFCFCF"/>
-          <w:right w:val="single" w:sz="6" w:space="4" w:color="CFCFCF"/>
-        </w:pBdr>
-      </w:pPr>
-      <w:r>
-        <w:rPr>
-          <w:rFonts w:ascii="Consolas" w:hAnsi="Consolas"/>
-          <w:color w:val="2C2C2C"/>
-          <w:sz w:val="18"/>
-        </w:rPr>
-        <w:t>export OPENAI_API_KEY=...</w:t>
-      </w:r>
-    </w:p>
-    <w:p>
-      <w:pPr>
-        <w:spacing w:after="0"/>
-        <w:ind w:left="288" w:right="288"/>
-        <w:pBdr>
-          <w:top w:val="single" w:sz="6" w:space="4" w:color="CFCFCF"/>
-          <w:left w:val="single" w:sz="6" w:space="4" w:color="CFCFCF"/>
-          <w:bottom w:val="single" w:sz="6" w:space="4" w:color="CFCFCF"/>
-          <w:right w:val="single" w:sz="6" w:space="4" w:color="CFCFCF"/>
-        </w:pBdr>
-      </w:pPr>
-      <w:r>
-        <w:rPr>
-          <w:rFonts w:ascii="Consolas" w:hAnsi="Consolas"/>
-          <w:color w:val="2C2C2C"/>
-          <w:sz w:val="18"/>
-        </w:rPr>
-      </w:r>
-    </w:p>
-    <w:p>
-      <w:pPr>
-        <w:spacing w:after="0"/>
-        <w:ind w:left="288" w:right="288"/>
-        <w:pBdr>
-          <w:top w:val="single" w:sz="6" w:space="4" w:color="CFCFCF"/>
-          <w:left w:val="single" w:sz="6" w:space="4" w:color="CFCFCF"/>
-          <w:bottom w:val="single" w:sz="6" w:space="4" w:color="CFCFCF"/>
-          <w:right w:val="single" w:sz="6" w:space="4" w:color="CFCFCF"/>
-        </w:pBdr>
-      </w:pPr>
-      <w:r>
-        <w:rPr>
-          <w:rFonts w:ascii="Consolas" w:hAnsi="Consolas"/>
-          <w:color w:val="2C2C2C"/>
-          <w:sz w:val="18"/>
-        </w:rPr>
-        <w:t>kestrel-evals run examples/structured_extraction.yaml \</w:t>
-      </w:r>
-    </w:p>
-    <w:p>
-      <w:pPr>
-        <w:spacing w:after="0"/>
-        <w:ind w:left="288" w:right="288"/>
-        <w:pBdr>
-          <w:top w:val="single" w:sz="6" w:space="4" w:color="CFCFCF"/>
-          <w:left w:val="single" w:sz="6" w:space="4" w:color="CFCFCF"/>
-          <w:bottom w:val="single" w:sz="6" w:space="4" w:color="CFCFCF"/>
-          <w:right w:val="single" w:sz="6" w:space="4" w:color="CFCFCF"/>
-        </w:pBdr>
-      </w:pPr>
-      <w:r>
-        <w:rPr>
-          <w:rFonts w:ascii="Consolas" w:hAnsi="Consolas"/>
-          <w:color w:val="2C2C2C"/>
-          <w:sz w:val="18"/>
-        </w:rPr>
-        <w:t xml:space="preserve">  --model gpt-4.1-mini \</w:t>
-      </w:r>
-    </w:p>
-    <w:p>
-      <w:pPr>
-        <w:spacing w:after="0"/>
-        <w:ind w:left="288" w:right="288"/>
-        <w:pBdr>
-          <w:top w:val="single" w:sz="6" w:space="4" w:color="CFCFCF"/>
-          <w:left w:val="single" w:sz="6" w:space="4" w:color="CFCFCF"/>
-          <w:bottom w:val="single" w:sz="6" w:space="4" w:color="CFCFCF"/>
-          <w:right w:val="single" w:sz="6" w:space="4" w:color="CFCFCF"/>
-        </w:pBdr>
-      </w:pPr>
-      <w:r>
-        <w:rPr>
-          <w:rFonts w:ascii="Consolas" w:hAnsi="Consolas"/>
-          <w:color w:val="2C2C2C"/>
-          <w:sz w:val="18"/>
-        </w:rPr>
-        <w:t xml:space="preserve">  --out reports/report.json</w:t>
-      </w:r>
-    </w:p>
-    <w:p/>
-    <w:p>
-      <w:pPr>
-        <w:pStyle w:val="Heading2"/>
-        <w:spacing w:before="160" w:after="80"/>
-      </w:pPr>
-      <w:r>
-        <w:t>Current CI workflow</w:t>
-      </w:r>
-    </w:p>
-    <w:p>
-      <w:pPr>
-        <w:spacing w:after="120" w:line="276" w:lineRule="auto"/>
-        <w:ind w:firstLine="360"/>
-        <w:jc w:val="both"/>
-      </w:pPr>
-      <w:r>
-        <w:rPr>
-          <w:rFonts w:ascii="Times New Roman" w:hAnsi="Times New Roman"/>
-          <w:sz w:val="22"/>
-        </w:rPr>
-        <w:t>A minimal GitHub Actions workflow lives at:</w:t>
-      </w:r>
-    </w:p>
-    <w:p>
-      <w:pPr>
-        <w:pStyle w:val="ListBullet"/>
-        <w:spacing w:after="40" w:line="264" w:lineRule="auto"/>
-        <w:jc w:val="both"/>
-      </w:pPr>
-      <w:r>
-        <w:rPr>
-          <w:rFonts w:ascii="Times New Roman" w:hAnsi="Times New Roman"/>
-          <w:sz w:val="21"/>
-        </w:rPr>
-        <w:t>.github/workflows/evals.yml</w:t>
-      </w:r>
-    </w:p>
-    <w:p>
-      <w:pPr>
-        <w:spacing w:after="120" w:line="276" w:lineRule="auto"/>
-        <w:ind w:firstLine="360"/>
-        <w:jc w:val="both"/>
-      </w:pPr>
-      <w:r>
-        <w:rPr>
-          <w:rFonts w:ascii="Times New Roman" w:hAnsi="Times New Roman"/>
-          <w:sz w:val="22"/>
-        </w:rPr>
-        <w:t>It:</w:t>
-      </w:r>
-    </w:p>
-    <w:p>
-      <w:pPr>
-        <w:pStyle w:val="ListBullet"/>
-        <w:spacing w:after="40" w:line="264" w:lineRule="auto"/>
-        <w:jc w:val="both"/>
-      </w:pPr>
-      <w:r>
-        <w:rPr>
-          <w:rFonts w:ascii="Times New Roman" w:hAnsi="Times New Roman"/>
-          <w:sz w:val="21"/>
-        </w:rPr>
-        <w:t>checks out the repo</w:t>
-      </w:r>
-    </w:p>
-    <w:p>
-      <w:pPr>
-        <w:pStyle w:val="ListBullet"/>
-        <w:spacing w:after="40" w:line="264" w:lineRule="auto"/>
-        <w:jc w:val="both"/>
-      </w:pPr>
-      <w:r>
-        <w:rPr>
-          <w:rFonts w:ascii="Times New Roman" w:hAnsi="Times New Roman"/>
-          <w:sz w:val="21"/>
-        </w:rPr>
-        <w:t>sets up Python</w:t>
-      </w:r>
-    </w:p>
-    <w:p>
-      <w:pPr>
-        <w:pStyle w:val="ListBullet"/>
-        <w:spacing w:after="40" w:line="264" w:lineRule="auto"/>
-        <w:jc w:val="both"/>
-      </w:pPr>
-      <w:r>
-        <w:rPr>
-          <w:rFonts w:ascii="Times New Roman" w:hAnsi="Times New Roman"/>
-          <w:sz w:val="21"/>
-        </w:rPr>
-        <w:t>installs the package</w:t>
-      </w:r>
-    </w:p>
-    <w:p>
-      <w:pPr>
-        <w:pStyle w:val="ListBullet"/>
-        <w:spacing w:after="40" w:line="264" w:lineRule="auto"/>
-        <w:jc w:val="both"/>
-      </w:pPr>
-      <w:r>
-        <w:rPr>
-          <w:rFonts w:ascii="Times New Roman" w:hAnsi="Times New Roman"/>
-          <w:sz w:val="21"/>
-        </w:rPr>
-        <w:t>runs the example suite</w:t>
-      </w:r>
-    </w:p>
-    <w:p>
-      <w:pPr>
-        <w:pStyle w:val="ListBullet"/>
-        <w:spacing w:after="40" w:line="264" w:lineRule="auto"/>
-        <w:jc w:val="both"/>
-      </w:pPr>
-      <w:r>
-        <w:rPr>
-          <w:rFonts w:ascii="Times New Roman" w:hAnsi="Times New Roman"/>
-          <w:sz w:val="21"/>
-        </w:rPr>
-        <w:t>uploads the resulting report as an artifact</w:t>
-      </w:r>
-    </w:p>
-    <w:p>
-      <w:pPr>
-        <w:spacing w:after="120" w:line="276" w:lineRule="auto"/>
-        <w:ind w:firstLine="360"/>
-        <w:jc w:val="both"/>
-      </w:pPr>
-      <w:r>
-        <w:rPr>
-          <w:rFonts w:ascii="Times New Roman" w:hAnsi="Times New Roman"/>
-          <w:sz w:val="22"/>
-        </w:rPr>
-        <w:t>Because the CLI exits with code 1 when there are failures, the workflow behaves like a normal test job.</w:t>
-      </w:r>
-    </w:p>
-    <w:p/>
-    <w:p>
-      <w:pPr>
-        <w:pStyle w:val="Heading1"/>
-        <w:spacing w:before="160" w:after="80"/>
-      </w:pPr>
-      <w:r>
-        <w:t>12. Example suite: structured extraction</w:t>
-      </w:r>
-    </w:p>
-    <w:p>
-      <w:pPr>
-        <w:spacing w:after="120" w:line="276" w:lineRule="auto"/>
-        <w:ind w:firstLine="360"/>
-        <w:jc w:val="both"/>
-      </w:pPr>
-      <w:r>
-        <w:rPr>
-          <w:rFonts w:ascii="Times New Roman" w:hAnsi="Times New Roman"/>
-          <w:sz w:val="22"/>
-        </w:rPr>
-        <w:t>The included example suite is:</w:t>
-      </w:r>
-    </w:p>
-    <w:p>
-      <w:pPr>
-        <w:pStyle w:val="ListBullet"/>
-        <w:spacing w:after="40" w:line="264" w:lineRule="auto"/>
-        <w:jc w:val="both"/>
-      </w:pPr>
-      <w:r>
-        <w:rPr>
-          <w:rFonts w:ascii="Times New Roman" w:hAnsi="Times New Roman"/>
-          <w:sz w:val="21"/>
-        </w:rPr>
-        <w:t>examples/structured_extraction.yaml</w:t>
-      </w:r>
-    </w:p>
-    <w:p>
-      <w:pPr>
-        <w:spacing w:after="120" w:line="276" w:lineRule="auto"/>
-        <w:ind w:firstLine="360"/>
-        <w:jc w:val="both"/>
-      </w:pPr>
-      <w:r>
-        <w:rPr>
-          <w:rFonts w:ascii="Times New Roman" w:hAnsi="Times New Roman"/>
-          <w:sz w:val="22"/>
-        </w:rPr>
-        <w:t>It models a common operational problem:</w:t>
-      </w:r>
-    </w:p>
-    <w:p>
-      <w:pPr>
-        <w:spacing w:after="120" w:line="276" w:lineRule="auto"/>
-        <w:ind w:firstLine="360"/>
-        <w:jc w:val="both"/>
-      </w:pPr>
-      <w:r>
-        <w:rPr>
-          <w:rFonts w:ascii="Times New Roman" w:hAnsi="Times New Roman"/>
-          <w:sz w:val="22"/>
-        </w:rPr>
-        <w:t>Extract a consistent structured payload from messy inbound lead emails.</w:t>
-      </w:r>
-    </w:p>
-    <w:p>
-      <w:pPr>
-        <w:spacing w:after="120" w:line="276" w:lineRule="auto"/>
-        <w:ind w:firstLine="360"/>
-        <w:jc w:val="both"/>
-      </w:pPr>
-      <w:r>
-        <w:rPr>
-          <w:rFonts w:ascii="Times New Roman" w:hAnsi="Times New Roman"/>
-          <w:sz w:val="22"/>
-        </w:rPr>
-        <w:t>That use case is representative because it contains several common LLM failure modes at once:</w:t>
-      </w:r>
-    </w:p>
-    <w:p>
-      <w:pPr>
-        <w:pStyle w:val="ListBullet"/>
-        <w:spacing w:after="40" w:line="264" w:lineRule="auto"/>
-        <w:jc w:val="both"/>
-      </w:pPr>
-      <w:r>
-        <w:rPr>
-          <w:rFonts w:ascii="Times New Roman" w:hAnsi="Times New Roman"/>
-          <w:sz w:val="21"/>
-        </w:rPr>
-        <w:t>semi-structured inputs</w:t>
-      </w:r>
-    </w:p>
-    <w:p>
-      <w:pPr>
-        <w:pStyle w:val="ListBullet"/>
-        <w:spacing w:after="40" w:line="264" w:lineRule="auto"/>
-        <w:jc w:val="both"/>
-      </w:pPr>
-      <w:r>
-        <w:rPr>
-          <w:rFonts w:ascii="Times New Roman" w:hAnsi="Times New Roman"/>
-          <w:sz w:val="21"/>
-        </w:rPr>
-        <w:t>incomplete data</w:t>
-      </w:r>
-    </w:p>
-    <w:p>
-      <w:pPr>
-        <w:pStyle w:val="ListBullet"/>
-        <w:spacing w:after="40" w:line="264" w:lineRule="auto"/>
-        <w:jc w:val="both"/>
-      </w:pPr>
-      <w:r>
-        <w:rPr>
-          <w:rFonts w:ascii="Times New Roman" w:hAnsi="Times New Roman"/>
-          <w:sz w:val="21"/>
-        </w:rPr>
-        <w:t>synonyms and paraphrases</w:t>
-      </w:r>
-    </w:p>
-    <w:p>
-      <w:pPr>
-        <w:pStyle w:val="ListBullet"/>
-        <w:spacing w:after="40" w:line="264" w:lineRule="auto"/>
-        <w:jc w:val="both"/>
-      </w:pPr>
-      <w:r>
-        <w:rPr>
-          <w:rFonts w:ascii="Times New Roman" w:hAnsi="Times New Roman"/>
-          <w:sz w:val="21"/>
-        </w:rPr>
-        <w:t>controlled vocabularies for services</w:t>
-      </w:r>
-    </w:p>
-    <w:p>
-      <w:pPr>
-        <w:pStyle w:val="ListBullet"/>
-        <w:spacing w:after="40" w:line="264" w:lineRule="auto"/>
-        <w:jc w:val="both"/>
-      </w:pPr>
-      <w:r>
-        <w:rPr>
-          <w:rFonts w:ascii="Times New Roman" w:hAnsi="Times New Roman"/>
-          <w:sz w:val="21"/>
-        </w:rPr>
-        <w:t>the need for strict JSON parsing downstream</w:t>
-      </w:r>
-    </w:p>
-    <w:p>
-      <w:pPr>
-        <w:pStyle w:val="Heading2"/>
-        <w:spacing w:before="160" w:after="80"/>
-      </w:pPr>
-      <w:r>
-        <w:t>Contract enforced by the suite</w:t>
-      </w:r>
-    </w:p>
-    <w:p>
-      <w:pPr>
-        <w:spacing w:after="120" w:line="276" w:lineRule="auto"/>
-        <w:ind w:firstLine="360"/>
-        <w:jc w:val="both"/>
-      </w:pPr>
-      <w:r>
-        <w:rPr>
-          <w:rFonts w:ascii="Times New Roman" w:hAnsi="Times New Roman"/>
-          <w:sz w:val="22"/>
-        </w:rPr>
-        <w:t>The suite requires outputs to:</w:t>
-      </w:r>
-    </w:p>
-    <w:p>
-      <w:pPr>
-        <w:pStyle w:val="ListBullet"/>
-        <w:spacing w:after="40" w:line="264" w:lineRule="auto"/>
-        <w:jc w:val="both"/>
-      </w:pPr>
-      <w:r>
-        <w:rPr>
-          <w:rFonts w:ascii="Times New Roman" w:hAnsi="Times New Roman"/>
-          <w:sz w:val="21"/>
-        </w:rPr>
-        <w:t>be raw JSON only</w:t>
-      </w:r>
-    </w:p>
-    <w:p>
-      <w:pPr>
-        <w:pStyle w:val="ListBullet"/>
-        <w:spacing w:after="40" w:line="264" w:lineRule="auto"/>
-        <w:jc w:val="both"/>
-      </w:pPr>
-      <w:r>
-        <w:rPr>
-          <w:rFonts w:ascii="Times New Roman" w:hAnsi="Times New Roman"/>
-          <w:sz w:val="21"/>
-        </w:rPr>
-        <w:t>contain all required top-level fields</w:t>
-      </w:r>
-    </w:p>
-    <w:p>
-      <w:pPr>
-        <w:pStyle w:val="ListBullet"/>
-        <w:spacing w:after="40" w:line="264" w:lineRule="auto"/>
-        <w:jc w:val="both"/>
-      </w:pPr>
-      <w:r>
-        <w:rPr>
-          <w:rFonts w:ascii="Times New Roman" w:hAnsi="Times New Roman"/>
-          <w:sz w:val="21"/>
-        </w:rPr>
-        <w:t>use empty strings for unknowns</w:t>
-      </w:r>
-    </w:p>
-    <w:p>
-      <w:pPr>
-        <w:pStyle w:val="ListBullet"/>
-        <w:spacing w:after="40" w:line="264" w:lineRule="auto"/>
-        <w:jc w:val="both"/>
-      </w:pPr>
-      <w:r>
-        <w:rPr>
-          <w:rFonts w:ascii="Times New Roman" w:hAnsi="Times New Roman"/>
-          <w:sz w:val="21"/>
-        </w:rPr>
-        <w:t>emit services as an array</w:t>
-      </w:r>
-    </w:p>
-    <w:p>
-      <w:pPr>
-        <w:pStyle w:val="ListBullet"/>
-        <w:spacing w:after="40" w:line="264" w:lineRule="auto"/>
-        <w:jc w:val="both"/>
-      </w:pPr>
-      <w:r>
-        <w:rPr>
-          <w:rFonts w:ascii="Times New Roman" w:hAnsi="Times New Roman"/>
-          <w:sz w:val="21"/>
-        </w:rPr>
-        <w:t>use only allowed values for services</w:t>
-      </w:r>
-    </w:p>
-    <w:p>
-      <w:pPr>
-        <w:spacing w:after="120" w:line="276" w:lineRule="auto"/>
-        <w:ind w:firstLine="360"/>
-        <w:jc w:val="both"/>
-      </w:pPr>
-      <w:r>
-        <w:rPr>
-          <w:rFonts w:ascii="Times New Roman" w:hAnsi="Times New Roman"/>
-          <w:sz w:val="22"/>
-        </w:rPr>
-        <w:t>In other words, this is not “did the model get the vibe right?” It is “did it produce something the pipeline can trust?”</w:t>
+        <w:t>The current example suite includes ten cases. Together they cover clear extraction, sparse signature-block style emails, multi-service requests, budget/timeline extraction, AI/R&amp;D language, devops terminology, security-related mapping, advisory work, and very short low-context inputs.</w:t>
       </w:r>
     </w:p>
     <w:p>
@@ -4397,6 +1564,20 @@
       </w:tr>
     </w:tbl>
     <w:p/>
+    <w:p>
+      <w:pPr>
+        <w:spacing w:after="120" w:line="276" w:lineRule="auto"/>
+        <w:ind w:firstLine="360"/>
+        <w:jc w:val="both"/>
+      </w:pPr>
+      <w:r>
+        <w:rPr>
+          <w:rFonts w:ascii="Times New Roman" w:hAnsi="Times New Roman"/>
+          <w:sz w:val="22"/>
+        </w:rPr>
+        <w:t>One practical lesson from this case study is that strong models still need clear contract reinforcement when the output format is strict. Reliability improved not through exotic techniques, but through careful prompt and suite design: restating the exact JSON shape, insisting on no markdown or code fences, clarifying that unknowns should be empty strings rather than null, and adding explicit mapping guidance for controlled-vocabulary fields. That is exactly why deterministic gating is useful. It does not assume the model will “probably do the right thing.” It makes the contract visible and then tests whether the model actually honored it.</w:t>
+      </w:r>
+    </w:p>
     <w:p/>
     <w:p>
       <w:pPr>
@@ -4404,7 +1585,7 @@
         <w:spacing w:before="160" w:after="80"/>
       </w:pPr>
       <w:r>
-        <w:t>13. What the baseline shows</w:t>
+        <w:t>6. Baseline results</w:t>
       </w:r>
     </w:p>
     <w:p>
@@ -4418,151 +1599,7 @@
           <w:rFonts w:ascii="Times New Roman" w:hAnsi="Times New Roman"/>
           <w:sz w:val="22"/>
         </w:rPr>
-        <w:t>A checked-in baseline report is included here:</w:t>
-      </w:r>
-    </w:p>
-    <w:p>
-      <w:pPr>
-        <w:pStyle w:val="ListBullet"/>
-        <w:spacing w:after="40" w:line="264" w:lineRule="auto"/>
-        <w:jc w:val="both"/>
-      </w:pPr>
-      <w:r>
-        <w:rPr>
-          <w:rFonts w:ascii="Times New Roman" w:hAnsi="Times New Roman"/>
-          <w:sz w:val="21"/>
-        </w:rPr>
-        <w:t>baselines/structured_extraction-2026-03-19_gpt-4.1-mini.json</w:t>
-      </w:r>
-    </w:p>
-    <w:p>
-      <w:pPr>
-        <w:spacing w:after="120" w:line="276" w:lineRule="auto"/>
-        <w:ind w:firstLine="360"/>
-        <w:jc w:val="both"/>
-      </w:pPr>
-      <w:r>
-        <w:rPr>
-          <w:rFonts w:ascii="Times New Roman" w:hAnsi="Times New Roman"/>
-          <w:sz w:val="22"/>
-        </w:rPr>
-        <w:t>That baseline matters for two reasons.</w:t>
-      </w:r>
-    </w:p>
-    <w:p>
-      <w:pPr>
-        <w:pStyle w:val="Heading2"/>
-        <w:spacing w:before="160" w:after="80"/>
-      </w:pPr>
-      <w:r>
-        <w:t>13.1 It shows the suite is operational</w:t>
-      </w:r>
-    </w:p>
-    <w:p>
-      <w:pPr>
-        <w:spacing w:after="120" w:line="276" w:lineRule="auto"/>
-        <w:ind w:firstLine="360"/>
-        <w:jc w:val="both"/>
-      </w:pPr>
-      <w:r>
-        <w:rPr>
-          <w:rFonts w:ascii="Times New Roman" w:hAnsi="Times New Roman"/>
-          <w:sz w:val="22"/>
-        </w:rPr>
-        <w:t>The suite is not merely specified; it was actually executed against a model and produced a passing baseline.</w:t>
-      </w:r>
-    </w:p>
-    <w:p>
-      <w:pPr>
-        <w:pStyle w:val="Heading2"/>
-        <w:spacing w:before="160" w:after="80"/>
-      </w:pPr>
-      <w:r>
-        <w:t>13.2 It creates a stable reference point</w:t>
-      </w:r>
-    </w:p>
-    <w:p>
-      <w:pPr>
-        <w:spacing w:after="120" w:line="276" w:lineRule="auto"/>
-        <w:ind w:firstLine="360"/>
-        <w:jc w:val="both"/>
-      </w:pPr>
-      <w:r>
-        <w:rPr>
-          <w:rFonts w:ascii="Times New Roman" w:hAnsi="Times New Roman"/>
-          <w:sz w:val="22"/>
-        </w:rPr>
-        <w:t>Once a passing baseline exists, future changes can be evaluated against it:</w:t>
-      </w:r>
-    </w:p>
-    <w:p>
-      <w:pPr>
-        <w:pStyle w:val="ListBullet"/>
-        <w:spacing w:after="40" w:line="264" w:lineRule="auto"/>
-        <w:jc w:val="both"/>
-      </w:pPr>
-      <w:r>
-        <w:rPr>
-          <w:rFonts w:ascii="Times New Roman" w:hAnsi="Times New Roman"/>
-          <w:sz w:val="21"/>
-        </w:rPr>
-        <w:t>prompt changes</w:t>
-      </w:r>
-    </w:p>
-    <w:p>
-      <w:pPr>
-        <w:pStyle w:val="ListBullet"/>
-        <w:spacing w:after="40" w:line="264" w:lineRule="auto"/>
-        <w:jc w:val="both"/>
-      </w:pPr>
-      <w:r>
-        <w:rPr>
-          <w:rFonts w:ascii="Times New Roman" w:hAnsi="Times New Roman"/>
-          <w:sz w:val="21"/>
-        </w:rPr>
-        <w:t>suite changes</w:t>
-      </w:r>
-    </w:p>
-    <w:p>
-      <w:pPr>
-        <w:pStyle w:val="ListBullet"/>
-        <w:spacing w:after="40" w:line="264" w:lineRule="auto"/>
-        <w:jc w:val="both"/>
-      </w:pPr>
-      <w:r>
-        <w:rPr>
-          <w:rFonts w:ascii="Times New Roman" w:hAnsi="Times New Roman"/>
-          <w:sz w:val="21"/>
-        </w:rPr>
-        <w:t>provider changes</w:t>
-      </w:r>
-    </w:p>
-    <w:p>
-      <w:pPr>
-        <w:pStyle w:val="ListBullet"/>
-        <w:spacing w:after="40" w:line="264" w:lineRule="auto"/>
-        <w:jc w:val="both"/>
-      </w:pPr>
-      <w:r>
-        <w:rPr>
-          <w:rFonts w:ascii="Times New Roman" w:hAnsi="Times New Roman"/>
-          <w:sz w:val="21"/>
-        </w:rPr>
-        <w:t>model changes</w:t>
-      </w:r>
-    </w:p>
-    <w:p>
-      <w:pPr>
-        <w:spacing w:after="120" w:line="276" w:lineRule="auto"/>
-        <w:ind w:firstLine="360"/>
-        <w:jc w:val="both"/>
-      </w:pPr>
-      <w:r>
-        <w:rPr>
-          <w:rFonts w:ascii="Times New Roman" w:hAnsi="Times New Roman"/>
-          <w:sz w:val="22"/>
-        </w:rPr>
-        <w:t>That makes the harness useful not just for one run, but for tracking whether a system becomes more or less reliable over time.</w:t>
+        <w:t>A checked-in baseline report is included at baselines/structured_extraction-2026-03-19_gpt-4.1-mini.json. That baseline matters because it does two things at once. First, it shows that the suite is not hypothetical: it was executed against a real model and produced a passing result. Second, it creates a stable reference point for future comparison. Prompt changes, suite changes, provider changes, and model changes can all be evaluated against the same baseline.</w:t>
       </w:r>
     </w:p>
     <w:p>
@@ -4926,7 +1963,7 @@
           <w:rFonts w:ascii="Times New Roman" w:hAnsi="Times New Roman"/>
           <w:sz w:val="22"/>
         </w:rPr>
-        <w:t>This baseline should be read narrowly: it is one successful reference run for one suite on one model, not evidence of broad model-agnostic reliability. What it establishes is that the harness pattern works, that the suite is executable, and that a contract-bound workflow can be gated deterministically in practice.</w:t>
+        <w:t>This baseline should be read narrowly. It is one successful reference run for one suite on one model, not evidence of broad model-agnostic reliability. What it establishes is that the harness pattern works, that the suite is executable, and that a contract-bound workflow can be gated deterministically in practice.</w:t>
       </w:r>
     </w:p>
     <w:p/>
@@ -4936,7 +1973,7 @@
         <w:spacing w:before="160" w:after="80"/>
       </w:pPr>
       <w:r>
-        <w:t>14. Lessons from the example suite</w:t>
+        <w:t>7. Design tradeoffs and limitations</w:t>
       </w:r>
     </w:p>
     <w:p>
@@ -4950,7 +1987,7 @@
           <w:rFonts w:ascii="Times New Roman" w:hAnsi="Times New Roman"/>
           <w:sz w:val="22"/>
         </w:rPr>
-        <w:t>One practical lesson from the structured extraction example is that even strong models need clear contract reinforcement when the output format is strict.</w:t>
+        <w:t>The project’s strongest qualities are also its clearest limitations. By keeping the dependency surface small, the harness remains easy to inspect and easy to extend, but the current schema support is intentionally incomplete. It is enough for common contract enforcement, not a substitute for the full jsonschema ecosystem.</w:t>
       </w:r>
     </w:p>
     <w:p>
@@ -4964,77 +2001,7 @@
           <w:rFonts w:ascii="Times New Roman" w:hAnsi="Times New Roman"/>
           <w:sz w:val="22"/>
         </w:rPr>
-        <w:t>The things that improved reliability were not exotic:</w:t>
-      </w:r>
-    </w:p>
-    <w:p>
-      <w:pPr>
-        <w:pStyle w:val="ListBullet"/>
-        <w:spacing w:after="40" w:line="264" w:lineRule="auto"/>
-        <w:jc w:val="both"/>
-      </w:pPr>
-      <w:r>
-        <w:rPr>
-          <w:rFonts w:ascii="Times New Roman" w:hAnsi="Times New Roman"/>
-          <w:sz w:val="21"/>
-        </w:rPr>
-        <w:t>restating the exact JSON shape</w:t>
-      </w:r>
-    </w:p>
-    <w:p>
-      <w:pPr>
-        <w:pStyle w:val="ListBullet"/>
-        <w:spacing w:after="40" w:line="264" w:lineRule="auto"/>
-        <w:jc w:val="both"/>
-      </w:pPr>
-      <w:r>
-        <w:rPr>
-          <w:rFonts w:ascii="Times New Roman" w:hAnsi="Times New Roman"/>
-          <w:sz w:val="21"/>
-        </w:rPr>
-        <w:t>insisting on no markdown / no code fences</w:t>
-      </w:r>
-    </w:p>
-    <w:p>
-      <w:pPr>
-        <w:pStyle w:val="ListBullet"/>
-        <w:spacing w:after="40" w:line="264" w:lineRule="auto"/>
-        <w:jc w:val="both"/>
-      </w:pPr>
-      <w:r>
-        <w:rPr>
-          <w:rFonts w:ascii="Times New Roman" w:hAnsi="Times New Roman"/>
-          <w:sz w:val="21"/>
-        </w:rPr>
-        <w:t>enforcing top-level keys</w:t>
-      </w:r>
-    </w:p>
-    <w:p>
-      <w:pPr>
-        <w:pStyle w:val="ListBullet"/>
-        <w:spacing w:after="40" w:line="264" w:lineRule="auto"/>
-        <w:jc w:val="both"/>
-      </w:pPr>
-      <w:r>
-        <w:rPr>
-          <w:rFonts w:ascii="Times New Roman" w:hAnsi="Times New Roman"/>
-          <w:sz w:val="21"/>
-        </w:rPr>
-        <w:t>clarifying that unknowns should be empty strings, not null</w:t>
-      </w:r>
-    </w:p>
-    <w:p>
-      <w:pPr>
-        <w:pStyle w:val="ListBullet"/>
-        <w:spacing w:after="40" w:line="264" w:lineRule="auto"/>
-        <w:jc w:val="both"/>
-      </w:pPr>
-      <w:r>
-        <w:rPr>
-          <w:rFonts w:ascii="Times New Roman" w:hAnsi="Times New Roman"/>
-          <w:sz w:val="21"/>
-        </w:rPr>
-        <w:t>adding explicit mapping guidance for controlled-vocabulary fields</w:t>
+        <w:t>By enforcing strict raw-JSON output, the suite reflects real production constraints, but that strictness also means seemingly “close enough” outputs will still fail. A payload wrapped in code fences or preceded by commentary may be human-legible and still be unacceptable to the pipeline. This is not accidental harshness; it is a deliberate alignment between the evaluation and the downstream system’s expectations.</w:t>
       </w:r>
     </w:p>
     <w:p>
@@ -5048,7 +2015,7 @@
           <w:rFonts w:ascii="Times New Roman" w:hAnsi="Times New Roman"/>
           <w:sz w:val="22"/>
         </w:rPr>
-        <w:t>This is exactly why deterministic gating is useful.</w:t>
+        <w:t>The current report format is similarly pragmatic rather than polished. JSON is excellent for CI artifacts and downstream tooling, but less ideal for human review than Markdown or HTML summaries would be. The current writeup can point to the baseline artifact and the suite definitions, but it should still be read as evidence of an initial implementation, not as proof that the harness has already solved broad LLM evaluation reliability.</w:t>
       </w:r>
     </w:p>
     <w:p>
@@ -5062,7 +2029,7 @@
           <w:rFonts w:ascii="Times New Roman" w:hAnsi="Times New Roman"/>
           <w:sz w:val="22"/>
         </w:rPr>
-        <w:t>It does not assume the model will “probably do the right thing.” It makes the contract visible, then tests whether the model actually honored it.</w:t>
+        <w:t>There is also an evidentiary limit worth keeping explicit: the current repo most directly validates one pattern well, namely structured extraction with controlled vocabularies. The architecture is suitable for adjacent contract-bound problems, but the strongest direct support in the repository today is still this example case.</w:t>
       </w:r>
     </w:p>
     <w:p/>
@@ -5072,16 +2039,7 @@
         <w:spacing w:before="160" w:after="80"/>
       </w:pPr>
       <w:r>
-        <w:t>15. Design tradeoffs</w:t>
-      </w:r>
-    </w:p>
-    <w:p>
-      <w:pPr>
-        <w:pStyle w:val="Heading2"/>
-        <w:spacing w:before="160" w:after="80"/>
-      </w:pPr>
-      <w:r>
-        <w:t>15.1 Minimal dependency surface</w:t>
+        <w:t>8. Where the current implementation is strongest</w:t>
       </w:r>
     </w:p>
     <w:p>
@@ -5095,7 +2053,7 @@
           <w:rFonts w:ascii="Times New Roman" w:hAnsi="Times New Roman"/>
           <w:sz w:val="22"/>
         </w:rPr>
-        <w:t>The project avoids bringing in heavier validation tooling in the initial implementation.</w:t>
+        <w:t>Today, kestrel-evals is strongest in settings where the output contract is explicit and the failure modes are mechanical. That includes structured extraction outputs, controlled-vocabulary classification, prompt regressions on machine-consumable responses, and CI gating for LLM features with hard output constraints.</w:t>
       </w:r>
     </w:p>
     <w:p>
@@ -5109,63 +2067,17 @@
           <w:rFonts w:ascii="Times New Roman" w:hAnsi="Times New Roman"/>
           <w:sz w:val="22"/>
         </w:rPr>
-        <w:t>Benefits:</w:t>
+        <w:t>The narrower and more contract-bound the output, the more credible this harness is today. That makes it a strong fit for things like lead intake extraction, support ticket routing labels, metadata extraction, internal categorization workflows, and JSON response formatting for downstream automations. It is less compelling, at least in its current form, for open-ended conversational evaluation or nuanced quality grading, which require different methods and a broader evidence base.</w:t>
       </w:r>
     </w:p>
+    <w:p/>
     <w:p>
       <w:pPr>
-        <w:pStyle w:val="ListBullet"/>
-        <w:spacing w:after="40" w:line="264" w:lineRule="auto"/>
-        <w:jc w:val="both"/>
+        <w:pStyle w:val="Heading1"/>
+        <w:spacing w:before="160" w:after="80"/>
       </w:pPr>
       <w:r>
-        <w:rPr>
-          <w:rFonts w:ascii="Times New Roman" w:hAnsi="Times New Roman"/>
-          <w:sz w:val="21"/>
-        </w:rPr>
-        <w:t>small install surface</w:t>
-      </w:r>
-    </w:p>
-    <w:p>
-      <w:pPr>
-        <w:pStyle w:val="ListBullet"/>
-        <w:spacing w:after="40" w:line="264" w:lineRule="auto"/>
-        <w:jc w:val="both"/>
-      </w:pPr>
-      <w:r>
-        <w:rPr>
-          <w:rFonts w:ascii="Times New Roman" w:hAnsi="Times New Roman"/>
-          <w:sz w:val="21"/>
-        </w:rPr>
-        <w:t>easy to inspect</w:t>
-      </w:r>
-    </w:p>
-    <w:p>
-      <w:pPr>
-        <w:pStyle w:val="ListBullet"/>
-        <w:spacing w:after="40" w:line="264" w:lineRule="auto"/>
-        <w:jc w:val="both"/>
-      </w:pPr>
-      <w:r>
-        <w:rPr>
-          <w:rFonts w:ascii="Times New Roman" w:hAnsi="Times New Roman"/>
-          <w:sz w:val="21"/>
-        </w:rPr>
-        <w:t>fewer abstraction layers</w:t>
-      </w:r>
-    </w:p>
-    <w:p>
-      <w:pPr>
-        <w:pStyle w:val="ListBullet"/>
-        <w:spacing w:after="40" w:line="264" w:lineRule="auto"/>
-        <w:jc w:val="both"/>
-      </w:pPr>
-      <w:r>
-        <w:rPr>
-          <w:rFonts w:ascii="Times New Roman" w:hAnsi="Times New Roman"/>
-          <w:sz w:val="21"/>
-        </w:rPr>
-        <w:t>faster iteration</w:t>
+        <w:t>9. Future directions</w:t>
       </w:r>
     </w:p>
     <w:p>
@@ -5179,35 +2091,7 @@
           <w:rFonts w:ascii="Times New Roman" w:hAnsi="Times New Roman"/>
           <w:sz w:val="22"/>
         </w:rPr>
-        <w:t>Costs:</w:t>
-      </w:r>
-    </w:p>
-    <w:p>
-      <w:pPr>
-        <w:pStyle w:val="ListBullet"/>
-        <w:spacing w:after="40" w:line="264" w:lineRule="auto"/>
-        <w:jc w:val="both"/>
-      </w:pPr>
-      <w:r>
-        <w:rPr>
-          <w:rFonts w:ascii="Times New Roman" w:hAnsi="Times New Roman"/>
-          <w:sz w:val="21"/>
-        </w:rPr>
-        <w:t>schema support is intentionally incomplete</w:t>
-      </w:r>
-    </w:p>
-    <w:p>
-      <w:pPr>
-        <w:pStyle w:val="ListBullet"/>
-        <w:spacing w:after="40" w:line="264" w:lineRule="auto"/>
-        <w:jc w:val="both"/>
-      </w:pPr>
-      <w:r>
-        <w:rPr>
-          <w:rFonts w:ascii="Times New Roman" w:hAnsi="Times New Roman"/>
-          <w:sz w:val="21"/>
-        </w:rPr>
-        <w:t>some advanced validation patterns are not yet available</w:t>
+        <w:t>The next sensible expansions are concrete rather than abstract. The provider abstraction already makes room for additional backends, so the most obvious next step is to add Anthropic, Azure OpenAI, or local OpenAI-compatible endpoints and run the same suites across them without rewriting the evaluation logic.</w:t>
       </w:r>
     </w:p>
     <w:p>
@@ -5221,16 +2105,7 @@
           <w:rFonts w:ascii="Times New Roman" w:hAnsi="Times New Roman"/>
           <w:sz w:val="22"/>
         </w:rPr>
-        <w:t>This is a reasonable trade for an initial implementation whose purpose is to establish a solid deterministic core.</w:t>
-      </w:r>
-    </w:p>
-    <w:p>
-      <w:pPr>
-        <w:pStyle w:val="Heading2"/>
-        <w:spacing w:before="160" w:after="80"/>
-      </w:pPr>
-      <w:r>
-        <w:t>15.2 Strictness over convenience</w:t>
+        <w:t>Reporting is another clear next layer. The current JSON artifact is useful, but Markdown or HTML summaries would make inspection easier, especially if they include pass/fail diffs against a checked-in baseline and per-case change summaries between runs.</w:t>
       </w:r>
     </w:p>
     <w:p>
@@ -5244,7 +2119,7 @@
           <w:rFonts w:ascii="Times New Roman" w:hAnsi="Times New Roman"/>
           <w:sz w:val="22"/>
         </w:rPr>
-        <w:t>The example suite expects raw JSON only.</w:t>
+        <w:t>Dataset and baseline management is also an obvious place to deepen the project. Named baselines, versioned datasets, and explicit “current run versus baseline” views would make it easier to track reliability over time rather than treating each run as an isolated event.</w:t>
       </w:r>
     </w:p>
     <w:p>
@@ -5258,86 +2133,7 @@
           <w:rFonts w:ascii="Times New Roman" w:hAnsi="Times New Roman"/>
           <w:sz w:val="22"/>
         </w:rPr>
-        <w:t>That means seemingly “close enough” outputs can still fail, such as:</w:t>
-      </w:r>
-    </w:p>
-    <w:p>
-      <w:pPr>
-        <w:pStyle w:val="ListBullet"/>
-        <w:spacing w:after="40" w:line="264" w:lineRule="auto"/>
-        <w:jc w:val="both"/>
-      </w:pPr>
-      <w:r>
-        <w:rPr>
-          <w:rFonts w:ascii="Times New Roman" w:hAnsi="Times New Roman"/>
-          <w:sz w:val="21"/>
-        </w:rPr>
-        <w:t>JSON wrapped in code fences</w:t>
-      </w:r>
-    </w:p>
-    <w:p>
-      <w:pPr>
-        <w:pStyle w:val="ListBullet"/>
-        <w:spacing w:after="40" w:line="264" w:lineRule="auto"/>
-        <w:jc w:val="both"/>
-      </w:pPr>
-      <w:r>
-        <w:rPr>
-          <w:rFonts w:ascii="Times New Roman" w:hAnsi="Times New Roman"/>
-          <w:sz w:val="21"/>
-        </w:rPr>
-        <w:t>extra commentary before the object</w:t>
-      </w:r>
-    </w:p>
-    <w:p>
-      <w:pPr>
-        <w:spacing w:after="120" w:line="276" w:lineRule="auto"/>
-        <w:ind w:firstLine="360"/>
-        <w:jc w:val="both"/>
-      </w:pPr>
-      <w:r>
-        <w:rPr>
-          <w:rFonts w:ascii="Times New Roman" w:hAnsi="Times New Roman"/>
-          <w:sz w:val="22"/>
-        </w:rPr>
-        <w:t>This is not accidental harshness. It reflects a real production concern: if the output must be machine-consumable, the evaluation should enforce that exact constraint.</w:t>
-      </w:r>
-    </w:p>
-    <w:p>
-      <w:pPr>
-        <w:pStyle w:val="Heading2"/>
-        <w:spacing w:before="160" w:after="80"/>
-      </w:pPr>
-      <w:r>
-        <w:t>15.3 Report format is functional, not polished</w:t>
-      </w:r>
-    </w:p>
-    <w:p>
-      <w:pPr>
-        <w:spacing w:after="120" w:line="276" w:lineRule="auto"/>
-        <w:ind w:firstLine="360"/>
-        <w:jc w:val="both"/>
-      </w:pPr>
-      <w:r>
-        <w:rPr>
-          <w:rFonts w:ascii="Times New Roman" w:hAnsi="Times New Roman"/>
-          <w:sz w:val="22"/>
-        </w:rPr>
-        <w:t>The current report is JSON-first and artifact-friendly.</w:t>
-      </w:r>
-    </w:p>
-    <w:p>
-      <w:pPr>
-        <w:spacing w:after="120" w:line="276" w:lineRule="auto"/>
-        <w:ind w:firstLine="360"/>
-        <w:jc w:val="both"/>
-      </w:pPr>
-      <w:r>
-        <w:rPr>
-          <w:rFonts w:ascii="Times New Roman" w:hAnsi="Times New Roman"/>
-          <w:sz w:val="22"/>
-        </w:rPr>
-        <w:t>That makes it practical, but not especially reader-friendly for non-technical audiences. Better human-readable reporting is an obvious next step.</w:t>
+        <w:t>Finally, rubric scoring may still be worth adding later, but only after deterministic gating remains solid. That order matters. The correct sequence is first to confirm that the contract holds, and only then to ask whether the output quality is good.</w:t>
       </w:r>
     </w:p>
     <w:p/>
@@ -5347,661 +2143,7 @@
         <w:spacing w:before="160" w:after="80"/>
       </w:pPr>
       <w:r>
-        <w:t>16. Where the current implementation is strongest</w:t>
-      </w:r>
-    </w:p>
-    <w:p>
-      <w:pPr>
-        <w:spacing w:after="120" w:line="276" w:lineRule="auto"/>
-        <w:ind w:firstLine="360"/>
-        <w:jc w:val="both"/>
-      </w:pPr>
-      <w:r>
-        <w:rPr>
-          <w:rFonts w:ascii="Times New Roman" w:hAnsi="Times New Roman"/>
-          <w:sz w:val="22"/>
-        </w:rPr>
-        <w:t>Today, kestrel-evals is strongest on cases where the output contract is explicit and the failure modes are mechanical.</w:t>
-      </w:r>
-    </w:p>
-    <w:p>
-      <w:pPr>
-        <w:spacing w:after="120" w:line="276" w:lineRule="auto"/>
-        <w:ind w:firstLine="360"/>
-        <w:jc w:val="both"/>
-      </w:pPr>
-      <w:r>
-        <w:rPr>
-          <w:rFonts w:ascii="Times New Roman" w:hAnsi="Times New Roman"/>
-          <w:sz w:val="22"/>
-        </w:rPr>
-        <w:t>That includes things like:</w:t>
-      </w:r>
-    </w:p>
-    <w:p>
-      <w:pPr>
-        <w:pStyle w:val="ListBullet"/>
-        <w:spacing w:after="40" w:line="264" w:lineRule="auto"/>
-        <w:jc w:val="both"/>
-      </w:pPr>
-      <w:r>
-        <w:rPr>
-          <w:rFonts w:ascii="Times New Roman" w:hAnsi="Times New Roman"/>
-          <w:sz w:val="21"/>
-        </w:rPr>
-        <w:t>structured extraction outputs</w:t>
-      </w:r>
-    </w:p>
-    <w:p>
-      <w:pPr>
-        <w:pStyle w:val="ListBullet"/>
-        <w:spacing w:after="40" w:line="264" w:lineRule="auto"/>
-        <w:jc w:val="both"/>
-      </w:pPr>
-      <w:r>
-        <w:rPr>
-          <w:rFonts w:ascii="Times New Roman" w:hAnsi="Times New Roman"/>
-          <w:sz w:val="21"/>
-        </w:rPr>
-        <w:t>controlled-vocabulary classification</w:t>
-      </w:r>
-    </w:p>
-    <w:p>
-      <w:pPr>
-        <w:pStyle w:val="ListBullet"/>
-        <w:spacing w:after="40" w:line="264" w:lineRule="auto"/>
-        <w:jc w:val="both"/>
-      </w:pPr>
-      <w:r>
-        <w:rPr>
-          <w:rFonts w:ascii="Times New Roman" w:hAnsi="Times New Roman"/>
-          <w:sz w:val="21"/>
-        </w:rPr>
-        <w:t>prompt regressions on machine-consumable responses</w:t>
-      </w:r>
-    </w:p>
-    <w:p>
-      <w:pPr>
-        <w:pStyle w:val="ListBullet"/>
-        <w:spacing w:after="40" w:line="264" w:lineRule="auto"/>
-        <w:jc w:val="both"/>
-      </w:pPr>
-      <w:r>
-        <w:rPr>
-          <w:rFonts w:ascii="Times New Roman" w:hAnsi="Times New Roman"/>
-          <w:sz w:val="21"/>
-        </w:rPr>
-        <w:t>CI gating for LLM features with explicit contracts</w:t>
-      </w:r>
-    </w:p>
-    <w:p>
-      <w:pPr>
-        <w:spacing w:after="120" w:line="276" w:lineRule="auto"/>
-        <w:ind w:firstLine="360"/>
-        <w:jc w:val="both"/>
-      </w:pPr>
-      <w:r>
-        <w:rPr>
-          <w:rFonts w:ascii="Times New Roman" w:hAnsi="Times New Roman"/>
-          <w:sz w:val="22"/>
-        </w:rPr>
-        <w:t>The current repo most directly validates the structured extraction / controlled-vocabulary pattern. Architecturally, the same approach is a good fit for adjacent cases such as:</w:t>
-      </w:r>
-    </w:p>
-    <w:p>
-      <w:pPr>
-        <w:pStyle w:val="ListBullet"/>
-        <w:spacing w:after="40" w:line="264" w:lineRule="auto"/>
-        <w:jc w:val="both"/>
-      </w:pPr>
-      <w:r>
-        <w:rPr>
-          <w:rFonts w:ascii="Times New Roman" w:hAnsi="Times New Roman"/>
-          <w:sz w:val="21"/>
-        </w:rPr>
-        <w:t>lead intake extraction</w:t>
-      </w:r>
-    </w:p>
-    <w:p>
-      <w:pPr>
-        <w:pStyle w:val="ListBullet"/>
-        <w:spacing w:after="40" w:line="264" w:lineRule="auto"/>
-        <w:jc w:val="both"/>
-      </w:pPr>
-      <w:r>
-        <w:rPr>
-          <w:rFonts w:ascii="Times New Roman" w:hAnsi="Times New Roman"/>
-          <w:sz w:val="21"/>
-        </w:rPr>
-        <w:t>support ticket routing labels</w:t>
-      </w:r>
-    </w:p>
-    <w:p>
-      <w:pPr>
-        <w:pStyle w:val="ListBullet"/>
-        <w:spacing w:after="40" w:line="264" w:lineRule="auto"/>
-        <w:jc w:val="both"/>
-      </w:pPr>
-      <w:r>
-        <w:rPr>
-          <w:rFonts w:ascii="Times New Roman" w:hAnsi="Times New Roman"/>
-          <w:sz w:val="21"/>
-        </w:rPr>
-        <w:t>metadata extraction</w:t>
-      </w:r>
-    </w:p>
-    <w:p>
-      <w:pPr>
-        <w:pStyle w:val="ListBullet"/>
-        <w:spacing w:after="40" w:line="264" w:lineRule="auto"/>
-        <w:jc w:val="both"/>
-      </w:pPr>
-      <w:r>
-        <w:rPr>
-          <w:rFonts w:ascii="Times New Roman" w:hAnsi="Times New Roman"/>
-          <w:sz w:val="21"/>
-        </w:rPr>
-        <w:t>internal categorization workflows</w:t>
-      </w:r>
-    </w:p>
-    <w:p>
-      <w:pPr>
-        <w:pStyle w:val="ListBullet"/>
-        <w:spacing w:after="40" w:line="264" w:lineRule="auto"/>
-        <w:jc w:val="both"/>
-      </w:pPr>
-      <w:r>
-        <w:rPr>
-          <w:rFonts w:ascii="Times New Roman" w:hAnsi="Times New Roman"/>
-          <w:sz w:val="21"/>
-        </w:rPr>
-        <w:t>JSON response formatting for downstream automations</w:t>
-      </w:r>
-    </w:p>
-    <w:p>
-      <w:pPr>
-        <w:spacing w:after="120" w:line="276" w:lineRule="auto"/>
-        <w:ind w:firstLine="360"/>
-        <w:jc w:val="both"/>
-      </w:pPr>
-      <w:r>
-        <w:rPr>
-          <w:rFonts w:ascii="Times New Roman" w:hAnsi="Times New Roman"/>
-          <w:sz w:val="22"/>
-        </w:rPr>
-        <w:t>The narrower and more contract-bound the output, the more credible this harness is today.</w:t>
-      </w:r>
-    </w:p>
-    <w:p/>
-    <w:p>
-      <w:pPr>
-        <w:pStyle w:val="Heading1"/>
-        <w:spacing w:before="160" w:after="80"/>
-      </w:pPr>
-      <w:r>
-        <w:t>17. What it is not trying to solve yet</w:t>
-      </w:r>
-    </w:p>
-    <w:p>
-      <w:pPr>
-        <w:spacing w:after="120" w:line="276" w:lineRule="auto"/>
-        <w:ind w:firstLine="360"/>
-        <w:jc w:val="both"/>
-      </w:pPr>
-      <w:r>
-        <w:rPr>
-          <w:rFonts w:ascii="Times New Roman" w:hAnsi="Times New Roman"/>
-          <w:sz w:val="22"/>
-        </w:rPr>
-        <w:t>There are many worthwhile evaluation problems outside the current scope:</w:t>
-      </w:r>
-    </w:p>
-    <w:p>
-      <w:pPr>
-        <w:pStyle w:val="ListBullet"/>
-        <w:spacing w:after="40" w:line="264" w:lineRule="auto"/>
-        <w:jc w:val="both"/>
-      </w:pPr>
-      <w:r>
-        <w:rPr>
-          <w:rFonts w:ascii="Times New Roman" w:hAnsi="Times New Roman"/>
-          <w:sz w:val="21"/>
-        </w:rPr>
-        <w:t>open-ended conversational helpfulness</w:t>
-      </w:r>
-    </w:p>
-    <w:p>
-      <w:pPr>
-        <w:pStyle w:val="ListBullet"/>
-        <w:spacing w:after="40" w:line="264" w:lineRule="auto"/>
-        <w:jc w:val="both"/>
-      </w:pPr>
-      <w:r>
-        <w:rPr>
-          <w:rFonts w:ascii="Times New Roman" w:hAnsi="Times New Roman"/>
-          <w:sz w:val="21"/>
-        </w:rPr>
-        <w:t>nuanced style grading</w:t>
-      </w:r>
-    </w:p>
-    <w:p>
-      <w:pPr>
-        <w:pStyle w:val="ListBullet"/>
-        <w:spacing w:after="40" w:line="264" w:lineRule="auto"/>
-        <w:jc w:val="both"/>
-      </w:pPr>
-      <w:r>
-        <w:rPr>
-          <w:rFonts w:ascii="Times New Roman" w:hAnsi="Times New Roman"/>
-          <w:sz w:val="21"/>
-        </w:rPr>
-        <w:t>faithfulness over long-form answers</w:t>
-      </w:r>
-    </w:p>
-    <w:p>
-      <w:pPr>
-        <w:pStyle w:val="ListBullet"/>
-        <w:spacing w:after="40" w:line="264" w:lineRule="auto"/>
-        <w:jc w:val="both"/>
-      </w:pPr>
-      <w:r>
-        <w:rPr>
-          <w:rFonts w:ascii="Times New Roman" w:hAnsi="Times New Roman"/>
-          <w:sz w:val="21"/>
-        </w:rPr>
-        <w:t>benchmark datasets spanning many providers and models</w:t>
-      </w:r>
-    </w:p>
-    <w:p>
-      <w:pPr>
-        <w:pStyle w:val="ListBullet"/>
-        <w:spacing w:after="40" w:line="264" w:lineRule="auto"/>
-        <w:jc w:val="both"/>
-      </w:pPr>
-      <w:r>
-        <w:rPr>
-          <w:rFonts w:ascii="Times New Roman" w:hAnsi="Times New Roman"/>
-          <w:sz w:val="21"/>
-        </w:rPr>
-        <w:t>ranking systems with complex judging logic</w:t>
-      </w:r>
-    </w:p>
-    <w:p>
-      <w:pPr>
-        <w:spacing w:after="120" w:line="276" w:lineRule="auto"/>
-        <w:ind w:firstLine="360"/>
-        <w:jc w:val="both"/>
-      </w:pPr>
-      <w:r>
-        <w:rPr>
-          <w:rFonts w:ascii="Times New Roman" w:hAnsi="Times New Roman"/>
-          <w:sz w:val="22"/>
-        </w:rPr>
-        <w:t>Those may become relevant later, but they are not required for the project to provide immediate value.</w:t>
-      </w:r>
-    </w:p>
-    <w:p>
-      <w:pPr>
-        <w:spacing w:after="120" w:line="276" w:lineRule="auto"/>
-        <w:ind w:firstLine="360"/>
-        <w:jc w:val="both"/>
-      </w:pPr>
-      <w:r>
-        <w:rPr>
-          <w:rFonts w:ascii="Times New Roman" w:hAnsi="Times New Roman"/>
-          <w:sz w:val="22"/>
-        </w:rPr>
-        <w:t>The current claim is deliberately narrower:</w:t>
-      </w:r>
-    </w:p>
-    <w:p>
-      <w:pPr>
-        <w:spacing w:after="120" w:line="276" w:lineRule="auto"/>
-        <w:ind w:firstLine="360"/>
-        <w:jc w:val="both"/>
-      </w:pPr>
-      <w:r>
-        <w:rPr>
-          <w:rFonts w:ascii="Times New Roman" w:hAnsi="Times New Roman"/>
-          <w:sz w:val="22"/>
-        </w:rPr>
-        <w:t>if your system needs outputs that obey strict mechanical constraints, this harness can test that today.</w:t>
-      </w:r>
-    </w:p>
-    <w:p/>
-    <w:p>
-      <w:pPr>
-        <w:pStyle w:val="Heading1"/>
-        <w:spacing w:before="160" w:after="80"/>
-      </w:pPr>
-      <w:r>
-        <w:t>18. Future directions</w:t>
-      </w:r>
-    </w:p>
-    <w:p>
-      <w:pPr>
-        <w:spacing w:after="120" w:line="276" w:lineRule="auto"/>
-        <w:ind w:firstLine="360"/>
-        <w:jc w:val="both"/>
-      </w:pPr>
-      <w:r>
-        <w:rPr>
-          <w:rFonts w:ascii="Times New Roman" w:hAnsi="Times New Roman"/>
-          <w:sz w:val="22"/>
-        </w:rPr>
-        <w:t>The next sensible expansions are fairly concrete.</w:t>
-      </w:r>
-    </w:p>
-    <w:p>
-      <w:pPr>
-        <w:pStyle w:val="Heading2"/>
-        <w:spacing w:before="160" w:after="80"/>
-      </w:pPr>
-      <w:r>
-        <w:t>18.1 More providers</w:t>
-      </w:r>
-    </w:p>
-    <w:p>
-      <w:pPr>
-        <w:spacing w:after="120" w:line="276" w:lineRule="auto"/>
-        <w:ind w:firstLine="360"/>
-        <w:jc w:val="both"/>
-      </w:pPr>
-      <w:r>
-        <w:rPr>
-          <w:rFonts w:ascii="Times New Roman" w:hAnsi="Times New Roman"/>
-          <w:sz w:val="22"/>
-        </w:rPr>
-        <w:t>The provider abstraction is already in place. The most obvious next additions are:</w:t>
-      </w:r>
-    </w:p>
-    <w:p>
-      <w:pPr>
-        <w:pStyle w:val="ListBullet"/>
-        <w:spacing w:after="40" w:line="264" w:lineRule="auto"/>
-        <w:jc w:val="both"/>
-      </w:pPr>
-      <w:r>
-        <w:rPr>
-          <w:rFonts w:ascii="Times New Roman" w:hAnsi="Times New Roman"/>
-          <w:sz w:val="21"/>
-        </w:rPr>
-        <w:t>Anthropic</w:t>
-      </w:r>
-    </w:p>
-    <w:p>
-      <w:pPr>
-        <w:pStyle w:val="ListBullet"/>
-        <w:spacing w:after="40" w:line="264" w:lineRule="auto"/>
-        <w:jc w:val="both"/>
-      </w:pPr>
-      <w:r>
-        <w:rPr>
-          <w:rFonts w:ascii="Times New Roman" w:hAnsi="Times New Roman"/>
-          <w:sz w:val="21"/>
-        </w:rPr>
-        <w:t>Azure OpenAI</w:t>
-      </w:r>
-    </w:p>
-    <w:p>
-      <w:pPr>
-        <w:pStyle w:val="ListBullet"/>
-        <w:spacing w:after="40" w:line="264" w:lineRule="auto"/>
-        <w:jc w:val="both"/>
-      </w:pPr>
-      <w:r>
-        <w:rPr>
-          <w:rFonts w:ascii="Times New Roman" w:hAnsi="Times New Roman"/>
-          <w:sz w:val="21"/>
-        </w:rPr>
-        <w:t>local or OpenAI-compatible endpoints</w:t>
-      </w:r>
-    </w:p>
-    <w:p>
-      <w:pPr>
-        <w:spacing w:after="120" w:line="276" w:lineRule="auto"/>
-        <w:ind w:firstLine="360"/>
-        <w:jc w:val="both"/>
-      </w:pPr>
-      <w:r>
-        <w:rPr>
-          <w:rFonts w:ascii="Times New Roman" w:hAnsi="Times New Roman"/>
-          <w:sz w:val="22"/>
-        </w:rPr>
-        <w:t>The point is not provider-count for its own sake, but being able to run the same suite against multiple backends without rewriting eval logic.</w:t>
-      </w:r>
-    </w:p>
-    <w:p>
-      <w:pPr>
-        <w:pStyle w:val="Heading2"/>
-        <w:spacing w:before="160" w:after="80"/>
-      </w:pPr>
-      <w:r>
-        <w:t>18.2 Better reporting</w:t>
-      </w:r>
-    </w:p>
-    <w:p>
-      <w:pPr>
-        <w:spacing w:after="120" w:line="276" w:lineRule="auto"/>
-        <w:ind w:firstLine="360"/>
-        <w:jc w:val="both"/>
-      </w:pPr>
-      <w:r>
-        <w:rPr>
-          <w:rFonts w:ascii="Times New Roman" w:hAnsi="Times New Roman"/>
-          <w:sz w:val="22"/>
-        </w:rPr>
-        <w:t>The current JSON artifact is useful but sparse. The next reporting step should likely include:</w:t>
-      </w:r>
-    </w:p>
-    <w:p>
-      <w:pPr>
-        <w:pStyle w:val="ListBullet"/>
-        <w:spacing w:after="40" w:line="264" w:lineRule="auto"/>
-        <w:jc w:val="both"/>
-      </w:pPr>
-      <w:r>
-        <w:rPr>
-          <w:rFonts w:ascii="Times New Roman" w:hAnsi="Times New Roman"/>
-          <w:sz w:val="21"/>
-        </w:rPr>
-        <w:t>Markdown summaries for humans</w:t>
-      </w:r>
-    </w:p>
-    <w:p>
-      <w:pPr>
-        <w:pStyle w:val="ListBullet"/>
-        <w:spacing w:after="40" w:line="264" w:lineRule="auto"/>
-        <w:jc w:val="both"/>
-      </w:pPr>
-      <w:r>
-        <w:rPr>
-          <w:rFonts w:ascii="Times New Roman" w:hAnsi="Times New Roman"/>
-          <w:sz w:val="21"/>
-        </w:rPr>
-        <w:t>HTML reports for easier review</w:t>
-      </w:r>
-    </w:p>
-    <w:p>
-      <w:pPr>
-        <w:pStyle w:val="ListBullet"/>
-        <w:spacing w:after="40" w:line="264" w:lineRule="auto"/>
-        <w:jc w:val="both"/>
-      </w:pPr>
-      <w:r>
-        <w:rPr>
-          <w:rFonts w:ascii="Times New Roman" w:hAnsi="Times New Roman"/>
-          <w:sz w:val="21"/>
-        </w:rPr>
-        <w:t>pass/fail diffs against a checked-in baseline</w:t>
-      </w:r>
-    </w:p>
-    <w:p>
-      <w:pPr>
-        <w:pStyle w:val="ListBullet"/>
-        <w:spacing w:after="40" w:line="264" w:lineRule="auto"/>
-        <w:jc w:val="both"/>
-      </w:pPr>
-      <w:r>
-        <w:rPr>
-          <w:rFonts w:ascii="Times New Roman" w:hAnsi="Times New Roman"/>
-          <w:sz w:val="21"/>
-        </w:rPr>
-        <w:t>per-case change summaries between runs</w:t>
-      </w:r>
-    </w:p>
-    <w:p>
-      <w:pPr>
-        <w:pStyle w:val="Heading2"/>
-        <w:spacing w:before="160" w:after="80"/>
-      </w:pPr>
-      <w:r>
-        <w:t>18.3 Dataset and baseline management</w:t>
-      </w:r>
-    </w:p>
-    <w:p>
-      <w:pPr>
-        <w:spacing w:after="120" w:line="276" w:lineRule="auto"/>
-        <w:ind w:firstLine="360"/>
-        <w:jc w:val="both"/>
-      </w:pPr>
-      <w:r>
-        <w:rPr>
-          <w:rFonts w:ascii="Times New Roman" w:hAnsi="Times New Roman"/>
-          <w:sz w:val="22"/>
-        </w:rPr>
-        <w:t>A stronger next iteration would make it easier to manage:</w:t>
-      </w:r>
-    </w:p>
-    <w:p>
-      <w:pPr>
-        <w:pStyle w:val="ListBullet"/>
-        <w:spacing w:after="40" w:line="264" w:lineRule="auto"/>
-        <w:jc w:val="both"/>
-      </w:pPr>
-      <w:r>
-        <w:rPr>
-          <w:rFonts w:ascii="Times New Roman" w:hAnsi="Times New Roman"/>
-          <w:sz w:val="21"/>
-        </w:rPr>
-        <w:t>named baselines</w:t>
-      </w:r>
-    </w:p>
-    <w:p>
-      <w:pPr>
-        <w:pStyle w:val="ListBullet"/>
-        <w:spacing w:after="40" w:line="264" w:lineRule="auto"/>
-        <w:jc w:val="both"/>
-      </w:pPr>
-      <w:r>
-        <w:rPr>
-          <w:rFonts w:ascii="Times New Roman" w:hAnsi="Times New Roman"/>
-          <w:sz w:val="21"/>
-        </w:rPr>
-        <w:t>versioned datasets</w:t>
-      </w:r>
-    </w:p>
-    <w:p>
-      <w:pPr>
-        <w:pStyle w:val="ListBullet"/>
-        <w:spacing w:after="40" w:line="264" w:lineRule="auto"/>
-        <w:jc w:val="both"/>
-      </w:pPr>
-      <w:r>
-        <w:rPr>
-          <w:rFonts w:ascii="Times New Roman" w:hAnsi="Times New Roman"/>
-          <w:sz w:val="21"/>
-        </w:rPr>
-        <w:t>comparison between runs over time</w:t>
-      </w:r>
-    </w:p>
-    <w:p>
-      <w:pPr>
-        <w:pStyle w:val="ListBullet"/>
-        <w:spacing w:after="40" w:line="264" w:lineRule="auto"/>
-        <w:jc w:val="both"/>
-      </w:pPr>
-      <w:r>
-        <w:rPr>
-          <w:rFonts w:ascii="Times New Roman" w:hAnsi="Times New Roman"/>
-          <w:sz w:val="21"/>
-        </w:rPr>
-        <w:t>explicit “current run vs baseline” output</w:t>
-      </w:r>
-    </w:p>
-    <w:p>
-      <w:pPr>
-        <w:pStyle w:val="Heading2"/>
-        <w:spacing w:before="160" w:after="80"/>
-      </w:pPr>
-      <w:r>
-        <w:t>18.4 Optional rubric scoring</w:t>
-      </w:r>
-    </w:p>
-    <w:p>
-      <w:pPr>
-        <w:spacing w:after="120" w:line="276" w:lineRule="auto"/>
-        <w:ind w:firstLine="360"/>
-        <w:jc w:val="both"/>
-      </w:pPr>
-      <w:r>
-        <w:rPr>
-          <w:rFonts w:ascii="Times New Roman" w:hAnsi="Times New Roman"/>
-          <w:sz w:val="22"/>
-        </w:rPr>
-        <w:t>Rubric scoring still has a place, but it should remain layered on top of deterministic gating, not replace it.</w:t>
-      </w:r>
-    </w:p>
-    <w:p>
-      <w:pPr>
-        <w:spacing w:after="120" w:line="276" w:lineRule="auto"/>
-        <w:ind w:firstLine="360"/>
-        <w:jc w:val="both"/>
-      </w:pPr>
-      <w:r>
-        <w:rPr>
-          <w:rFonts w:ascii="Times New Roman" w:hAnsi="Times New Roman"/>
-          <w:sz w:val="22"/>
-        </w:rPr>
-        <w:t>That is the right order:</w:t>
-      </w:r>
-    </w:p>
-    <w:p>
-      <w:pPr>
-        <w:pStyle w:val="ListNumber"/>
-        <w:spacing w:after="40" w:line="264" w:lineRule="auto"/>
-        <w:jc w:val="both"/>
-      </w:pPr>
-      <w:r>
-        <w:rPr>
-          <w:rFonts w:ascii="Times New Roman" w:hAnsi="Times New Roman"/>
-          <w:sz w:val="21"/>
-        </w:rPr>
-        <w:t>confirm the contract holds</w:t>
-      </w:r>
-    </w:p>
-    <w:p>
-      <w:pPr>
-        <w:pStyle w:val="ListNumber"/>
-        <w:spacing w:after="40" w:line="264" w:lineRule="auto"/>
-        <w:jc w:val="both"/>
-      </w:pPr>
-      <w:r>
-        <w:rPr>
-          <w:rFonts w:ascii="Times New Roman" w:hAnsi="Times New Roman"/>
-          <w:sz w:val="21"/>
-        </w:rPr>
-        <w:t>then ask whether the output quality is good</w:t>
-      </w:r>
-    </w:p>
-    <w:p/>
-    <w:p>
-      <w:pPr>
-        <w:pStyle w:val="Heading1"/>
-        <w:spacing w:before="160" w:after="80"/>
-      </w:pPr>
-      <w:r>
-        <w:t>19. Conclusion</w:t>
+        <w:t>10. Conclusion</w:t>
       </w:r>
     </w:p>
     <w:p>
@@ -6029,49 +2171,7 @@
           <w:rFonts w:ascii="Times New Roman" w:hAnsi="Times New Roman"/>
           <w:sz w:val="22"/>
         </w:rPr>
-        <w:t>Its central argument is simple:</w:t>
-      </w:r>
-    </w:p>
-    <w:p>
-      <w:pPr>
-        <w:pStyle w:val="ListBullet"/>
-        <w:spacing w:after="40" w:line="264" w:lineRule="auto"/>
-        <w:jc w:val="both"/>
-      </w:pPr>
-      <w:r>
-        <w:rPr>
-          <w:rFonts w:ascii="Times New Roman" w:hAnsi="Times New Roman"/>
-          <w:sz w:val="21"/>
-        </w:rPr>
-        <w:t>if an LLM feature depends on output structure,</w:t>
-      </w:r>
-    </w:p>
-    <w:p>
-      <w:pPr>
-        <w:pStyle w:val="ListBullet"/>
-        <w:spacing w:after="40" w:line="264" w:lineRule="auto"/>
-        <w:jc w:val="both"/>
-      </w:pPr>
-      <w:r>
-        <w:rPr>
-          <w:rFonts w:ascii="Times New Roman" w:hAnsi="Times New Roman"/>
-          <w:sz w:val="21"/>
-        </w:rPr>
-        <w:t>deterministic validation should be the first evaluation layer,</w:t>
-      </w:r>
-    </w:p>
-    <w:p>
-      <w:pPr>
-        <w:pStyle w:val="ListBullet"/>
-        <w:spacing w:after="40" w:line="264" w:lineRule="auto"/>
-        <w:jc w:val="both"/>
-      </w:pPr>
-      <w:r>
-        <w:rPr>
-          <w:rFonts w:ascii="Times New Roman" w:hAnsi="Times New Roman"/>
-          <w:sz w:val="21"/>
-        </w:rPr>
-        <w:t>and CI should be able to fail when that contract breaks.</w:t>
+        <w:t>Its central argument is simple. If an LLM feature depends on output structure, deterministic validation should be the first evaluation layer, and CI should be able to fail when that contract breaks.</w:t>
       </w:r>
     </w:p>
     <w:p>
@@ -6085,21 +2185,7 @@
           <w:rFonts w:ascii="Times New Roman" w:hAnsi="Times New Roman"/>
           <w:sz w:val="22"/>
         </w:rPr>
-        <w:t>That is the contribution of this initial implementation.</w:t>
-      </w:r>
-    </w:p>
-    <w:p>
-      <w:pPr>
-        <w:spacing w:after="120" w:line="276" w:lineRule="auto"/>
-        <w:ind w:firstLine="360"/>
-        <w:jc w:val="both"/>
-      </w:pPr>
-      <w:r>
-        <w:rPr>
-          <w:rFonts w:ascii="Times New Roman" w:hAnsi="Times New Roman"/>
-          <w:sz w:val="22"/>
-        </w:rPr>
-        <w:t>It is not a grand unified evaluation platform. It is a compact, production-minded harness for one of the most common and immediately useful evaluation patterns: deterministic gating of contract-bound LLM outputs.</w:t>
+        <w:t>That is the contribution of this initial implementation. It is not a grand unified evaluation platform. It is a compact, production-minded harness for one of the most common and immediately useful evaluation patterns: deterministic gating of contract-bound LLM outputs.</w:t>
       </w:r>
     </w:p>
     <w:p>
@@ -6122,7 +2208,7 @@
           <w:rFonts w:ascii="Times New Roman" w:hAnsi="Times New Roman"/>
           <w:sz w:val="22"/>
         </w:rPr>
-        <w:t>The practical implication is that teams do not have to choose between “prompt engineering in the dark” and “building a giant evaluation platform.” There is a useful middle ground.</w:t>
+        <w:t>The practical implication is that teams do not have to choose between prompt engineering in the dark and building a giant evaluation platform. There is a useful middle ground.</w:t>
       </w:r>
     </w:p>
     <w:p>
@@ -6136,77 +2222,7 @@
           <w:rFonts w:ascii="Times New Roman" w:hAnsi="Times New Roman"/>
           <w:sz w:val="22"/>
         </w:rPr>
-        <w:t>kestrel-evals shows that for contract-bound LLM features, a small amount of structure goes a long way:</w:t>
-      </w:r>
-    </w:p>
-    <w:p>
-      <w:pPr>
-        <w:pStyle w:val="ListBullet"/>
-        <w:spacing w:after="40" w:line="264" w:lineRule="auto"/>
-        <w:jc w:val="both"/>
-      </w:pPr>
-      <w:r>
-        <w:rPr>
-          <w:rFonts w:ascii="Times New Roman" w:hAnsi="Times New Roman"/>
-          <w:sz w:val="21"/>
-        </w:rPr>
-        <w:t>define the contract</w:t>
-      </w:r>
-    </w:p>
-    <w:p>
-      <w:pPr>
-        <w:pStyle w:val="ListBullet"/>
-        <w:spacing w:after="40" w:line="264" w:lineRule="auto"/>
-        <w:jc w:val="both"/>
-      </w:pPr>
-      <w:r>
-        <w:rPr>
-          <w:rFonts w:ascii="Times New Roman" w:hAnsi="Times New Roman"/>
-          <w:sz w:val="21"/>
-        </w:rPr>
-        <w:t>codify the checks</w:t>
-      </w:r>
-    </w:p>
-    <w:p>
-      <w:pPr>
-        <w:pStyle w:val="ListBullet"/>
-        <w:spacing w:after="40" w:line="264" w:lineRule="auto"/>
-        <w:jc w:val="both"/>
-      </w:pPr>
-      <w:r>
-        <w:rPr>
-          <w:rFonts w:ascii="Times New Roman" w:hAnsi="Times New Roman"/>
-          <w:sz w:val="21"/>
-        </w:rPr>
-        <w:t>run them locally</w:t>
-      </w:r>
-    </w:p>
-    <w:p>
-      <w:pPr>
-        <w:pStyle w:val="ListBullet"/>
-        <w:spacing w:after="40" w:line="264" w:lineRule="auto"/>
-        <w:jc w:val="both"/>
-      </w:pPr>
-      <w:r>
-        <w:rPr>
-          <w:rFonts w:ascii="Times New Roman" w:hAnsi="Times New Roman"/>
-          <w:sz w:val="21"/>
-        </w:rPr>
-        <w:t>gate CI on regressions</w:t>
-      </w:r>
-    </w:p>
-    <w:p>
-      <w:pPr>
-        <w:spacing w:after="120" w:line="276" w:lineRule="auto"/>
-        <w:ind w:firstLine="360"/>
-        <w:jc w:val="both"/>
-      </w:pPr>
-      <w:r>
-        <w:rPr>
-          <w:rFonts w:ascii="Times New Roman" w:hAnsi="Times New Roman"/>
-          <w:sz w:val="22"/>
-        </w:rPr>
-        <w:t>That does not make LLM behavior magically stable or universally reliable. What it does do is move one important class of prompt-dependent behavior closer to an ordinary software component: observable, testable, and easier to trust in production workflows.</w:t>
+        <w:t>kestrel-evals shows that for contract-bound LLM features, a modest amount of structure goes a long way. Define the contract, codify the checks, run them locally, and gate CI on regressions. That does not make LLM behavior magically stable or universally reliable. What it does do is move one important class of prompt-dependent behavior closer to an ordinary software component: observable, testable, and easier to trust in production workflows.</w:t>
       </w:r>
     </w:p>
     <w:sectPr>

</xml_diff>

<commit_message>
Retitle paper and refine whitepaper title page
</commit_message>
<xml_diff>
--- a/WRITEUP_polished.docx
+++ b/WRITEUP_polished.docx
@@ -4,7 +4,47 @@
   <w:body>
     <w:p>
       <w:pPr>
-        <w:spacing w:before="1440" w:after="280"/>
+        <w:spacing w:before="840"/>
+        <w:jc w:val="center"/>
+      </w:pPr>
+      <w:r>
+        <w:drawing>
+          <wp:inline xmlns:a="http://schemas.openxmlformats.org/drawingml/2006/main" xmlns:pic="http://schemas.openxmlformats.org/drawingml/2006/picture">
+            <wp:extent cx="731520" cy="731520"/>
+            <wp:docPr id="1" name="Picture 1"/>
+            <wp:cNvGraphicFramePr>
+              <a:graphicFrameLocks noChangeAspect="1"/>
+            </wp:cNvGraphicFramePr>
+            <a:graphic>
+              <a:graphicData uri="http://schemas.openxmlformats.org/drawingml/2006/picture">
+                <pic:pic>
+                  <pic:nvPicPr>
+                    <pic:cNvPr id="0" name="icon-512.png"/>
+                    <pic:cNvPicPr/>
+                  </pic:nvPicPr>
+                  <pic:blipFill>
+                    <a:blip r:embed="rId11"/>
+                    <a:stretch>
+                      <a:fillRect/>
+                    </a:stretch>
+                  </pic:blipFill>
+                  <pic:spPr>
+                    <a:xfrm>
+                      <a:off x="0" y="0"/>
+                      <a:ext cx="731520" cy="731520"/>
+                    </a:xfrm>
+                    <a:prstGeom prst="rect"/>
+                  </pic:spPr>
+                </pic:pic>
+              </a:graphicData>
+            </a:graphic>
+          </wp:inline>
+        </w:drawing>
+      </w:r>
+    </w:p>
+    <w:p>
+      <w:pPr>
+        <w:spacing w:before="360" w:after="200"/>
         <w:jc w:val="center"/>
       </w:pPr>
       <w:r>
@@ -13,7 +53,36 @@
           <w:b/>
           <w:sz w:val="36"/>
         </w:rPr>
-        <w:t>kestrel-evals — Deterministic LLM Gating (Initial Implementation)</w:t>
+        <w:t>Deterministic Gating for Contract-Bound LLM Outputs</w:t>
+      </w:r>
+    </w:p>
+    <w:p>
+      <w:pPr>
+        <w:spacing w:after="120"/>
+        <w:jc w:val="center"/>
+      </w:pPr>
+      <w:r>
+        <w:rPr>
+          <w:rFonts w:ascii="Times New Roman" w:hAnsi="Times New Roman" w:eastAsia="Times New Roman" w:cs="Times New Roman"/>
+          <w:i/>
+          <w:color w:val="606060"/>
+          <w:sz w:val="22"/>
+        </w:rPr>
+        <w:t>The kestrel-evals Initial Implementation</w:t>
+      </w:r>
+    </w:p>
+    <w:p>
+      <w:pPr>
+        <w:spacing w:before="600"/>
+        <w:jc w:val="center"/>
+      </w:pPr>
+      <w:r>
+        <w:rPr>
+          <w:rFonts w:ascii="Times New Roman" w:hAnsi="Times New Roman" w:eastAsia="Times New Roman" w:cs="Times New Roman"/>
+          <w:b/>
+          <w:sz w:val="22"/>
+        </w:rPr>
+        <w:t>Daymian Tomczyk</w:t>
       </w:r>
     </w:p>
     <w:p>
@@ -23,25 +92,10 @@
       <w:r>
         <w:rPr>
           <w:rFonts w:ascii="Times New Roman" w:hAnsi="Times New Roman" w:eastAsia="Times New Roman" w:cs="Times New Roman"/>
-          <w:i/>
-          <w:color w:val="606060"/>
-          <w:sz w:val="22"/>
+          <w:color w:val="404040"/>
+          <w:sz w:val="20"/>
         </w:rPr>
-        <w:t>Initial implementation / working paper draft</w:t>
-      </w:r>
-    </w:p>
-    <w:p>
-      <w:pPr>
-        <w:spacing w:before="560"/>
-        <w:jc w:val="center"/>
-      </w:pPr>
-      <w:r>
-        <w:rPr>
-          <w:rFonts w:ascii="Times New Roman" w:hAnsi="Times New Roman" w:eastAsia="Times New Roman" w:cs="Times New Roman"/>
-          <w:b/>
-          <w:sz w:val="22"/>
-        </w:rPr>
-        <w:t>Daymian Tomczyk</w:t>
+        <w:t>Founder &amp; Principal Engineer</w:t>
       </w:r>
     </w:p>
     <w:p>
@@ -541,7 +595,7 @@
         <w:drawing>
           <wp:inline xmlns:a="http://schemas.openxmlformats.org/drawingml/2006/main" xmlns:pic="http://schemas.openxmlformats.org/drawingml/2006/picture">
             <wp:extent cx="5852160" cy="2418893"/>
-            <wp:docPr id="1" name="Picture 1"/>
+            <wp:docPr id="2" name="Picture 2"/>
             <wp:cNvGraphicFramePr>
               <a:graphicFrameLocks noChangeAspect="1"/>
             </wp:cNvGraphicFramePr>
@@ -553,7 +607,7 @@
                     <pic:cNvPicPr/>
                   </pic:nvPicPr>
                   <pic:blipFill>
-                    <a:blip r:embed="rId11"/>
+                    <a:blip r:embed="rId12"/>
                     <a:stretch>
                       <a:fillRect/>
                     </a:stretch>

</xml_diff>

<commit_message>
Tune paper tone toward a plainer voice
</commit_message>
<xml_diff>
--- a/WRITEUP_polished.docx
+++ b/WRITEUP_polished.docx
@@ -162,7 +162,7 @@
                 <w:rFonts w:ascii="Times New Roman" w:hAnsi="Times New Roman" w:eastAsia="Times New Roman" w:cs="Times New Roman"/>
                 <w:sz w:val="22"/>
               </w:rPr>
-              <w:t>If an LLM feature depends on a structured output contract, that contract should be testable in the same operational way as ordinary software: with deterministic checks, repeatable suites, and CI failure when the output breaks. That is the purpose of kestrel-evals. The project is intentionally narrow. It is not trying to solve the entire LLM evaluation problem. It is trying to solve one common and operationally important part of it well: making contract-bound LLM behaviors observable, repeatable, and gateable.</w:t>
+              <w:t>If an LLM feature depends on a structured output contract, that contract should be testable like normal software: with deterministic checks, repeatable suites, and CI failure when the output breaks. That is what kestrel-evals is for. The project is intentionally narrow. It is not trying to solve all of LLM evaluation. It is trying to solve one part of it well: making outputs with hard constraints observable, repeatable, and gateable.</w:t>
             </w:r>
           </w:p>
         </w:tc>
@@ -190,7 +190,7 @@
           <w:rFonts w:ascii="Times New Roman" w:hAnsi="Times New Roman" w:eastAsia="Times New Roman" w:cs="Times New Roman"/>
           <w:sz w:val="22"/>
         </w:rPr>
-        <w:t>kestrel-evals is a small evaluation harness for LLM-powered systems where correctness is partly or largely mechanical. Rather than beginning with rubric scoring, model-vs-model judging, or broad subjective grading, it starts from a simpler premise: if an LLM feature is expected to produce machine-consumable output, then the first layer of evaluation should verify that the output actually obeys its contract.</w:t>
+        <w:t>kestrel-evals is a small evaluation harness for LLM-powered systems where correctness is partly mechanical. Instead of starting with rubric scoring, model-vs-model judging, or broad subjective grading, it starts from a simpler premise: if an LLM feature is expected to produce machine-consumable output, the first evaluation layer should verify that the output actually obeys its contract.</w:t>
       </w:r>
     </w:p>
     <w:p>
@@ -204,7 +204,7 @@
           <w:rFonts w:ascii="Times New Roman" w:hAnsi="Times New Roman" w:eastAsia="Times New Roman" w:cs="Times New Roman"/>
           <w:sz w:val="22"/>
         </w:rPr>
-        <w:t>In practice, that means checking whether the output is valid JSON, whether required keys exist, whether values remain inside a controlled vocabulary, and whether formatting guarantees are preserved. The harness takes YAML-defined suites, executes prompts against a provider, applies deterministic checks, emits a JSON report, and exits non-zero on failure so the result can gate CI.</w:t>
+        <w:t>In practice, that means checking whether the output is valid JSON, whether required keys exist, whether values stay inside a controlled vocabulary, and whether formatting guarantees are preserved. The harness takes YAML-defined suites, executes prompts against a provider, applies deterministic checks, emits a JSON report, and exits non-zero on failure so the result can gate CI.</w:t>
       </w:r>
     </w:p>
     <w:p>
@@ -218,7 +218,7 @@
           <w:rFonts w:ascii="Times New Roman" w:hAnsi="Times New Roman" w:eastAsia="Times New Roman" w:cs="Times New Roman"/>
           <w:sz w:val="22"/>
         </w:rPr>
-        <w:t>The current implementation is intentionally small. It is not presented as a universal benchmark platform or a general theory of LLM quality. It is a working implementation of a narrower claim: for contract-bound LLM outputs, deterministic gating is often the most useful place to start.</w:t>
+        <w:t>The current implementation is intentionally small. It is not meant as a universal benchmark platform or a general theory of LLM quality. It is a working implementation of a narrower claim: for contract-bound LLM outputs, deterministic gating is often the most useful place to start.</w:t>
       </w:r>
     </w:p>
     <w:p/>
@@ -242,7 +242,7 @@
           <w:rFonts w:ascii="Times New Roman" w:hAnsi="Times New Roman" w:eastAsia="Times New Roman" w:cs="Times New Roman"/>
           <w:sz w:val="22"/>
         </w:rPr>
-        <w:t>A large share of practical LLM failures do not first appear as subtle questions of quality. They appear as broken software behavior. A downstream system may expect valid JSON, a fixed set of top-level keys, empty strings rather than null, or a list field that contains only approved labels. When those assumptions are violated, the integration fails long before anyone has a chance to debate whether the response was insightful or well written.</w:t>
+        <w:t>A lot of practical LLM failures do not first show up as subtle quality problems. They show up as broken software behavior.</w:t>
       </w:r>
     </w:p>
     <w:p>
@@ -256,7 +256,7 @@
           <w:rFonts w:ascii="Times New Roman" w:hAnsi="Times New Roman" w:eastAsia="Times New Roman" w:cs="Times New Roman"/>
           <w:sz w:val="22"/>
         </w:rPr>
-        <w:t>That observation is the starting point for kestrel-evals. The project is built around a simple operational claim: if an LLM output is part of a production workflow, then the output contract should be testable. And if it is testable, it should be possible to run those tests locally, in CI, and in a form that fails fast when the contract breaks.</w:t>
+        <w:t>A downstream system may expect valid JSON, a fixed set of top-level keys, empty strings instead of null, or a list field that contains only approved labels. When those assumptions are violated, the integration fails before anyone gets to argue about whether the response was insightful or well written.</w:t>
       </w:r>
     </w:p>
     <w:p>
@@ -270,7 +270,7 @@
           <w:rFonts w:ascii="Times New Roman" w:hAnsi="Times New Roman" w:eastAsia="Times New Roman" w:cs="Times New Roman"/>
           <w:sz w:val="22"/>
         </w:rPr>
-        <w:t>This framing matters because the industry conversation around LLM evaluation often broadens too quickly. It is common to jump to questions such as whether an answer is helpful, whether one model outperforms another, or whether a judge model would rate the output highly. Those are legitimate evaluation problems, but they are not always the first problems that matter. In many real systems, the first question is much less glamorous: did the model produce something the pipeline can safely consume?</w:t>
+        <w:t>That is the gap kestrel-evals is meant to address.</w:t>
       </w:r>
     </w:p>
     <w:p>
@@ -284,7 +284,35 @@
           <w:rFonts w:ascii="Times New Roman" w:hAnsi="Times New Roman" w:eastAsia="Times New Roman" w:cs="Times New Roman"/>
           <w:sz w:val="22"/>
         </w:rPr>
-        <w:t>That is where this project is strongest. Its value proposition is not “better AI vibes.” Its value proposition is more practical: fewer silent regressions in contract-bound LLM features, faster iteration on prompts and schemas, CI-visible failures instead of downstream breakage, and a lightweight path from prompt experimentation to something that can be treated more like ordinary software.</w:t>
+        <w:t>The core idea is straightforward: if an LLM output is part of a production workflow, then the output contract should be testable. And if it is testable, it should be possible to run those tests locally, in CI, and in a way that fails fast when the contract breaks.</w:t>
+      </w:r>
+    </w:p>
+    <w:p>
+      <w:pPr>
+        <w:spacing w:after="120" w:line="276" w:lineRule="auto"/>
+        <w:ind w:firstLine="360"/>
+        <w:jc w:val="both"/>
+      </w:pPr>
+      <w:r>
+        <w:rPr>
+          <w:rFonts w:ascii="Times New Roman" w:hAnsi="Times New Roman" w:eastAsia="Times New Roman" w:cs="Times New Roman"/>
+          <w:sz w:val="22"/>
+        </w:rPr>
+        <w:t>This framing matters because conversations about LLM evaluation often get broad too early. It is common to jump to questions like whether an answer is helpful, whether one model outperforms another, or whether a judge model would rate the output highly. Those are real evaluation problems, but they are not always the first ones that matter. In many systems, the first question is much simpler: did the model produce something the pipeline can safely consume?</w:t>
+      </w:r>
+    </w:p>
+    <w:p>
+      <w:pPr>
+        <w:spacing w:after="120" w:line="276" w:lineRule="auto"/>
+        <w:ind w:firstLine="360"/>
+        <w:jc w:val="both"/>
+      </w:pPr>
+      <w:r>
+        <w:rPr>
+          <w:rFonts w:ascii="Times New Roman" w:hAnsi="Times New Roman" w:eastAsia="Times New Roman" w:cs="Times New Roman"/>
+          <w:sz w:val="22"/>
+        </w:rPr>
+        <w:t>That is where this project is strongest. The value proposition is not “better AI vibes.” It is more practical than that: fewer silent regressions in contract-bound LLM features, faster iteration on prompts and schemas, CI-visible failures instead of downstream breakage, and a lighter path from prompt experimentation to something that can be treated more like ordinary software.</w:t>
       </w:r>
     </w:p>
     <w:p/>
@@ -308,7 +336,7 @@
           <w:rFonts w:ascii="Times New Roman" w:hAnsi="Times New Roman" w:eastAsia="Times New Roman" w:cs="Times New Roman"/>
           <w:sz w:val="22"/>
         </w:rPr>
-        <w:t>For a broad class of workflows, deterministic checks deserve to be the first evaluation layer because the earliest and most expensive failures are mechanical. A model that returns markdown-wrapped JSON when the system expects raw JSON has failed, even if the payload inside is otherwise sensible. A classifier that emits a near-synonym instead of a valid controlled label has failed, even if a human would understand what it meant. A field that should be an array but arrives as a string has failed, regardless of whether the prose around it sounds competent.</w:t>
+        <w:t>For a broad class of workflows, deterministic checks should be the first evaluation layer because the earliest and most expensive failures are mechanical.</w:t>
       </w:r>
     </w:p>
     <w:p>
@@ -322,7 +350,7 @@
           <w:rFonts w:ascii="Times New Roman" w:hAnsi="Times New Roman" w:eastAsia="Times New Roman" w:cs="Times New Roman"/>
           <w:sz w:val="22"/>
         </w:rPr>
-        <w:t>These are not cosmetic issues. They are contract violations. If the LLM sits inside a pipeline for parsing, routing, storage, or automation, they are often the difference between a working system and a broken one.</w:t>
+        <w:t>A model that returns markdown-wrapped JSON when the system expects raw JSON has failed, even if the payload inside is otherwise sensible. A classifier that emits a near-synonym instead of a valid controlled label has failed, even if a human would understand what it meant. A field that should be an array but arrives as a string has failed, regardless of whether the prose around it sounds competent.</w:t>
       </w:r>
     </w:p>
     <w:p>
@@ -336,7 +364,7 @@
           <w:rFonts w:ascii="Times New Roman" w:hAnsi="Times New Roman" w:eastAsia="Times New Roman" w:cs="Times New Roman"/>
           <w:sz w:val="22"/>
         </w:rPr>
-        <w:t>Deterministic checks are well suited to these problems because they are both cheap and legible. A failed regex, missing key, or disallowed value is easy to understand. That clarity matters. Teams are far more likely to trust an evaluation harness when the failure mode is concrete and inspectable rather than buried inside an opaque scoring system. It also makes CI integration natural: if the question is whether the contract held, then the harness can behave like any other test runner and return a failing exit code when the answer is no.</w:t>
+        <w:t>Those are not cosmetic issues. They are contract violations. If the LLM sits inside a pipeline for parsing, routing, storage, or automation, they are often the difference between a working system and a broken one.</w:t>
       </w:r>
     </w:p>
     <w:p>
@@ -350,7 +378,21 @@
           <w:rFonts w:ascii="Times New Roman" w:hAnsi="Times New Roman" w:eastAsia="Times New Roman" w:cs="Times New Roman"/>
           <w:sz w:val="22"/>
         </w:rPr>
-        <w:t>This does not make subjective evaluation unimportant. Rubric scoring, pairwise comparison, and model-as-judge approaches all have their place. The point is one of sequencing. It is usually a mistake to ask whether an answer is “good” before confirming that it is structurally valid. Deterministic gating is therefore not a replacement for all other evaluation methods. It is the right first layer for systems whose outputs must obey explicit mechanical constraints.</w:t>
+        <w:t>Deterministic checks are a good fit here because they are both cheap and legible. A failed regex, missing key, or disallowed value is easy to understand. That matters. Teams are more likely to trust an evaluation harness when the failure mode is concrete and inspectable rather than buried inside an opaque scoring system. It also makes CI integration natural: if the question is whether the contract held, then the harness can behave like any other test runner and return a failing exit code when the answer is no.</w:t>
+      </w:r>
+    </w:p>
+    <w:p>
+      <w:pPr>
+        <w:spacing w:after="120" w:line="276" w:lineRule="auto"/>
+        <w:ind w:firstLine="360"/>
+        <w:jc w:val="both"/>
+      </w:pPr>
+      <w:r>
+        <w:rPr>
+          <w:rFonts w:ascii="Times New Roman" w:hAnsi="Times New Roman" w:eastAsia="Times New Roman" w:cs="Times New Roman"/>
+          <w:sz w:val="22"/>
+        </w:rPr>
+        <w:t>This does not make subjective evaluation unimportant. Rubric scoring, pairwise comparison, and model-as-judge approaches still have their place. The point is order. It is usually a mistake to ask whether an answer is “good” before confirming that it is structurally valid. Deterministic gating is not a replacement for every other evaluation method. It is the right first layer for systems whose outputs must obey explicit mechanical constraints.</w:t>
       </w:r>
     </w:p>
     <w:p/>
@@ -374,7 +416,7 @@
           <w:rFonts w:ascii="Times New Roman" w:hAnsi="Times New Roman" w:eastAsia="Times New Roman" w:cs="Times New Roman"/>
           <w:sz w:val="22"/>
         </w:rPr>
-        <w:t>The design goal of kestrel-evals is deliberately constrained: define suites in a small, reviewable format; run them locally and in CI; check output contracts with deterministic logic; and fail quickly when those contracts are violated. The project is not trying to solve all evaluation problems at once. It is trying to make one common and useful pattern reliable enough to support development and deployment workflows.</w:t>
+        <w:t>The design goal of kestrel-evals is deliberately constrained: define suites in a small, reviewable format; run them locally and in CI; check output contracts with deterministic logic; and fail quickly when those contracts are violated.</w:t>
       </w:r>
     </w:p>
     <w:p>
@@ -388,7 +430,21 @@
           <w:rFonts w:ascii="Times New Roman" w:hAnsi="Times New Roman" w:eastAsia="Times New Roman" w:cs="Times New Roman"/>
           <w:sz w:val="22"/>
         </w:rPr>
-        <w:t>That focus is reflected in the current scope. The implementation supports YAML-defined suites, local execution, CI execution, deterministic checks, provider-backed generation through an OpenAI implementation, JSON report output, and non-zero exit behavior on failure. It does not yet attempt to provide a full benchmarking platform, a dataset registry, a judge-model workflow, comprehensive JSON Schema support, or broad provider parity. Those limitations are intentional. The project is small on purpose.</w:t>
+        <w:t>The project is not trying to solve all evaluation problems at once. The point is narrower than that. It is trying to make one common and useful pattern reliable enough to support development and deployment workflows.</w:t>
+      </w:r>
+    </w:p>
+    <w:p>
+      <w:pPr>
+        <w:spacing w:after="120" w:line="276" w:lineRule="auto"/>
+        <w:ind w:firstLine="360"/>
+        <w:jc w:val="both"/>
+      </w:pPr>
+      <w:r>
+        <w:rPr>
+          <w:rFonts w:ascii="Times New Roman" w:hAnsi="Times New Roman" w:eastAsia="Times New Roman" w:cs="Times New Roman"/>
+          <w:sz w:val="22"/>
+        </w:rPr>
+        <w:t>That focus shows up in the current scope. The implementation supports YAML-defined suites, local execution, CI execution, deterministic checks, provider-backed generation through an OpenAI implementation, JSON report output, and non-zero exit behavior on failure. It does not yet attempt to provide a full benchmarking platform, a dataset registry, a judge-model workflow, comprehensive JSON Schema support, or broad provider parity. Those limitations are intentional. The project is small on purpose.</w:t>
       </w:r>
     </w:p>
     <w:p/>
@@ -454,7 +510,7 @@
           <w:rFonts w:ascii="Times New Roman" w:hAnsi="Times New Roman" w:eastAsia="Times New Roman" w:cs="Times New Roman"/>
           <w:sz w:val="22"/>
         </w:rPr>
-        <w:t>The checks themselves are deliberately limited. The current implementation supports a small subset of JSON Schema validation, an allowed_values check for controlled vocabularies, and a regex check against raw output text. These are enough to validate a surprisingly wide range of contract-bound behaviors without pulling in heavier dependencies or turning the project into a large framework too early.</w:t>
+        <w:t>The checks themselves are deliberately limited. The current implementation supports a small subset of JSON Schema validation, an allowed_values check for controlled vocabularies, and a regex check against raw output text. That is enough to validate a surprisingly wide range of contract-bound behaviors without pulling in heavier dependencies or turning the project into a large framework too early.</w:t>
       </w:r>
     </w:p>
     <w:p>
@@ -661,7 +717,7 @@
           <w:rFonts w:ascii="Times New Roman" w:hAnsi="Times New Roman" w:eastAsia="Times New Roman" w:cs="Times New Roman"/>
           <w:sz w:val="22"/>
         </w:rPr>
-        <w:t>The included example suite, examples/structured_extraction.yaml, models a common operational problem: extracting a consistent structured payload from messy inbound lead emails. This is a good representative case because it combines several typical LLM failure modes in a compact form. The inputs are semi-structured, some information is missing, wording varies, service names can drift into synonyms, and the downstream system expects a strict JSON payload rather than prose.</w:t>
+        <w:t>The included example suite, examples/structured_extraction.yaml, models a common operational problem: extracting a consistent structured payload from messy inbound lead emails.</w:t>
       </w:r>
     </w:p>
     <w:p>
@@ -675,7 +731,7 @@
           <w:rFonts w:ascii="Times New Roman" w:hAnsi="Times New Roman" w:eastAsia="Times New Roman" w:cs="Times New Roman"/>
           <w:sz w:val="22"/>
         </w:rPr>
-        <w:t>The contract enforced by the suite is intentionally strict. The output must be raw JSON only, must contain all required top-level fields, must use empty strings for unknown values, must emit services as an array, and must restrict that array to an approved vocabulary. In other words, the suite is not testing whether the model “roughly understood the email.” It is testing whether the model produced something the pipeline could safely trust.</w:t>
+        <w:t>It is a good representative case because it combines several familiar LLM failure modes in a compact form. The inputs are semi-structured, some information is missing, wording varies, service names can drift into synonyms, and the downstream system expects a strict JSON payload rather than prose.</w:t>
       </w:r>
     </w:p>
     <w:p>
@@ -689,7 +745,21 @@
           <w:rFonts w:ascii="Times New Roman" w:hAnsi="Times New Roman" w:eastAsia="Times New Roman" w:cs="Times New Roman"/>
           <w:sz w:val="22"/>
         </w:rPr>
-        <w:t>The current example suite includes ten cases. Together they cover clear extraction, sparse signature-block style emails, multi-service requests, budget/timeline extraction, AI/R&amp;D language, devops terminology, security-related mapping, advisory work, and very short low-context inputs.</w:t>
+        <w:t>The contract enforced by the suite is intentionally strict. The output must be raw JSON only, must contain all required top-level fields, must use empty strings for unknown values, must emit services as an array, and must restrict that array to an approved vocabulary. In other words, the suite is not testing whether the model “basically got the email.” It is testing whether the model produced something the pipeline could safely trust.</w:t>
+      </w:r>
+    </w:p>
+    <w:p>
+      <w:pPr>
+        <w:spacing w:after="120" w:line="276" w:lineRule="auto"/>
+        <w:ind w:firstLine="360"/>
+        <w:jc w:val="both"/>
+      </w:pPr>
+      <w:r>
+        <w:rPr>
+          <w:rFonts w:ascii="Times New Roman" w:hAnsi="Times New Roman" w:eastAsia="Times New Roman" w:cs="Times New Roman"/>
+          <w:sz w:val="22"/>
+        </w:rPr>
+        <w:t>The current example suite includes ten cases. Together they cover clear extraction, sparse signature-block style emails, multi-service requests, budget and timeline extraction, AI/R&amp;D language, devops terminology, security-related mapping, advisory work, and very short low-context inputs.</w:t>
       </w:r>
     </w:p>
     <w:p>
@@ -1673,7 +1743,21 @@
           <w:rFonts w:ascii="Times New Roman" w:hAnsi="Times New Roman" w:eastAsia="Times New Roman" w:cs="Times New Roman"/>
           <w:sz w:val="22"/>
         </w:rPr>
-        <w:t>One practical lesson from this case study is that strong models still need clear contract reinforcement when the output format is strict. Reliability improved not through exotic techniques, but through careful prompt and suite design: restating the exact JSON shape, insisting on no markdown or code fences, clarifying that unknowns should be empty strings rather than null, and adding explicit mapping guidance for controlled-vocabulary fields. That is exactly why deterministic gating is useful. It does not assume the model will “probably do the right thing.” It makes the contract visible and then tests whether the model actually honored it.</w:t>
+        <w:t>One practical lesson from this case study is that strong models still need clear contract reinforcement when the output format is strict. Reliability improved not through exotic techniques, but through careful prompt and suite design: restating the exact JSON shape, insisting on no markdown or code fences, clarifying that unknowns should be empty strings rather than null, and adding explicit mapping guidance for controlled-vocabulary fields.</w:t>
+      </w:r>
+    </w:p>
+    <w:p>
+      <w:pPr>
+        <w:spacing w:after="120" w:line="276" w:lineRule="auto"/>
+        <w:ind w:firstLine="360"/>
+        <w:jc w:val="both"/>
+      </w:pPr>
+      <w:r>
+        <w:rPr>
+          <w:rFonts w:ascii="Times New Roman" w:hAnsi="Times New Roman" w:eastAsia="Times New Roman" w:cs="Times New Roman"/>
+          <w:sz w:val="22"/>
+        </w:rPr>
+        <w:t>That is exactly why deterministic gating is useful. It does not assume the model will “probably do the right thing.” It makes the contract visible and then tests whether the model actually honored it.</w:t>
       </w:r>
     </w:p>
     <w:p/>
@@ -1697,7 +1781,21 @@
           <w:rFonts w:ascii="Times New Roman" w:hAnsi="Times New Roman" w:eastAsia="Times New Roman" w:cs="Times New Roman"/>
           <w:sz w:val="22"/>
         </w:rPr>
-        <w:t>A checked-in baseline report is included at baselines/structured_extraction-2026-03-19_gpt-4.1-mini.json. That baseline matters because it does two things at once. First, it shows that the suite is not hypothetical: it was executed against a real model and produced a passing result. Second, it creates a stable reference point for future comparison. Prompt changes, suite changes, provider changes, and model changes can all be evaluated against the same baseline.</w:t>
+        <w:t>A checked-in baseline report is included at baselines/structured_extraction-2026-03-19_gpt-4.1-mini.json.</w:t>
+      </w:r>
+    </w:p>
+    <w:p>
+      <w:pPr>
+        <w:spacing w:after="120" w:line="276" w:lineRule="auto"/>
+        <w:ind w:firstLine="360"/>
+        <w:jc w:val="both"/>
+      </w:pPr>
+      <w:r>
+        <w:rPr>
+          <w:rFonts w:ascii="Times New Roman" w:hAnsi="Times New Roman" w:eastAsia="Times New Roman" w:cs="Times New Roman"/>
+          <w:sz w:val="22"/>
+        </w:rPr>
+        <w:t>That baseline matters because it does two things at once. First, it shows that the suite is not hypothetical: it was executed against a real model and produced a passing result. Second, it creates a stable reference point for future comparison. Prompt changes, suite changes, provider changes, and model changes can all be evaluated against the same baseline.</w:t>
       </w:r>
     </w:p>
     <w:p>
@@ -2077,7 +2175,7 @@
           <w:rFonts w:ascii="Times New Roman" w:hAnsi="Times New Roman" w:eastAsia="Times New Roman" w:cs="Times New Roman"/>
           <w:sz w:val="22"/>
         </w:rPr>
-        <w:t>This baseline should be read narrowly. It is one successful reference run for one suite on one model, not evidence of broad model-agnostic reliability. What it establishes is that the harness pattern works, that the suite is executable, and that a contract-bound workflow can be gated deterministically in practice.</w:t>
+        <w:t>This baseline should be read narrowly. It is one successful reference run for one suite on one model, not evidence of broad model-agnostic reliability. What it does establish is that the harness pattern works, that the suite is executable, and that a contract-bound workflow can be gated deterministically in practice.</w:t>
       </w:r>
     </w:p>
     <w:p/>
@@ -2101,7 +2199,21 @@
           <w:rFonts w:ascii="Times New Roman" w:hAnsi="Times New Roman" w:eastAsia="Times New Roman" w:cs="Times New Roman"/>
           <w:sz w:val="22"/>
         </w:rPr>
-        <w:t>The project’s strongest qualities are also its clearest limitations. By keeping the dependency surface small, the harness remains easy to inspect and easy to extend, but the current schema support is intentionally incomplete. It is enough for common contract enforcement, not a substitute for the full jsonschema ecosystem.</w:t>
+        <w:t>The project’s strongest qualities are also its clearest limitations.</w:t>
+      </w:r>
+    </w:p>
+    <w:p>
+      <w:pPr>
+        <w:spacing w:after="120" w:line="276" w:lineRule="auto"/>
+        <w:ind w:firstLine="360"/>
+        <w:jc w:val="both"/>
+      </w:pPr>
+      <w:r>
+        <w:rPr>
+          <w:rFonts w:ascii="Times New Roman" w:hAnsi="Times New Roman" w:eastAsia="Times New Roman" w:cs="Times New Roman"/>
+          <w:sz w:val="22"/>
+        </w:rPr>
+        <w:t>By keeping the dependency surface small, the harness remains easy to inspect and easy to extend, but the current schema support is intentionally incomplete. It is enough for common contract enforcement, not a substitute for the full jsonschema ecosystem.</w:t>
       </w:r>
     </w:p>
     <w:p>
@@ -2205,7 +2317,21 @@
           <w:rFonts w:ascii="Times New Roman" w:hAnsi="Times New Roman" w:eastAsia="Times New Roman" w:cs="Times New Roman"/>
           <w:sz w:val="22"/>
         </w:rPr>
-        <w:t>The next sensible expansions are concrete rather than abstract. The provider abstraction already makes room for additional backends, so the most obvious next step is to add Anthropic, Azure OpenAI, or local OpenAI-compatible endpoints and run the same suites across them without rewriting the evaluation logic.</w:t>
+        <w:t>The next sensible expansions are concrete rather than abstract.</w:t>
+      </w:r>
+    </w:p>
+    <w:p>
+      <w:pPr>
+        <w:spacing w:after="120" w:line="276" w:lineRule="auto"/>
+        <w:ind w:firstLine="360"/>
+        <w:jc w:val="both"/>
+      </w:pPr>
+      <w:r>
+        <w:rPr>
+          <w:rFonts w:ascii="Times New Roman" w:hAnsi="Times New Roman" w:eastAsia="Times New Roman" w:cs="Times New Roman"/>
+          <w:sz w:val="22"/>
+        </w:rPr>
+        <w:t>The provider abstraction already makes room for additional backends, so the most obvious next step is to add Anthropic, Azure OpenAI, or local OpenAI-compatible endpoints and run the same suites across them without rewriting the evaluation logic.</w:t>
       </w:r>
     </w:p>
     <w:p>
@@ -2247,7 +2373,7 @@
           <w:rFonts w:ascii="Times New Roman" w:hAnsi="Times New Roman" w:eastAsia="Times New Roman" w:cs="Times New Roman"/>
           <w:sz w:val="22"/>
         </w:rPr>
-        <w:t>Finally, rubric scoring may still be worth adding later, but only after deterministic gating remains solid. That order matters. The correct sequence is first to confirm that the contract holds, and only then to ask whether the output quality is good.</w:t>
+        <w:t>Finally, rubric scoring may still be worth adding later, but only after deterministic gating remains solid. That order matters. First confirm that the contract holds. Then ask whether the output quality is good.</w:t>
       </w:r>
     </w:p>
     <w:p/>

</xml_diff>